<commit_message>
Jeffrey edits to interrogatories
</commit_message>
<xml_diff>
--- a/Filings/Discovery/FirstSetDiscovey/Interrogatories/Plaintiffs_First_Set_of_Interrogatories_to_FIE.docx
+++ b/Filings/Discovery/FirstSetDiscovey/Interrogatories/Plaintiffs_First_Set_of_Interrogatories_to_FIE.docx
@@ -854,7 +854,7 @@
         <w:t xml:space="preserve">INTERROGATORY NO. 7:  </w:t>
       </w:r>
       <w:r>
-        <w:t xml:space="preserve">State the basis for Your October 10, 2025 statement that "the file does not contain a report on the requested date" with respect to Nicholas Brau’s September 6, 2024 inspection, and identify the search performed to locate such records, the custodians and systems searched, the date of the search, and the person who performed it.</w:t>
+        <w:t xml:space="preserve">State whether Nicholas Brau created any record of any kind of his September 6, 2024 inspection of The Property — including handwritten notes, sketches or drawings, measurements, photographs, voice memos, and claim-system or portal entries made on or after that date — and for each such record state its type, the date created, its present location and custodian, and, if it no longer exists or cannot be located, when and how it ceased to exist or became unlocatable and who authorized or caused that. Then state the basis for Your October 10, 2025 statement that “the file does not contain a report on the requested date,” and identify the search performed to locate records of the inspection, the custodians and systems searched, the date of the search, and the person who performed it.</w:t>
       </w:r>
     </w:p>
     <w:p>
@@ -967,10 +967,55 @@
     </w:p>
     <w:p>
       <w:pPr>
+        <w:spacing w:after="160" w:before="0" w:line="240" w:lineRule="auto"/>
+        <w:ind w:left="720" w:hanging="720"/>
+      </w:pPr>
+      <w:r>
+        <w:rPr>
+          <w:b/>
+        </w:rPr>
+        <w:t xml:space="preserve">INTERROGATORY NO. 15:  </w:t>
+      </w:r>
+      <w:r>
+        <w:t xml:space="preserve">For each of the following submissions by Plaintiffs — (i) the January 31, 2025 response and its attachments concerning post-2020 storm activity and gutter replacement; (ii) the February 10, 2025 second response containing City of Eden Prairie permit records and the neighbor canvass; and (iii) the May 28, 2025 National Weather Service and Interactive Hail Maps material delivered through agent Peter Pietila — state whether any person acting for You reviewed the submission on its merits, and if so identify that person, the date of the review, the conclusion reached, and each claim-file note or other document recording it; and if no such review occurred, state so and the reason.</w:t>
+      </w:r>
+    </w:p>
+    <w:p>
+      <w:pPr>
+        <w:spacing w:after="160" w:before="0" w:line="240" w:lineRule="auto"/>
+        <w:ind w:left="720" w:hanging="720"/>
+      </w:pPr>
+      <w:r>
+        <w:rPr>
+          <w:b/>
+        </w:rPr>
+        <w:t xml:space="preserve">INTERROGATORY NO. 16:  </w:t>
+      </w:r>
+      <w:r>
+        <w:t xml:space="preserve">With respect to the allegation in Your Answer to paragraph 14 of the Complaint that Plaintiffs “attempted to direct the claim-handling process by adamantly advising Hancock Claims Consultants that the only thing that needed to be inspected was the windows on the inside where they were leaking,” state: each person who made and each person who received that advice, the date and manner of the communication, and each document in which it was recorded at the time; whether the scope of Hancock’s August 29, 2024 inspection was in fact limited as a result and, if so, which components of The Property were not inspected on that account; and whether You contend that this alleged advice was a basis for the statement in Your September 3, 2024 letter that “[t]here were no other damages observed.”</w:t>
+      </w:r>
+    </w:p>
+    <w:p>
+      <w:pPr>
+        <w:spacing w:after="160" w:before="0" w:line="240" w:lineRule="auto"/>
+        <w:ind w:left="720" w:hanging="720"/>
+      </w:pPr>
+      <w:r>
+        <w:rPr>
+          <w:b/>
+        </w:rPr>
+        <w:t xml:space="preserve">INTERROGATORY NO. 17:  </w:t>
+      </w:r>
+      <w:r>
+        <w:t xml:space="preserve">State the date on which You contend You first anticipated litigation concerning The Claim, identify the person who made that determination and the event or communication that prompted it, and identify each category of document created after that date that You contend is protected from discovery on that basis.</w:t>
+      </w:r>
+    </w:p>
+    <w:p>
+      <w:pPr>
         <w:spacing w:after="160" w:before="200" w:line="276"/>
       </w:pPr>
       <w:r>
-        <w:t>Pursuant to Minn. R. Civ. P. 33.01(a), Plaintiffs state that the foregoing interrogatories, counting each subdivision of separate questions as an interrogatory, number fewer than thirty (30) and do not exceed the fifty (50) interrogatories permitted without leave of court. Plaintiffs reserve the right to serve additional interrogatories by stipulation or upon leave of court.</w:t>
+        <w:t>Pursuant to Minn. R. Civ. P. 33.01(a), Plaintiffs state that the foregoing interrogatories, counting each subdivision of separate questions as an interrogatory, number fewer than thirty-five (35) and do not exceed the fifty (50) interrogatories permitted without leave of court. Plaintiffs reserve the right to serve additional interrogatories by stipulation or upon leave of court.</w:t>
       </w:r>
     </w:p>
     <w:p>

</xml_diff>

<commit_message>
Updated the certificate of service as now the service will be by email
</commit_message>
<xml_diff>
--- a/Filings/Discovery/FirstSetDiscovey/Interrogatories/Plaintiffs_First_Set_of_Interrogatories_to_FIE.docx
+++ b/Filings/Discovery/FirstSetDiscovey/Interrogatories/Plaintiffs_First_Set_of_Interrogatories_to_FIE.docx
@@ -309,7 +309,7 @@
     <w:p>
       <w:pPr>
         <w:spacing w:after="160" w:line="276"/>
-        <w:ind w:left="720" w:hanging="720"/>
+        <w:ind w:left="720" w:hanging="576"/>
       </w:pPr>
       <w:r>
         <w:rPr>
@@ -325,7 +325,7 @@
     <w:p>
       <w:pPr>
         <w:spacing w:after="160" w:line="276"/>
-        <w:ind w:left="720" w:hanging="720"/>
+        <w:ind w:left="720" w:hanging="576"/>
       </w:pPr>
       <w:r>
         <w:rPr>
@@ -341,7 +341,7 @@
     <w:p>
       <w:pPr>
         <w:spacing w:after="160" w:line="276"/>
-        <w:ind w:left="720" w:hanging="720"/>
+        <w:ind w:left="720" w:hanging="576"/>
       </w:pPr>
       <w:r>
         <w:rPr>
@@ -357,7 +357,7 @@
     <w:p>
       <w:pPr>
         <w:spacing w:after="160" w:line="276"/>
-        <w:ind w:left="720" w:hanging="720"/>
+        <w:ind w:left="720" w:hanging="576"/>
       </w:pPr>
       <w:r>
         <w:rPr>
@@ -373,7 +373,7 @@
     <w:p>
       <w:pPr>
         <w:spacing w:after="160" w:line="276"/>
-        <w:ind w:left="720" w:hanging="720"/>
+        <w:ind w:left="720" w:hanging="576"/>
       </w:pPr>
       <w:r>
         <w:rPr>
@@ -389,7 +389,7 @@
     <w:p>
       <w:pPr>
         <w:spacing w:after="160" w:line="276"/>
-        <w:ind w:left="720" w:hanging="720"/>
+        <w:ind w:left="720" w:hanging="576"/>
       </w:pPr>
       <w:r>
         <w:rPr>
@@ -405,7 +405,7 @@
     <w:p>
       <w:pPr>
         <w:spacing w:after="160" w:line="276"/>
-        <w:ind w:left="720" w:hanging="720"/>
+        <w:ind w:left="720" w:hanging="576"/>
       </w:pPr>
       <w:r>
         <w:rPr>
@@ -421,7 +421,7 @@
     <w:p>
       <w:pPr>
         <w:spacing w:after="160" w:line="276"/>
-        <w:ind w:left="720" w:hanging="720"/>
+        <w:ind w:left="720" w:hanging="576"/>
       </w:pPr>
       <w:r>
         <w:rPr>
@@ -437,7 +437,7 @@
     <w:p>
       <w:pPr>
         <w:spacing w:after="160" w:line="276"/>
-        <w:ind w:left="720" w:hanging="720"/>
+        <w:ind w:left="720" w:hanging="576"/>
       </w:pPr>
       <w:r>
         <w:rPr>
@@ -453,7 +453,7 @@
     <w:p>
       <w:pPr>
         <w:spacing w:after="160" w:line="276"/>
-        <w:ind w:left="720" w:hanging="720"/>
+        <w:ind w:left="720" w:hanging="576"/>
       </w:pPr>
       <w:r>
         <w:rPr>
@@ -469,7 +469,7 @@
     <w:p>
       <w:pPr>
         <w:spacing w:after="160" w:line="276"/>
-        <w:ind w:left="720" w:hanging="720"/>
+        <w:ind w:left="720" w:hanging="576"/>
       </w:pPr>
       <w:r>
         <w:rPr>
@@ -485,7 +485,7 @@
     <w:p>
       <w:pPr>
         <w:spacing w:after="160" w:line="276"/>
-        <w:ind w:left="720" w:hanging="720"/>
+        <w:ind w:left="720" w:hanging="576"/>
       </w:pPr>
       <w:r>
         <w:rPr>
@@ -501,7 +501,7 @@
     <w:p>
       <w:pPr>
         <w:spacing w:after="160" w:line="276"/>
-        <w:ind w:left="720" w:hanging="720"/>
+        <w:ind w:left="720" w:hanging="576"/>
       </w:pPr>
       <w:r>
         <w:rPr>
@@ -517,7 +517,7 @@
     <w:p>
       <w:pPr>
         <w:spacing w:after="160" w:line="276"/>
-        <w:ind w:left="720" w:hanging="720"/>
+        <w:ind w:left="720" w:hanging="576"/>
       </w:pPr>
       <w:r>
         <w:rPr>
@@ -547,7 +547,7 @@
     <w:p>
       <w:pPr>
         <w:spacing w:after="160" w:line="276"/>
-        <w:ind w:left="720" w:hanging="720"/>
+        <w:ind w:left="720" w:hanging="576"/>
       </w:pPr>
       <w:r>
         <w:rPr>
@@ -564,7 +564,7 @@
     <w:p>
       <w:pPr>
         <w:spacing w:after="160" w:line="276"/>
-        <w:ind w:left="720" w:hanging="720"/>
+        <w:ind w:left="720" w:hanging="576"/>
       </w:pPr>
       <w:r>
         <w:rPr>
@@ -581,7 +581,7 @@
     <w:p>
       <w:pPr>
         <w:spacing w:after="160" w:line="276"/>
-        <w:ind w:left="720" w:hanging="720"/>
+        <w:ind w:left="720" w:hanging="576"/>
       </w:pPr>
       <w:r>
         <w:rPr>
@@ -598,7 +598,7 @@
     <w:p>
       <w:pPr>
         <w:spacing w:after="160" w:line="276"/>
-        <w:ind w:left="720" w:hanging="720"/>
+        <w:ind w:left="720" w:hanging="576"/>
       </w:pPr>
       <w:r>
         <w:rPr>
@@ -615,7 +615,7 @@
     <w:p>
       <w:pPr>
         <w:spacing w:after="160" w:line="276"/>
-        <w:ind w:left="720" w:hanging="720"/>
+        <w:ind w:left="720" w:hanging="576"/>
       </w:pPr>
       <w:r>
         <w:rPr>
@@ -632,7 +632,7 @@
     <w:p>
       <w:pPr>
         <w:spacing w:after="160" w:line="276"/>
-        <w:ind w:left="720" w:hanging="720"/>
+        <w:ind w:left="720" w:hanging="576"/>
       </w:pPr>
       <w:r>
         <w:rPr>
@@ -649,7 +649,7 @@
     <w:p>
       <w:pPr>
         <w:spacing w:after="160" w:line="276"/>
-        <w:ind w:left="720" w:hanging="720"/>
+        <w:ind w:left="720" w:hanging="576"/>
       </w:pPr>
       <w:r>
         <w:rPr>
@@ -666,7 +666,7 @@
     <w:p>
       <w:pPr>
         <w:spacing w:after="160" w:line="276"/>
-        <w:ind w:left="720" w:hanging="720"/>
+        <w:ind w:left="720" w:hanging="576"/>
       </w:pPr>
       <w:r>
         <w:rPr>
@@ -683,7 +683,7 @@
     <w:p>
       <w:pPr>
         <w:spacing w:after="160" w:line="276"/>
-        <w:ind w:left="720" w:hanging="720"/>
+        <w:ind w:left="720" w:hanging="576"/>
       </w:pPr>
       <w:r>
         <w:rPr>
@@ -700,7 +700,7 @@
     <w:p>
       <w:pPr>
         <w:spacing w:after="160" w:line="276"/>
-        <w:ind w:left="720" w:hanging="720"/>
+        <w:ind w:left="720" w:hanging="576"/>
       </w:pPr>
       <w:r>
         <w:rPr>
@@ -717,7 +717,7 @@
     <w:p>
       <w:pPr>
         <w:spacing w:after="160" w:line="276"/>
-        <w:ind w:left="720" w:hanging="720"/>
+        <w:ind w:left="720" w:hanging="576"/>
       </w:pPr>
       <w:r>
         <w:rPr>
@@ -748,7 +748,7 @@
     <w:p>
       <w:pPr>
         <w:spacing w:after="160" w:line="276"/>
-        <w:ind w:left="720" w:hanging="720"/>
+        <w:ind w:left="720" w:hanging="576"/>
       </w:pPr>
       <w:r>
         <w:rPr>
@@ -764,7 +764,7 @@
     <w:p>
       <w:pPr>
         <w:spacing w:after="160" w:line="276"/>
-        <w:ind w:left="720" w:hanging="720"/>
+        <w:ind w:left="720" w:hanging="576"/>
       </w:pPr>
       <w:r>
         <w:rPr>
@@ -780,7 +780,7 @@
     <w:p>
       <w:pPr>
         <w:spacing w:after="160" w:line="276"/>
-        <w:ind w:left="720" w:hanging="720"/>
+        <w:ind w:left="720" w:hanging="576"/>
       </w:pPr>
       <w:r>
         <w:rPr>
@@ -796,7 +796,7 @@
     <w:p>
       <w:pPr>
         <w:spacing w:after="160" w:line="276"/>
-        <w:ind w:left="720" w:hanging="720"/>
+        <w:ind w:left="720" w:hanging="576"/>
       </w:pPr>
       <w:r>
         <w:rPr>
@@ -812,7 +812,7 @@
     <w:p>
       <w:pPr>
         <w:spacing w:after="160" w:line="276"/>
-        <w:ind w:left="720" w:hanging="720"/>
+        <w:ind w:left="720" w:hanging="576"/>
       </w:pPr>
       <w:r>
         <w:rPr>
@@ -828,7 +828,7 @@
     <w:p>
       <w:pPr>
         <w:spacing w:after="160" w:line="276"/>
-        <w:ind w:left="720" w:hanging="720"/>
+        <w:ind w:left="720" w:hanging="576"/>
       </w:pPr>
       <w:r>
         <w:rPr>
@@ -844,7 +844,7 @@
     <w:p>
       <w:pPr>
         <w:spacing w:after="160" w:line="276"/>
-        <w:ind w:left="720" w:hanging="720"/>
+        <w:ind w:left="720" w:hanging="576"/>
       </w:pPr>
       <w:r>
         <w:rPr>
@@ -860,7 +860,7 @@
     <w:p>
       <w:pPr>
         <w:spacing w:after="160" w:line="276"/>
-        <w:ind w:left="720" w:hanging="720"/>
+        <w:ind w:left="720" w:hanging="576"/>
       </w:pPr>
       <w:r>
         <w:rPr>
@@ -876,7 +876,7 @@
     <w:p>
       <w:pPr>
         <w:spacing w:after="160" w:line="276"/>
-        <w:ind w:left="720" w:hanging="720"/>
+        <w:ind w:left="720" w:hanging="576"/>
       </w:pPr>
       <w:r>
         <w:rPr>
@@ -892,7 +892,7 @@
     <w:p>
       <w:pPr>
         <w:spacing w:after="160" w:line="276"/>
-        <w:ind w:left="720" w:hanging="720"/>
+        <w:ind w:left="720" w:hanging="576"/>
       </w:pPr>
       <w:r>
         <w:rPr>
@@ -908,7 +908,7 @@
     <w:p>
       <w:pPr>
         <w:spacing w:after="160" w:before="0" w:line="240" w:lineRule="auto"/>
-        <w:ind w:left="720" w:hanging="720"/>
+        <w:ind w:left="720" w:hanging="576"/>
       </w:pPr>
       <w:r>
         <w:rPr>
@@ -923,7 +923,7 @@
     <w:p>
       <w:pPr>
         <w:spacing w:after="160" w:before="0" w:line="240" w:lineRule="auto"/>
-        <w:ind w:left="720" w:hanging="720"/>
+        <w:ind w:left="720" w:hanging="576"/>
       </w:pPr>
       <w:r>
         <w:rPr>
@@ -938,7 +938,7 @@
     <w:p>
       <w:pPr>
         <w:spacing w:after="160" w:before="0" w:line="240" w:lineRule="auto"/>
-        <w:ind w:left="720" w:hanging="720"/>
+        <w:ind w:left="720" w:hanging="576"/>
       </w:pPr>
       <w:r>
         <w:rPr>
@@ -953,7 +953,7 @@
     <w:p>
       <w:pPr>
         <w:spacing w:after="160" w:before="0" w:line="240" w:lineRule="auto"/>
-        <w:ind w:left="720" w:hanging="720"/>
+        <w:ind w:left="720" w:hanging="576"/>
       </w:pPr>
       <w:r>
         <w:rPr>
@@ -968,7 +968,7 @@
     <w:p>
       <w:pPr>
         <w:spacing w:after="160" w:before="0" w:line="240" w:lineRule="auto"/>
-        <w:ind w:left="720" w:hanging="720"/>
+        <w:ind w:left="720" w:hanging="576"/>
       </w:pPr>
       <w:r>
         <w:rPr>
@@ -983,7 +983,7 @@
     <w:p>
       <w:pPr>
         <w:spacing w:after="160" w:before="0" w:line="240" w:lineRule="auto"/>
-        <w:ind w:left="720" w:hanging="720"/>
+        <w:ind w:left="720" w:hanging="576"/>
       </w:pPr>
       <w:r>
         <w:rPr>
@@ -998,7 +998,7 @@
     <w:p>
       <w:pPr>
         <w:spacing w:after="160" w:before="0" w:line="240" w:lineRule="auto"/>
-        <w:ind w:left="720" w:hanging="720"/>
+        <w:ind w:left="720" w:hanging="576"/>
       </w:pPr>
       <w:r>
         <w:rPr>
@@ -1013,7 +1013,7 @@
     <w:p>
       <w:pPr>
         <w:spacing w:after="160" w:before="0" w:line="240" w:lineRule="auto"/>
-        <w:ind w:left="720" w:hanging="720"/>
+        <w:ind w:left="720" w:hanging="576"/>
       </w:pPr>
       <w:r>
         <w:rPr>
@@ -1176,25 +1176,29 @@
     <w:p>
       <w:pPr>
         <w:spacing w:after="160" w:line="276"/>
-        <w:ind w:left="720" w:hanging="720"/>
-      </w:pPr>
-      <w:r>
-        <w:rPr/>
+        <w:ind w:left="720" w:hanging="576"/>
+      </w:pPr>
+      <w:r>
+        <w:rPr>
+          <w:i w:val="0"/>
+        </w:rPr>
         <w:t>1.</w:t>
         <w:tab/>
-        <w:t>I am over the age of 18 years and a Plaintiff in this action. I personally made the service described below by United States mail. Service of documents after the original summons may be made by a party by mail under Minn. R. Civ. P. 5.02, and such service by mail is complete upon mailing.</w:t>
-      </w:r>
-    </w:p>
-    <w:p>
-      <w:pPr>
-        <w:spacing w:after="160" w:line="276"/>
-        <w:ind w:left="720" w:hanging="720"/>
-      </w:pPr>
-      <w:r>
-        <w:rPr/>
+        <w:t>I am over the age of 18 years and a Plaintiff in this action. I personally made the service described below by electronic mail, in the manner the parties have agreed. Minn. R. Civ. P. 5.02(b); Minn. Gen. R. Prac. 14.03(d)(2).</w:t>
+      </w:r>
+    </w:p>
+    <w:p>
+      <w:pPr>
+        <w:spacing w:after="160" w:line="276"/>
+        <w:ind w:left="720" w:hanging="576"/>
+      </w:pPr>
+      <w:r>
+        <w:rPr>
+          <w:i w:val="0"/>
+        </w:rPr>
         <w:t>2.</w:t>
         <w:tab/>
-        <w:t xml:space="preserve">On ______________, 2026, I served a true and correct copy of </w:t>
+        <w:t xml:space="preserve">On ______________, 2026, at ______ __.m. local Minnesota time, I served a true and correct copy of </w:t>
       </w:r>
       <w:r>
         <w:rPr>
@@ -1203,8 +1207,10 @@
         <w:t>Plaintiffs’ First Set of Interrogatories to Defendant Fire Insurance Exchange</w:t>
       </w:r>
       <w:r>
-        <w:rPr/>
-        <w:t xml:space="preserve"> upon Defendant's counsel of record by depositing it in the United States mail at Eden Prairie, Minnesota, in a sealed envelope with postage prepaid, addressed as follows:</w:t>
+        <w:rPr>
+          <w:i w:val="0"/>
+        </w:rPr>
+        <w:t xml:space="preserve"> upon Defendant's counsel of record by transmitting it as a PDF attachment to an electronic mail message addressed as follows:</w:t>
       </w:r>
     </w:p>
     <w:p>
@@ -1213,8 +1219,10 @@
         <w:ind w:left="1080"/>
       </w:pPr>
       <w:r>
-        <w:rPr/>
-        <w:t>Kevin J. Kennedy (#193872)</w:t>
+        <w:rPr>
+          <w:i w:val="0"/>
+        </w:rPr>
+        <w:t>Kevin J. Kennedy (#193872) — kkennedy@kennedylf.com</w:t>
       </w:r>
     </w:p>
     <w:p>
@@ -1223,8 +1231,10 @@
         <w:ind w:left="1080"/>
       </w:pPr>
       <w:r>
-        <w:rPr/>
-        <w:t>Mary J. Baskfield (#0314572)</w:t>
+        <w:rPr>
+          <w:i w:val="0"/>
+        </w:rPr>
+        <w:t>Mary J. Baskfield (#0314572) — mbaskfield@kennedylf.com</w:t>
       </w:r>
     </w:p>
     <w:p>
@@ -1272,11 +1282,27 @@
     <w:p>
       <w:pPr>
         <w:spacing w:after="160" w:line="276"/>
-        <w:ind w:left="720" w:hanging="720"/>
-      </w:pPr>
-      <w:r>
-        <w:rPr/>
+        <w:ind w:left="720" w:hanging="576"/>
+      </w:pPr>
+      <w:r>
+        <w:rPr>
+          <w:i w:val="0"/>
+        </w:rPr>
         <w:t>3.</w:t>
+        <w:tab/>
+        <w:t>The transmission was sent from bill_y_lu@yahoo.com. I did not receive any indication that the transmission failed or was undeliverable. I have retained a copy of the transmission.</w:t>
+      </w:r>
+    </w:p>
+    <w:p>
+      <w:pPr>
+        <w:spacing w:after="160" w:line="276"/>
+        <w:ind w:left="720" w:hanging="576"/>
+      </w:pPr>
+      <w:r>
+        <w:rPr>
+          <w:i w:val="0"/>
+        </w:rPr>
+        <w:t>4.</w:t>
         <w:tab/>
         <w:t>These discovery requests are served, not filed, in accordance with Minn. R. Civ. P. 5.04(b).</w:t>
       </w:r>
@@ -1321,22 +1347,87 @@
     </w:p>
     <w:p>
       <w:pPr>
-        <w:spacing w:after="160" w:line="276"/>
-      </w:pPr>
-      <w:r>
-        <w:rPr/>
+        <w:tabs>
+          <w:tab w:pos="2016" w:val="left"/>
+        </w:tabs>
+        <w:spacing w:after="0" w:line="276"/>
+      </w:pPr>
+      <w:r>
+        <w:rPr>
+          <w:b w:val="0"/>
+          <w:i w:val="0"/>
+        </w:rPr>
+        <w:t>Name:</w:t>
+        <w:tab/>
         <w:t>Yibiao Lu</w:t>
       </w:r>
     </w:p>
     <w:p>
       <w:pPr>
-        <w:spacing w:after="160" w:line="276"/>
-      </w:pPr>
-      <w:r>
-        <w:rPr>
-          <w:i/>
-        </w:rPr>
-        <w:t>Printed name</w:t>
+        <w:tabs>
+          <w:tab w:pos="2016" w:val="left"/>
+        </w:tabs>
+        <w:spacing w:after="0" w:line="276"/>
+      </w:pPr>
+      <w:r>
+        <w:rPr>
+          <w:b w:val="0"/>
+          <w:i w:val="0"/>
+        </w:rPr>
+        <w:t>Address:</w:t>
+        <w:tab/>
+        <w:t>17756 George Moran Dr.</w:t>
+      </w:r>
+    </w:p>
+    <w:p>
+      <w:pPr>
+        <w:tabs>
+          <w:tab w:pos="2016" w:val="left"/>
+        </w:tabs>
+        <w:spacing w:after="0" w:line="276"/>
+      </w:pPr>
+      <w:r>
+        <w:rPr>
+          <w:b w:val="0"/>
+          <w:i w:val="0"/>
+        </w:rPr>
+        <w:t>City/State/Zip:</w:t>
+        <w:tab/>
+        <w:t>Eden Prairie, MN 55347</w:t>
+      </w:r>
+    </w:p>
+    <w:p>
+      <w:pPr>
+        <w:tabs>
+          <w:tab w:pos="2016" w:val="left"/>
+        </w:tabs>
+        <w:spacing w:after="0" w:line="276"/>
+      </w:pPr>
+      <w:r>
+        <w:rPr>
+          <w:b w:val="0"/>
+          <w:i w:val="0"/>
+        </w:rPr>
+        <w:t>Telephone:</w:t>
+        <w:tab/>
+        <w:t>763-843-2859</w:t>
+      </w:r>
+    </w:p>
+    <w:p>
+      <w:pPr>
+        <w:tabs>
+          <w:tab w:pos="2016" w:val="left"/>
+        </w:tabs>
+        <w:spacing w:after="160" w:line="276"/>
+      </w:pPr>
+      <w:r>
+        <w:rPr>
+          <w:b w:val="0"/>
+          <w:i w:val="0"/>
+        </w:rPr>
+        <w:t>E-mail address:</w:t>
+        <w:tab/>
+        <w:t>bill_y_lu@yahoo.com</w:t>
       </w:r>
     </w:p>
     <w:sectPr>

</xml_diff>

<commit_message>
Minor changes to interrogatories
</commit_message>
<xml_diff>
--- a/Filings/Discovery/FirstSetDiscovey/Interrogatories/Plaintiffs_First_Set_of_Interrogatories_to_FIE.docx
+++ b/Filings/Discovery/FirstSetDiscovey/Interrogatories/Plaintiffs_First_Set_of_Interrogatories_to_FIE.docx
@@ -319,7 +319,7 @@
         <w:t xml:space="preserve">"Defendant," "Farmers," "FIE," "You," and "Your" </w:t>
       </w:r>
       <w:r>
-        <w:t xml:space="preserve">mean Fire Insurance Exchange, its attorney-in-fact Fire Underwriters Association (and, to the extent it acted as attorney-in-fact in connection with The Policy, Farmers Underwriters Association), and each of their present and former agents, adjusters, employees, representatives, attorneys, third-party administrators, and any other person acting or purporting to act on their behalf.</w:t>
+        <w:t>mean Fire Insurance Exchange, its attorney-in-fact Fire Underwriters Association (and, to the extent it acted as attorney-in-fact in connection with The Policy, Farmers Underwriters Association), and each of their present and former agents, adjusters, employees, representatives, attorneys, third-party administrators, and any other person acting or purporting to act on their behalf.</w:t>
       </w:r>
     </w:p>
     <w:p>
@@ -335,7 +335,7 @@
         <w:t xml:space="preserve">"Fire Insurance Exchange" </w:t>
       </w:r>
       <w:r>
-        <w:t xml:space="preserve">means that entity only when used alone and spelled in full, and does not include its attorney-in-fact, any affiliate, or any other person within the preceding definition.</w:t>
+        <w:t>means that entity only when used alone and spelled in full, and does not include its attorney-in-fact, any affiliate, or any other person within the preceding definition.</w:t>
       </w:r>
     </w:p>
     <w:p>
@@ -351,7 +351,7 @@
         <w:t xml:space="preserve">"Plaintiffs" </w:t>
       </w:r>
       <w:r>
-        <w:t xml:space="preserve">means Yibiao Lu and Jie Hu.</w:t>
+        <w:t>means Yibiao Lu and Jie Hu.</w:t>
       </w:r>
     </w:p>
     <w:p>
@@ -367,7 +367,7 @@
         <w:t xml:space="preserve">"The Claim" </w:t>
       </w:r>
       <w:r>
-        <w:t xml:space="preserve">means Farmers claim number 7007986837-1-1, arising from the July 13, 2024 hail loss.</w:t>
+        <w:t>means Farmers claim number 7007986837-1-1, date of loss July 13, 2024.</w:t>
       </w:r>
     </w:p>
     <w:p>
@@ -383,7 +383,23 @@
         <w:t xml:space="preserve">"The 2020 Claim" </w:t>
       </w:r>
       <w:r>
-        <w:t xml:space="preserve">means Farmers claim number 3013539499-1.</w:t>
+        <w:t>means Farmers claim number 3013539499-1.</w:t>
+      </w:r>
+    </w:p>
+    <w:p>
+      <w:pPr>
+        <w:spacing w:after="160" w:line="276"/>
+        <w:ind w:left="720" w:hanging="576"/>
+      </w:pPr>
+      <w:r>
+        <w:rPr>
+          <w:b/>
+          <w:bCs/>
+        </w:rPr>
+        <w:t xml:space="preserve">"The February 18, 2022 Settlement Package" </w:t>
+      </w:r>
+      <w:r>
+        <w:t>means the 11-page document dated February 18, 2022 that You provided to Plaintiff Yibiao Lu concerning The 2020 Claim, consisting of Your two-page letter captioned "Settlement Notice," the one-page "BUILDING LOSS WORKSHEET" headed "This is a complete recap of your claim," and the eight-page estimate that follows, identified on its face as Estimate "YIBIAO_LU2," bearing "Claim Number: 3013539499-1-1" and setting out numbered line items 1 through 32.</w:t>
       </w:r>
     </w:p>
     <w:p>
@@ -415,7 +431,7 @@
         <w:t xml:space="preserve">"The Property" </w:t>
       </w:r>
       <w:r>
-        <w:t xml:space="preserve">means the insured dwelling at 17756 George Moran Dr., Eden Prairie, Minnesota 55347.</w:t>
+        <w:t>means the insured dwelling at 17756 George Moran Dr., Eden Prairie, Minnesota 55347.</w:t>
       </w:r>
     </w:p>
     <w:p>
@@ -431,23 +447,23 @@
         <w:t xml:space="preserve">"The Prieve Report" </w:t>
       </w:r>
       <w:r>
-        <w:t xml:space="preserve">means the report of Prieve Engineering, LLC, File #241008, together with all drafts thereof.</w:t>
-      </w:r>
-    </w:p>
-    <w:p>
-      <w:pPr>
-        <w:spacing w:after="160" w:line="276"/>
-        <w:ind w:left="720" w:hanging="576"/>
-      </w:pPr>
-      <w:r>
-        <w:rPr>
-          <w:b/>
-          <w:bCs/>
-        </w:rPr>
-        <w:t xml:space="preserve">“Photo Appendix A” </w:t>
-      </w:r>
-      <w:r>
-        <w:t>means the 110-page photographic appendix to The Prieve Report, titled “PHOTO APPENDIX A” and bearing File Number 241008 and site visit date October 9, 2024, containing photographs numbered A-1 through A-217.</w:t>
+        <w:t>means the seven-page report of Prieve Engineering, LLC titled "Evaluation of Condition of Windows as Relates to Hail," File Number 241008, report date November 4, 2024, as transmitted with Your November 4, 2024 letter to Plaintiffs.</w:t>
+      </w:r>
+    </w:p>
+    <w:p>
+      <w:pPr>
+        <w:spacing w:after="160" w:line="276"/>
+        <w:ind w:left="720" w:hanging="576"/>
+      </w:pPr>
+      <w:r>
+        <w:rPr>
+          <w:b/>
+          <w:bCs/>
+        </w:rPr>
+        <w:t xml:space="preserve">"Photo Appendix A" </w:t>
+      </w:r>
+      <w:r>
+        <w:t>means the 110-page photographic appendix to The Prieve Report, titled "PHOTO APPENDIX A" and bearing File Number 241008 and site visit date October 9, 2024, containing photographs numbered A-1 through A-217.</w:t>
       </w:r>
     </w:p>
     <w:p>
@@ -463,7 +479,7 @@
         <w:t xml:space="preserve">"The Appraisal Award" </w:t>
       </w:r>
       <w:r>
-        <w:t xml:space="preserve">means the appraisal award entered September 12, 2025 under Minn. Stat. § 65A.01.</w:t>
+        <w:t>means the written appraisal award concerning The Claim dated on or about September 12, 2025.</w:t>
       </w:r>
     </w:p>
     <w:p>
@@ -479,7 +495,7 @@
         <w:t xml:space="preserve">"Document" and "Documents" </w:t>
       </w:r>
       <w:r>
-        <w:t xml:space="preserve">have the broadest meaning permitted by Minn. R. Civ. P. 34.01 and include all writings, drawings, graphs, charts, photographs, sound and video recordings, images, and other data or data compilations — including electronically stored information ("ESI") — stored in any medium from which information can be obtained, together with all metadata and all non-identical drafts and copies.</w:t>
+        <w:t>have the broadest meaning permitted by Minn. R. Civ. P. 34.01 and include all writings, drawings, graphs, charts, photographs, sound and video recordings, images, and other data or data compilations — including electronically stored information ("ESI") — stored in any medium from which information can be obtained, together with all metadata and all non-identical drafts and copies.</w:t>
       </w:r>
     </w:p>
     <w:p>
@@ -495,23 +511,23 @@
         <w:t xml:space="preserve">"Communication" </w:t>
       </w:r>
       <w:r>
-        <w:t xml:space="preserve">means any transmission or exchange of information of any kind, whether oral, written, or electronic, including email, text message, voicemail, letter, memorandum, and claim-system note.</w:t>
-      </w:r>
-    </w:p>
-    <w:p>
-      <w:pPr>
-        <w:spacing w:after="160" w:line="276"/>
-        <w:ind w:left="720" w:hanging="576"/>
-      </w:pPr>
-      <w:r>
-        <w:rPr>
-          <w:b/>
-          <w:bCs/>
-        </w:rPr>
-        <w:t xml:space="preserve">"Person" </w:t>
-      </w:r>
-      <w:r>
-        <w:t xml:space="preserve">means any natural person or any business, legal, or governmental entity.</w:t>
+        <w:t>means any transmission or exchange of information of any kind, whether oral, written, or electronic, including email, text message, voicemail, letter, memorandum, and claim-system note.</w:t>
+      </w:r>
+    </w:p>
+    <w:p>
+      <w:pPr>
+        <w:spacing w:after="160" w:line="276"/>
+        <w:ind w:left="720" w:hanging="576"/>
+      </w:pPr>
+      <w:r>
+        <w:rPr>
+          <w:b/>
+          <w:bCs/>
+        </w:rPr>
+        <w:t xml:space="preserve">"Person" and "person" </w:t>
+      </w:r>
+      <w:r>
+        <w:t>mean any natural person or group of natural persons, and any business, legal, or governmental entity of any form, whether or not incorporated, including any corporation, partnership, limited liability company, association, reciprocal or interinsurance exchange, attorney-in-fact, trust, or joint venture.</w:t>
       </w:r>
     </w:p>
     <w:p>
@@ -543,7 +559,7 @@
         <w:t xml:space="preserve">"Relating to," "concerning," and "regarding" </w:t>
       </w:r>
       <w:r>
-        <w:t xml:space="preserve">mean referring to, describing, evidencing, constituting, reflecting, or in any way logically or factually connected with the subject matter of the request.</w:t>
+        <w:t>mean referring to, describing, evidencing, constituting, reflecting, or in any way logically or factually connected with the subject matter of the request.</w:t>
       </w:r>
     </w:p>
     <w:p>
@@ -591,7 +607,7 @@
         <w:tab/>
       </w:r>
       <w:r>
-        <w:t>Manner of answer. Each interrogatory must be answered separately, fully, in writing, and under oath, and the answers must be signed by the person making them, pursuant to Minn. R. Civ. P. 33.01(d).</w:t>
+        <w:t>Manner of answer. Each interrogatory must be answered separately and fully, in writing, and signed under oath or penalty of perjury by an officer or managing agent of Defendant, who must furnish the information available to Defendant. A declaration signed under penalty of perjury must be in the form Minn. Stat. § 358.116 requires. Restate each interrogatory immediately preceding its answer. Minn. R. Civ. P. 33.01(d).</w:t>
       </w:r>
     </w:p>
     <w:p>
@@ -608,7 +624,7 @@
         <w:tab/>
       </w:r>
       <w:r>
-        <w:t xml:space="preserve">Continuing duty. These interrogatories are continuing. You must seasonably supplement or correct Your answers pursuant to Minn. R. Civ. P. 26.05.</w:t>
+        <w:t>Continuing duty. These interrogatories are continuing. You must supplement or correct Your answers in a timely manner as Minn. R. Civ. P. 26.05 requires. If any answer is based on an incomplete search or review, state so expressly in that answer, identify what remains to be searched, and serve Your supplemental answer promptly upon completion.</w:t>
       </w:r>
     </w:p>
     <w:p>
@@ -625,7 +641,7 @@
         <w:tab/>
       </w:r>
       <w:r>
-        <w:t xml:space="preserve">Privilege. If You withhold any information on a claim of privilege or protection, expressly state the claim and provide a privilege log describing the nature of the withheld material in a manner sufficient to enable Plaintiffs to assess the claim, pursuant to Minn. R. Civ. P. 26.02(f).</w:t>
+        <w:t>Privilege. If You withhold any information on a claim of privilege or protection, expressly state the claim and provide a privilege log describing the nature of the withheld material in a manner sufficient to enable Plaintiffs to assess the claim, pursuant to Minn. R. Civ. P. 26.02(f).</w:t>
       </w:r>
     </w:p>
     <w:p>
@@ -659,7 +675,7 @@
         <w:tab/>
       </w:r>
       <w:r>
-        <w:t>No responsive information. If no information exists responsive to an interrogatory, state so expressly. If responsive information once existed but is no longer available, state that in Your answer to the interrogatory concerned, identify the information, and provide as to it each particular called for by Interrogatory 14 (destroyed or unlocatable information).</w:t>
+        <w:t>No responsive information. If no information exists responsive to an interrogatory, state so expressly. If responsive information once existed but no longer exists or cannot be located, state that in the answer, identify the information, and state when and how it was lost or destroyed, who authorized or caused that, and who has had custody of it.</w:t>
       </w:r>
     </w:p>
     <w:p>
@@ -676,7 +692,7 @@
         <w:tab/>
       </w:r>
       <w:r>
-        <w:t xml:space="preserve">Construction. The words "and" and "or" are both conjunctive and disjunctive; "each" includes "every"; and the singular includes the plural and vice versa, as necessary to bring within the scope of each interrogatory all answers that might otherwise be construed to be outside its scope.</w:t>
+        <w:t>Construction. The words "and" and "or" are both conjunctive and disjunctive; "each" includes "every"; and the singular includes the plural and vice versa, as necessary to bring within the scope of each interrogatory all answers that might otherwise be construed to be outside its scope.</w:t>
       </w:r>
     </w:p>
     <w:p>
@@ -727,7 +743,7 @@
         <w:tab/>
       </w:r>
       <w:r>
-        <w:t>Identification of respondents. With Your answers, identify each person who supplied information used in answering, and the interrogatory or interrogatories to which each such person contributed. This instruction supplements, and does not limit, the obligation under Minn. R. Civ. P. 33.01(d) of the officer or managing agent signing the answers to “furnish such information as is available.”</w:t>
+        <w:t>Identification of respondents. With Your answers, identify each person who supplied information used in answering, and the interrogatory or interrogatories to which each such person contributed. This instruction supplements, and does not limit, the obligation under Minn. R. Civ. P. 33.01(d) of the officer or managing agent signing the answers to "furnish such information as is available."</w:t>
       </w:r>
     </w:p>
     <w:p>
@@ -761,7 +777,24 @@
         <w:tab/>
       </w:r>
       <w:r>
-        <w:t>Answering on behalf of others. If You do not answer on behalf of every person within the definition of “You,” state which persons You have excluded, and identify, as to each answer affected, the person who has the information withheld on that basis. Where an interrogatory asks which person or entity performed an act, made a decision, or sent a communication, identify the specific legal entity by name; attributing the act to “Farmers,” “Defendant,” or the Exchange collectively is not a complete answer.</w:t>
+        <w:t>Answering on behalf of others. If You do not answer on behalf of every person within the definition of "You," state which persons You have excluded, and identify, as to each answer affected, the person who has the information withheld on that basis. Where an interrogatory asks which person or entity performed an act, made a decision, or sent a communication, identify the specific legal entity by name; attributing the act to "Farmers" or "Defendant" collectively is not a complete answer.</w:t>
+      </w:r>
+    </w:p>
+    <w:p>
+      <w:pPr>
+        <w:spacing w:after="160" w:line="276"/>
+        <w:ind w:left="720" w:hanging="576"/>
+      </w:pPr>
+      <w:r>
+        <w:rPr>
+          <w:b/>
+          <w:bCs/>
+        </w:rPr>
+        <w:t>13.</w:t>
+        <w:tab/>
+      </w:r>
+      <w:r>
+        <w:t>Item-by-item answers. Where an interrogatory asks about each of several windows, items, or persons, answer separately as to each. A single collective answer that does not address each one is not responsive.</w:t>
       </w:r>
     </w:p>
     <w:p>
@@ -791,7 +824,7 @@
         <w:t xml:space="preserve">INTERROGATORY NO. 1:  </w:t>
       </w:r>
       <w:r>
-        <w:t>Separately for each window of The Property that the Prieve Report’s Photo Appendix A depicts as dented, marked, or otherwise damaged, other than the windows designated “F1.7” and “B1.2” in The Appraisal Award, state the cause You attribute to that condition and the facts supporting that attribution, state whether You contend any policy exclusion or limitation applies to that window and, if so, which, and, if You contend The Appraisal Award determined the question for that window, identify the portion of the award You rely on.</w:t>
+        <w:t>For each window or other component of The Property — including downspouts, gutters, flashing, siding, trim board, doors, and screens — at which The Prieve Report or Photo Appendix A records a dent, mark, scrape, or indentation, other than the windows designated "F1.7" and "B1.2," state the cause and approximate date You attribute to it, the facts supporting that attribution (including, for any condition attributed to a prior claim, that claim’s number and the estimate line item You contend paid for it), any policy exclusion or limitation You contend applies, and any portion of The Appraisal Award You contend determined the question.</w:t>
       </w:r>
     </w:p>
     <w:p>
@@ -807,7 +840,7 @@
         <w:t xml:space="preserve">INTERROGATORY NO. 2:  </w:t>
       </w:r>
       <w:r>
-        <w:t>For each policy provision cited in the November 4, 2024 denial letter and its “Coverage Outcome – Policy Provisions” attachment as a ground for denying The Claim, state: the provision by section and number; whether You contend it operates as an exclusion or as a limitation on the grant of coverage; the specific factual basis on which You contend it applies to The Claim; the documents and witnesses on which You rely to support its application; and the person who decided to include it in the letter.</w:t>
+        <w:t>State how the scope of Prieve Engineering’s engagement came to be limited to the condition of the windows, identifying when and by whom that scope was set, whether Prieve asked to expand it and with what result, and, if no document records the reason, the reason and each person with knowledge of it.</w:t>
       </w:r>
     </w:p>
     <w:p>
@@ -823,7 +856,7 @@
         <w:t xml:space="preserve">INTERROGATORY NO. 3:  </w:t>
       </w:r>
       <w:r>
-        <w:t>Identify each non-window component of The Property (including without limitation downspouts, flashing, siding, trim board, doors, and screens) that the Prieve Report’s Photo Appendix A documents as dented, marked, or otherwise damaged, and for each such component state the cause You attribute to the damage and whether You contend that any policy exclusion or limitation applies.</w:t>
+        <w:t>For each of line items 1, 2, 3, and 32 of the estimate within The February 18, 2022 Settlement Package, identify, based on all information available to You, the window or sash it covers by location and elevation, and state whether it covers a whole window unit or one or more individual sashes.</w:t>
       </w:r>
     </w:p>
     <w:p>
@@ -839,7 +872,7 @@
         <w:t xml:space="preserve">INTERROGATORY NO. 4:  </w:t>
       </w:r>
       <w:r>
-        <w:t>State the basis for Your decision to scope the Prieve Engineering engagement to the condition of the windows and to exclude the siding, downspouts, flashing, and doors that Plaintiffs had reported as damaged, identifying the date of that decision, the person(s) who made it, whether Plaintiffs were informed of it, and whether Prieve requested and was denied an expanded scope. If no document records the reason for the decision, state the reason and identify each person with knowledge of it.</w:t>
+        <w:t>State whether Nicholas Brau created any record of his September 6, 2024 inspection of The Property — including handwritten notes, sketches, measurements, photographs, voice memos, and claim-system or portal entries — and for each, its type, date, present location and custodian; and state the basis for Your October 10, 2025 statement that "the file does not contain a report on the requested date," including the search performed, the custodians and systems searched, when, and by whom.</w:t>
       </w:r>
     </w:p>
     <w:p>
@@ -855,7 +888,7 @@
         <w:t xml:space="preserve">INTERROGATORY NO. 5:  </w:t>
       </w:r>
       <w:r>
-        <w:t>For each line item in the 2020 Xactimate estimate for The 2020 Claim, identify the specific window or sash to which the line item relates by location and elevation, state whether the line item paid for replacement of an entire window unit or for one or more individual sashes, and identify each window, sash, or component that the 2020 inspection observed or photographed as damaged but did not include in a paid line item, together with the reason for its exclusion. The correspondence between a given line item and a specific window or sash is not ascertainable from the estimate itself and is known only to You and Your adjusters.</w:t>
+        <w:t>State the basis for Nicholas Brau’s October 29, 2025 statement that "All the information we can release has already been sent to you," identifying what had been released and when, and which of his observations from the September 6, 2024 inspection that release includes; and state whether You contend that statement is consistent with Your October 10, 2025 statement that "the file does not contain a report on the requested date," and if so, why.</w:t>
       </w:r>
     </w:p>
     <w:p>
@@ -871,7 +904,7 @@
         <w:t xml:space="preserve">INTERROGATORY NO. 6:  </w:t>
       </w:r>
       <w:r>
-        <w:t>Identify, by date, speaker, recipient(s), and medium, each communication in which You articulated, restated, or applied any requirement that evidence on a hail claim be provided by an engineer, including without limitation the February 3, 2025 telephone call between Bradlee Monson and Yibiao Lu, and the 11:06 a.m. February 10, 2025 voicemail from Nicholas Brau.</w:t>
+        <w:t>For each of Your September 3, 2024 and November 4, 2024 letters to Plaintiffs, state whether any supervisory or quality-control review was performed before the letter issued and, if so, by whom, when, what it consisted of, and what documents it produced; and identify who authorized each letter to be issued.</w:t>
       </w:r>
     </w:p>
     <w:p>
@@ -887,7 +920,7 @@
         <w:t xml:space="preserve">INTERROGATORY NO. 7:  </w:t>
       </w:r>
       <w:r>
-        <w:t xml:space="preserve">State whether Nicholas Brau created any record of any kind of his September 6, 2024 inspection of The Property — including handwritten notes, sketches or drawings, measurements, photographs, voice memos, and claim-system or portal entries made on or after that date — and for each such record state its type, the date created, its present location and custodian, and, if it no longer exists or cannot be located, when and how it ceased to exist or became unlocatable and who authorized or caused that. Then state the basis for Your October 10, 2025 statement that “the file does not contain a report on the requested date,” and identify the search performed to locate records of the inspection, the custodians and systems searched, the date of the search, and the person who performed it.</w:t>
+        <w:t>State each fact supporting any contention that The Claim was "resolved or confirmed by arbitration or appraisal" under Minn. Stat. § 604.18, subd. 4(c); and, for each item submitted to or addressed in the appraisal — including "Windows F1.7 B1.2," "Siding &amp; Paint," "Debris," and each item in Plaintiffs’ August 3, 2025 appraisal demand — state whether You contend The Appraisal Award determined its actual value and loss, with the document supporting that contention.</w:t>
       </w:r>
     </w:p>
     <w:p>
@@ -903,7 +936,7 @@
         <w:t xml:space="preserve">INTERROGATORY NO. 8:  </w:t>
       </w:r>
       <w:r>
-        <w:t>State the basis for Nicholas Brau’s October 29, 2025 statement that "all the information we can release has already been sent to you," identifying what specifically had been released, to whom, on what date, and which of Mr. Brau’s observations from the September 6, 2024 inspection are included in that release. State whether You contend the October 10, 2025 statement and the October 29, 2025 statement are consistent with one another and, if so, the basis for that contention.</w:t>
+        <w:t>Describe what You did with the Hancock Claims Consultants and Prieve Engineering reports before relying on them in The Claim, identifying each person involved, what each did, and each document created; and state whether any written policy or procedure applied to those steps and, if so, identify it.</w:t>
       </w:r>
     </w:p>
     <w:p>
@@ -919,7 +952,7 @@
         <w:t xml:space="preserve">INTERROGATORY NO. 9:  </w:t>
       </w:r>
       <w:r>
-        <w:t xml:space="preserve">For each of the September 3, 2024 and November 4, 2024 denial letters, describe the supervisory review performed before the letter was issued, identifying the reviewer(s), the steps taken, the date of the review, and any documents created during the review.</w:t>
+        <w:t>State each fact supporting Your First Affirmative Defense, which alleges that "pursuant to Rule 12, Minn. R. Civ. P., there exists a lack of jurisdiction over Defendant FIE and Plaintiffs have failed to state a claim upon which relief can be granted," and identify each count of the Complaint to which the failure-to-state allegation is directed; and, if You contend that any person should be a defendant in this action in place of or in addition to Fire Insurance Exchange, or that Fire Insurance Exchange is misnamed or misdescribed in the caption, identify that person by legal name, form, and state of organization.</w:t>
       </w:r>
     </w:p>
     <w:p>
@@ -935,136 +968,103 @@
         <w:t xml:space="preserve">INTERROGATORY NO. 10:  </w:t>
       </w:r>
       <w:r>
-        <w:t>State each fact on which You base any contention that The Appraisal Award resolved The Claim within the meaning of Minn. Stat. § 604.18, subd. 4(c), and identify every window that the award is intended to cover and every window it is intended to exclude, with the document or communication supporting each identification.</w:t>
-      </w:r>
-    </w:p>
-    <w:p>
-      <w:pPr>
-        <w:spacing w:after="160" w:before="0" w:line="240" w:lineRule="auto"/>
-        <w:ind w:left="720" w:hanging="576"/>
-      </w:pPr>
-      <w:r>
-        <w:rPr>
-          <w:b/>
+        <w:t>Identify each person known to You to have knowledge of the facts concerning The Claim, The 2020 Claim, any inspection of The Property, the appraisal, or Your denial decisions, and state the subject matter of each person’s knowledge.</w:t>
+      </w:r>
+    </w:p>
+    <w:p>
+      <w:pPr>
+        <w:spacing w:after="160" w:line="276"/>
+        <w:ind w:left="720" w:hanging="576"/>
+      </w:pPr>
+      <w:r>
+        <w:rPr>
+          <w:b/>
+          <w:bCs/>
         </w:rPr>
         <w:t xml:space="preserve">INTERROGATORY NO. 11:  </w:t>
       </w:r>
       <w:r>
-        <w:t>Describe Your policies, procedures, and practices for retaining, reviewing, evaluating, and accepting or rejecting third-party inspection reports and engineering reports on property claims, including the Hancock Claims Consultants and Prieve Engineering reports in The Claim, stating: (a) who within Farmers reviews such reports; (b) what independent review or analysis, if any, Farmers performs of a vendor’s findings and conclusions before relying on them; (c) whether and how an adjuster or supervisor may accept, modify, or reject a vendor’s conclusions; and (d) the review actually performed of the Hancock and Prieve reports in The Claim, identifying each person involved and each document created.</w:t>
-      </w:r>
-    </w:p>
-    <w:p>
-      <w:pPr>
-        <w:spacing w:after="160" w:before="0" w:line="240" w:lineRule="auto"/>
-        <w:ind w:left="720" w:hanging="576"/>
-      </w:pPr>
-      <w:r>
-        <w:rPr>
-          <w:b/>
+        <w:t>Identify each document or item of information concerning The Claim, The 2020 Claim, or The Property that You contend no longer exists or cannot be located, stating for each its type, date, author, and subject matter, when and how it was lost or destroyed, who authorized or caused that, and who has had custody of it.</w:t>
+      </w:r>
+    </w:p>
+    <w:p>
+      <w:pPr>
+        <w:spacing w:after="160" w:line="276"/>
+        <w:ind w:left="720" w:hanging="576"/>
+      </w:pPr>
+      <w:r>
+        <w:rPr>
+          <w:b/>
+          <w:bCs/>
         </w:rPr>
         <w:t xml:space="preserve">INTERROGATORY NO. 12:  </w:t>
       </w:r>
       <w:r>
-        <w:rPr/>
-        <w:t>State each fact on which You base Your First Affirmative Defense that "there exists a lack of jurisdiction over Defendant FIE," and, if You contend that any entity other than Fire Insurance Exchange should have been named as a defendant in this action, identify that entity and state its form and state of organization.</w:t>
-      </w:r>
-    </w:p>
-    <w:p>
-      <w:pPr>
-        <w:spacing w:after="160" w:before="0" w:line="240" w:lineRule="auto"/>
-        <w:ind w:left="720" w:hanging="576"/>
-      </w:pPr>
-      <w:r>
-        <w:rPr>
-          <w:b/>
+        <w:t>For each of Plaintiffs’ submissions of January 31, 2025 (post-2020 storm activity and gutter replacement), February 10, 2025 (City of Eden Prairie permit records and the neighbor canvass), and May 28, 2025 (National Weather Service and Interactive Hail Maps material, through agent Peter Pietila), state what You did with it, identifying each person involved, when, the conclusion reached, each document recording it, and whether it was considered in any decision on The Claim; if nothing was done, state why.</w:t>
+      </w:r>
+    </w:p>
+    <w:p>
+      <w:pPr>
+        <w:spacing w:after="160" w:line="276"/>
+        <w:ind w:left="720" w:hanging="576"/>
+      </w:pPr>
+      <w:r>
+        <w:rPr>
+          <w:b/>
+          <w:bCs/>
         </w:rPr>
         <w:t xml:space="preserve">INTERROGATORY NO. 13:  </w:t>
       </w:r>
       <w:r>
-        <w:t>Identify each person known to You to have knowledge of any fact at issue in this action, including without limitation facts relating to The Claim, The 2020 Claim, any inspection of The Property, the appraisal, or the denial decisions, and state the subject matter of each person’s knowledge.</w:t>
-      </w:r>
-    </w:p>
-    <w:p>
-      <w:pPr>
-        <w:spacing w:after="160" w:before="0" w:line="240" w:lineRule="auto"/>
-        <w:ind w:left="720" w:hanging="576"/>
-      </w:pPr>
-      <w:r>
-        <w:rPr>
-          <w:b/>
+        <w:t>As to the allegation in Your answer to paragraph 14 of the Complaint that Plaintiffs "attempted to direct the claim-handling process by adamantly advising Hancock Claims Consultants that the only thing that needed to be inspected was the windows on the inside where they were leaking," state who made and who received the statement, when and how, and identify each document recording it and the person who first recorded it; state whether Hancock’s August 29, 2024 inspection was limited as a result and, if so, what was not inspected; and state whether You contend the statement was a basis for Your September 3, 2024 statement that "[t]here were no other damages observed."</w:t>
+      </w:r>
+    </w:p>
+    <w:p>
+      <w:pPr>
+        <w:spacing w:after="160" w:line="276"/>
+        <w:ind w:left="720" w:hanging="576"/>
+      </w:pPr>
+      <w:r>
+        <w:rPr>
+          <w:b/>
+          <w:bCs/>
         </w:rPr>
         <w:t xml:space="preserve">INTERROGATORY NO. 14:  </w:t>
       </w:r>
       <w:r>
-        <w:t>For each document or item of information responsive to any discovery request in Plaintiffs’ First Sets that You contend no longer exists or cannot be located, identify the document or information by type, date, author, and subject matter; state the date and manner of its destruction or loss; identify the person who authorized or caused it and the retention policy or schedule under which it occurred; and identify each person who had custody of it.</w:t>
-      </w:r>
-    </w:p>
-    <w:p>
-      <w:pPr>
-        <w:spacing w:after="160" w:before="0" w:line="240" w:lineRule="auto"/>
-        <w:ind w:left="720" w:hanging="576"/>
-      </w:pPr>
-      <w:r>
-        <w:rPr>
-          <w:b/>
+        <w:t>State the date You contend You first anticipated litigation concerning The Claim, identifying who made that determination and what prompted it; and state the date any litigation hold or preservation instruction concerning The Claim was issued, and to whom it was directed.</w:t>
+      </w:r>
+    </w:p>
+    <w:p>
+      <w:pPr>
+        <w:spacing w:after="160" w:line="276"/>
+        <w:ind w:left="720" w:hanging="576"/>
+      </w:pPr>
+      <w:r>
+        <w:rPr>
+          <w:b/>
+          <w:bCs/>
         </w:rPr>
         <w:t xml:space="preserve">INTERROGATORY NO. 15:  </w:t>
       </w:r>
       <w:r>
-        <w:t xml:space="preserve">For each of the following submissions by Plaintiffs — (i) the January 31, 2025 response and its attachments concerning post-2020 storm activity and gutter replacement; (ii) the February 10, 2025 second response containing City of Eden Prairie permit records and the neighbor canvass; and (iii) the May 28, 2025 National Weather Service and Interactive Hail Maps material delivered through agent Peter Pietila — state whether any person acting for You reviewed the submission on its merits, and if so identify that person, the date of the review, the conclusion reached, and each claim-file note or other document recording it; and if no such review occurred, state so and the reason.</w:t>
-      </w:r>
-    </w:p>
-    <w:p>
-      <w:pPr>
-        <w:spacing w:after="160" w:before="0" w:line="240" w:lineRule="auto"/>
-        <w:ind w:left="720" w:hanging="576"/>
-      </w:pPr>
-      <w:r>
-        <w:rPr>
-          <w:b/>
+        <w:t>Your answer to paragraph 33 of the Complaint denies "that the Appraisal Award does not state actual value and loss separately to each item." For each item, identify the actual value and the loss You contend the award states and where on the award each appears; and identify any item other than the windows designated "F1.7" and "B1.2" for which You contend the award states a value or loss.</w:t>
+      </w:r>
+    </w:p>
+    <w:p>
+      <w:pPr>
+        <w:spacing w:after="160" w:line="276"/>
+        <w:ind w:left="720" w:hanging="576"/>
+      </w:pPr>
+      <w:r>
+        <w:rPr>
+          <w:b/>
+          <w:bCs/>
         </w:rPr>
         <w:t xml:space="preserve">INTERROGATORY NO. 16:  </w:t>
       </w:r>
       <w:r>
-        <w:t xml:space="preserve">With respect to the allegation in Your Answer to paragraph 14 of the Complaint that Plaintiffs “attempted to direct the claim-handling process by adamantly advising Hancock Claims Consultants that the only thing that needed to be inspected was the windows on the inside where they were leaking,” state: each person who made and each person who received that advice, the date and manner of the communication, and each document in which it was recorded at the time; whether the scope of Hancock’s August 29, 2024 inspection was in fact limited as a result and, if so, which components of The Property were not inspected on that account; and whether You contend that this alleged advice was a basis for the statement in Your September 3, 2024 letter that “[t]here were no other damages observed.”</w:t>
-      </w:r>
-    </w:p>
-    <w:p>
-      <w:pPr>
-        <w:spacing w:after="160" w:before="0" w:line="240" w:lineRule="auto"/>
-        <w:ind w:left="720" w:hanging="576"/>
-      </w:pPr>
-      <w:r>
-        <w:rPr>
-          <w:b/>
-        </w:rPr>
-        <w:t xml:space="preserve">INTERROGATORY NO. 17:  </w:t>
-      </w:r>
-      <w:r>
-        <w:t xml:space="preserve">State the date on which You contend You first anticipated litigation concerning The Claim, identify the person who made that determination and the event or communication that prompted it, and identify each category of document created after that date that You contend is protected from discovery on that basis.</w:t>
-      </w:r>
-    </w:p>
-    <w:p>
-      <w:pPr>
-        <w:spacing w:after="160" w:before="0" w:line="240" w:lineRule="auto"/>
-        <w:ind w:left="720" w:hanging="576"/>
-      </w:pPr>
-      <w:r>
-        <w:rPr>
-          <w:b/>
-        </w:rPr>
-        <w:t xml:space="preserve">INTERROGATORY NO. 18:  </w:t>
-      </w:r>
-      <w:r>
-        <w:t>Identify each portion of The Appraisal Award that You contend states the actual value and the loss separately for each item, specifying for each awarded item the actual value and the loss You contend the award states and the location on the award where each appears; and if You contend the award states a value or loss for any item other than the two awarded windows, identify that item and the amount.</w:t>
-      </w:r>
-    </w:p>
-    <w:p>
-      <w:pPr>
-        <w:spacing w:after="160" w:before="200" w:line="276"/>
-      </w:pPr>
-      <w:r>
-        <w:t>Pursuant to Minn. R. Civ. P. 33.01(a), Plaintiffs state that the foregoing interrogatories, counting each subdivision of separate questions as an interrogatory, number fewer than thirty-five (35) and do not exceed the fifty (50) interrogatories permitted without leave of court. Plaintiffs reserve the right to serve additional interrogatories by stipulation or upon leave of court.</w:t>
+        <w:t>Identify the legal entity that employed or engaged each person who acted for You in handling The Claim, including Christian Dudley, Nicholas Brau, and Bradlee Monson, at the time of that person’s involvement. This interrogatory does not seek compensation, performance, or disciplinary information.</w:t>
       </w:r>
     </w:p>
     <w:p>
@@ -1163,7 +1163,7 @@
     </w:p>
     <w:p>
       <w:pPr>
-        <w:spacing w:after="0"/>
+        <w:spacing w:after="0" w:before="120"/>
       </w:pPr>
       <w:r>
         <w:t xml:space="preserve">Eden Prairie, MN 55347</w:t>
@@ -1171,7 +1171,7 @@
     </w:p>
     <w:p>
       <w:pPr>
-        <w:spacing w:after="0"/>
+        <w:spacing w:after="0" w:before="120"/>
       </w:pPr>
       <w:r>
         <w:t>Telephone: 763-843-2860</w:t>

</xml_diff>

<commit_message>
Issues: 	int. 1, given the current content, I think FIE can say not by hail as Appraisal Award only cover 2 windows. 	int. 2, wanted to wait until getting answers for RFAs --- window only scope
Decision:
	rewrite int 1; add a new interrogatory to second set; added 3 new RFAs; added/updated definitions.
	move int.2 to second set
</commit_message>
<xml_diff>
--- a/Filings/Discovery/FirstSetDiscovey/Interrogatories/Plaintiffs_First_Set_of_Interrogatories_to_FIE.docx
+++ b/Filings/Discovery/FirstSetDiscovey/Interrogatories/Plaintiffs_First_Set_of_Interrogatories_to_FIE.docx
@@ -303,263 +303,349 @@
           <w:bCs/>
           <w:caps/>
         </w:rPr>
-        <w:t xml:space="preserve">Definitions</w:t>
-      </w:r>
-    </w:p>
-    <w:p>
-      <w:pPr>
-        <w:spacing w:after="160" w:line="276"/>
-        <w:ind w:left="720" w:hanging="576"/>
-      </w:pPr>
-      <w:r>
-        <w:rPr>
-          <w:b/>
-          <w:bCs/>
-        </w:rPr>
-        <w:t xml:space="preserve">"Defendant," "Farmers," "FIE," "You," and "Your" </w:t>
-      </w:r>
-      <w:r>
-        <w:t>mean Fire Insurance Exchange, its attorney-in-fact Fire Underwriters Association (and, to the extent it acted as attorney-in-fact in connection with The Policy, Farmers Underwriters Association), and each of their present and former agents, adjusters, employees, representatives, attorneys, third-party administrators, and any other person acting or purporting to act on their behalf.</w:t>
-      </w:r>
-    </w:p>
-    <w:p>
-      <w:pPr>
-        <w:spacing w:after="160" w:line="276"/>
-        <w:ind w:left="720" w:hanging="576"/>
-      </w:pPr>
-      <w:r>
-        <w:rPr>
-          <w:b/>
-          <w:bCs/>
-        </w:rPr>
-        <w:t xml:space="preserve">"Fire Insurance Exchange" </w:t>
-      </w:r>
-      <w:r>
-        <w:t>means that entity only when used alone and spelled in full, and does not include its attorney-in-fact, any affiliate, or any other person within the preceding definition.</w:t>
-      </w:r>
-    </w:p>
-    <w:p>
-      <w:pPr>
-        <w:spacing w:after="160" w:line="276"/>
-        <w:ind w:left="720" w:hanging="576"/>
-      </w:pPr>
-      <w:r>
-        <w:rPr>
-          <w:b/>
-          <w:bCs/>
-        </w:rPr>
-        <w:t xml:space="preserve">"Plaintiffs" </w:t>
-      </w:r>
-      <w:r>
-        <w:t>means Yibiao Lu and Jie Hu.</w:t>
-      </w:r>
-    </w:p>
-    <w:p>
-      <w:pPr>
-        <w:spacing w:after="160" w:line="276"/>
-        <w:ind w:left="720" w:hanging="576"/>
-      </w:pPr>
-      <w:r>
-        <w:rPr>
-          <w:b/>
-          <w:bCs/>
-        </w:rPr>
-        <w:t xml:space="preserve">"The Claim" </w:t>
-      </w:r>
-      <w:r>
-        <w:t>means Farmers claim number 7007986837-1-1, date of loss July 13, 2024.</w:t>
-      </w:r>
-    </w:p>
-    <w:p>
-      <w:pPr>
-        <w:spacing w:after="160" w:line="276"/>
-        <w:ind w:left="720" w:hanging="576"/>
-      </w:pPr>
-      <w:r>
-        <w:rPr>
-          <w:b/>
-          <w:bCs/>
-        </w:rPr>
-        <w:t xml:space="preserve">"The 2020 Claim" </w:t>
-      </w:r>
-      <w:r>
-        <w:t>means Farmers claim number 3013539499-1.</w:t>
-      </w:r>
-    </w:p>
-    <w:p>
-      <w:pPr>
-        <w:spacing w:after="160" w:line="276"/>
-        <w:ind w:left="720" w:hanging="576"/>
-      </w:pPr>
-      <w:r>
-        <w:rPr>
-          <w:b/>
-          <w:bCs/>
-        </w:rPr>
-        <w:t xml:space="preserve">"The February 18, 2022 Settlement Package" </w:t>
-      </w:r>
-      <w:r>
-        <w:t>means the 11-page document dated February 18, 2022 that You provided to Plaintiff Yibiao Lu concerning The 2020 Claim, consisting of Your two-page letter captioned "Settlement Notice," the one-page "BUILDING LOSS WORKSHEET" headed "This is a complete recap of your claim," and the eight-page estimate that follows, identified on its face as Estimate "YIBIAO_LU2," bearing "Claim Number: 3013539499-1-1" and setting out numbered line items 1 through 32.</w:t>
-      </w:r>
-    </w:p>
-    <w:p>
-      <w:pPr>
-        <w:spacing w:after="160" w:line="276"/>
-        <w:ind w:left="720" w:hanging="576"/>
-      </w:pPr>
-      <w:r>
-        <w:rPr>
-          <w:b/>
-          <w:bCs/>
-        </w:rPr>
-        <w:t xml:space="preserve">"The Policy" </w:t>
-      </w:r>
-      <w:r>
-        <w:t>means homeowner’s Policy 98055-49-65 (shown on Defendant’s correspondence as 0980554965), including all endorsements, in force on July 13, 2024.</w:t>
-      </w:r>
-    </w:p>
-    <w:p>
-      <w:pPr>
-        <w:spacing w:after="160" w:line="276"/>
-        <w:ind w:left="720" w:hanging="576"/>
-      </w:pPr>
-      <w:r>
-        <w:rPr>
-          <w:b/>
-          <w:bCs/>
-        </w:rPr>
-        <w:t xml:space="preserve">"The Property" </w:t>
-      </w:r>
-      <w:r>
-        <w:t>means the insured dwelling at 17756 George Moran Dr., Eden Prairie, Minnesota 55347.</w:t>
-      </w:r>
-    </w:p>
-    <w:p>
-      <w:pPr>
-        <w:spacing w:after="160" w:line="276"/>
-        <w:ind w:left="720" w:hanging="576"/>
-      </w:pPr>
-      <w:r>
-        <w:rPr>
-          <w:b/>
-          <w:bCs/>
-        </w:rPr>
-        <w:t xml:space="preserve">"The Prieve Report" </w:t>
-      </w:r>
-      <w:r>
-        <w:t>means the seven-page report of Prieve Engineering, LLC titled "Evaluation of Condition of Windows as Relates to Hail," File Number 241008, report date November 4, 2024, as transmitted with Your November 4, 2024 letter to Plaintiffs.</w:t>
-      </w:r>
-    </w:p>
-    <w:p>
-      <w:pPr>
-        <w:spacing w:after="160" w:line="276"/>
-        <w:ind w:left="720" w:hanging="576"/>
-      </w:pPr>
-      <w:r>
-        <w:rPr>
-          <w:b/>
-          <w:bCs/>
-        </w:rPr>
-        <w:t xml:space="preserve">"Photo Appendix A" </w:t>
-      </w:r>
-      <w:r>
-        <w:t>means the 110-page photographic appendix to The Prieve Report, titled "PHOTO APPENDIX A" and bearing File Number 241008 and site visit date October 9, 2024, containing photographs numbered A-1 through A-217.</w:t>
-      </w:r>
-    </w:p>
-    <w:p>
-      <w:pPr>
-        <w:spacing w:after="160" w:line="276"/>
-        <w:ind w:left="720" w:hanging="576"/>
-      </w:pPr>
-      <w:r>
-        <w:rPr>
-          <w:b/>
-          <w:bCs/>
-        </w:rPr>
-        <w:t xml:space="preserve">"The Appraisal Award" </w:t>
-      </w:r>
-      <w:r>
-        <w:t>means the written appraisal award concerning The Claim dated on or about September 12, 2025.</w:t>
-      </w:r>
-    </w:p>
-    <w:p>
-      <w:pPr>
-        <w:spacing w:after="160" w:line="276"/>
-        <w:ind w:left="720" w:hanging="576"/>
-      </w:pPr>
-      <w:r>
-        <w:rPr>
-          <w:b/>
-          <w:bCs/>
-        </w:rPr>
-        <w:t xml:space="preserve">"Document" and "Documents" </w:t>
-      </w:r>
-      <w:r>
-        <w:t>have the broadest meaning permitted by Minn. R. Civ. P. 34.01 and include all writings, drawings, graphs, charts, photographs, sound and video recordings, images, and other data or data compilations — including electronically stored information ("ESI") — stored in any medium from which information can be obtained, together with all metadata and all non-identical drafts and copies.</w:t>
-      </w:r>
-    </w:p>
-    <w:p>
-      <w:pPr>
-        <w:spacing w:after="160" w:line="276"/>
-        <w:ind w:left="720" w:hanging="576"/>
-      </w:pPr>
-      <w:r>
-        <w:rPr>
-          <w:b/>
-          <w:bCs/>
-        </w:rPr>
-        <w:t xml:space="preserve">"Communication" </w:t>
-      </w:r>
-      <w:r>
-        <w:t>means any transmission or exchange of information of any kind, whether oral, written, or electronic, including email, text message, voicemail, letter, memorandum, and claim-system note.</w:t>
-      </w:r>
-    </w:p>
-    <w:p>
-      <w:pPr>
-        <w:spacing w:after="160" w:line="276"/>
-        <w:ind w:left="720" w:hanging="576"/>
-      </w:pPr>
-      <w:r>
-        <w:rPr>
-          <w:b/>
-          <w:bCs/>
-        </w:rPr>
-        <w:t xml:space="preserve">"Person" and "person" </w:t>
-      </w:r>
-      <w:r>
-        <w:t>mean any natural person or group of natural persons, and any business, legal, or governmental entity of any form, whether or not incorporated, including any corporation, partnership, limited liability company, association, reciprocal or interinsurance exchange, attorney-in-fact, trust, or joint venture.</w:t>
-      </w:r>
-    </w:p>
-    <w:p>
-      <w:pPr>
-        <w:spacing w:after="160" w:line="276"/>
-        <w:ind w:left="720" w:hanging="576"/>
-      </w:pPr>
-      <w:r>
-        <w:rPr>
-          <w:b/>
-          <w:bCs/>
-        </w:rPr>
-        <w:t xml:space="preserve">"Identify" </w:t>
-      </w:r>
-      <w:r>
-        <w:t>when used with respect to a person, means to state the person’s full name, last known title or role, employer, and last known business address, telephone number, and email address; when used with respect to a document, means to state its type, date, author(s), recipient(s), general subject matter, and present custodian.</w:t>
-      </w:r>
-    </w:p>
-    <w:p>
-      <w:pPr>
-        <w:spacing w:after="160" w:line="276"/>
-        <w:ind w:left="720" w:hanging="576"/>
-      </w:pPr>
-      <w:r>
-        <w:rPr>
-          <w:b/>
-          <w:bCs/>
-        </w:rPr>
-        <w:t xml:space="preserve">"Relating to," "concerning," and "regarding" </w:t>
-      </w:r>
-      <w:r>
-        <w:t>mean referring to, describing, evidencing, constituting, reflecting, or in any way logically or factually connected with the subject matter of the request.</w:t>
+        <w:t>Definitions</w:t>
+      </w:r>
+    </w:p>
+    <w:p>
+      <w:pPr>
+        <w:spacing w:after="160" w:line="276"/>
+        <w:ind w:left="720" w:hanging="576"/>
+      </w:pPr>
+      <w:r>
+        <w:rPr>
+          <w:b/>
+          <w:bCs/>
+        </w:rPr>
+        <w:t>"Defendant," "Farmers," "FIE," "You," and "Your"</w:t>
+      </w:r>
+      <w:r>
+        <w:rPr>
+          <w:bCs/>
+        </w:rPr>
+        <w:t xml:space="preserve"> mean Fire Insurance Exchange, its attorney-in-fact Fire Underwriters Association (and, to the extent it acted as attorney-in-fact in connection with The Policy, Farmers Underwriters Association), and each of their present and former agents, adjusters, employees, representatives, attorneys, third-party administrators, and any other person acting or purporting to act on their behalf.</w:t>
+      </w:r>
+    </w:p>
+    <w:p>
+      <w:pPr>
+        <w:spacing w:after="160" w:line="276"/>
+        <w:ind w:left="720" w:hanging="576"/>
+      </w:pPr>
+      <w:r>
+        <w:rPr>
+          <w:b/>
+          <w:bCs/>
+        </w:rPr>
+        <w:t>"Fire Insurance Exchange"</w:t>
+      </w:r>
+      <w:r>
+        <w:rPr>
+          <w:bCs/>
+        </w:rPr>
+        <w:t xml:space="preserve"> means that entity only when used alone and spelled in full, and does not include its attorney-in-fact, any affiliate, or any other person within the preceding definition.</w:t>
+      </w:r>
+    </w:p>
+    <w:p>
+      <w:pPr>
+        <w:spacing w:after="160" w:line="276"/>
+        <w:ind w:left="720" w:hanging="576"/>
+      </w:pPr>
+      <w:r>
+        <w:rPr>
+          <w:b/>
+          <w:bCs/>
+        </w:rPr>
+        <w:t>"Plaintiffs"</w:t>
+      </w:r>
+      <w:r>
+        <w:rPr>
+          <w:bCs/>
+        </w:rPr>
+        <w:t xml:space="preserve"> means Yibiao Lu and Jie Hu.</w:t>
+      </w:r>
+    </w:p>
+    <w:p>
+      <w:pPr>
+        <w:spacing w:after="160" w:line="276"/>
+        <w:ind w:left="720" w:hanging="576"/>
+      </w:pPr>
+      <w:r>
+        <w:rPr>
+          <w:b/>
+          <w:bCs/>
+        </w:rPr>
+        <w:t>"The Claim"</w:t>
+      </w:r>
+      <w:r>
+        <w:rPr>
+          <w:bCs/>
+        </w:rPr>
+        <w:t xml:space="preserve"> means Farmers claim number 7007986837-1-1, date of loss July 13, 2024.</w:t>
+      </w:r>
+    </w:p>
+    <w:p>
+      <w:pPr>
+        <w:spacing w:after="160" w:line="276"/>
+        <w:ind w:left="720" w:hanging="576"/>
+      </w:pPr>
+      <w:r>
+        <w:rPr>
+          <w:b/>
+          <w:bCs/>
+        </w:rPr>
+        <w:t>"The 2020 Claim"</w:t>
+      </w:r>
+      <w:r>
+        <w:rPr>
+          <w:bCs/>
+        </w:rPr>
+        <w:t xml:space="preserve"> means Farmers claim number 3013539499-1.</w:t>
+      </w:r>
+    </w:p>
+    <w:p>
+      <w:pPr>
+        <w:spacing w:after="160" w:line="276"/>
+        <w:ind w:left="720" w:hanging="576"/>
+      </w:pPr>
+      <w:r>
+        <w:rPr>
+          <w:b/>
+          <w:bCs/>
+        </w:rPr>
+        <w:t>"The February 18, 2022 Settlement Package"</w:t>
+      </w:r>
+      <w:r>
+        <w:rPr>
+          <w:bCs/>
+        </w:rPr>
+        <w:t xml:space="preserve"> means the 11-page document dated February 18, 2022 that You provided to Plaintiff Yibiao Lu concerning The 2020 Claim, consisting of Your two-page letter captioned "Settlement Notice," the one-page "BUILDING LOSS WORKSHEET" headed "This is a complete recap of your claim," and the eight-page estimate that follows, identified on its face as Estimate "YIBIAO_LU2," bearing "Claim Number: 3013539499-1-1" and setting out numbered line items 1 through 32.</w:t>
+      </w:r>
+    </w:p>
+    <w:p>
+      <w:pPr>
+        <w:spacing w:after="160" w:line="276"/>
+        <w:ind w:left="720" w:hanging="576"/>
+      </w:pPr>
+      <w:r>
+        <w:rPr>
+          <w:b/>
+          <w:bCs/>
+        </w:rPr>
+        <w:t>"The Policy"</w:t>
+      </w:r>
+      <w:r>
+        <w:rPr>
+          <w:bCs/>
+        </w:rPr>
+        <w:t xml:space="preserve"> means homeowner’s Policy 98055-49-65 (shown on Defendant’s correspondence as 0980554965), including all endorsements, in force on July 13, 2024.</w:t>
+      </w:r>
+    </w:p>
+    <w:p>
+      <w:pPr>
+        <w:spacing w:after="160" w:line="276"/>
+        <w:ind w:left="720" w:hanging="576"/>
+      </w:pPr>
+      <w:r>
+        <w:rPr>
+          <w:b/>
+          <w:bCs/>
+        </w:rPr>
+        <w:t>"The Property"</w:t>
+      </w:r>
+      <w:r>
+        <w:rPr>
+          <w:bCs/>
+        </w:rPr>
+        <w:t xml:space="preserve"> means the insured dwelling at 17756 George Moran Dr., Eden Prairie, Minnesota 55347.</w:t>
+      </w:r>
+    </w:p>
+    <w:p>
+      <w:pPr>
+        <w:spacing w:after="160" w:line="276"/>
+        <w:ind w:left="720" w:hanging="576"/>
+      </w:pPr>
+      <w:r>
+        <w:rPr>
+          <w:b/>
+          <w:bCs/>
+        </w:rPr>
+        <w:t>"The November 4, 2024 Claim Outcome Letter"</w:t>
+      </w:r>
+      <w:r>
+        <w:rPr>
+          <w:bCs/>
+        </w:rPr>
+        <w:t xml:space="preserve"> means Your letter to Plaintiffs dated November 4, 2024, captioned "Claim Outcome Letter," signed by Nicholas Brau, Claims Spec Rep Prop, Fire Insurance Exchange, concerning The Claim.</w:t>
+      </w:r>
+    </w:p>
+    <w:p>
+      <w:pPr>
+        <w:spacing w:after="160" w:line="276"/>
+        <w:ind w:left="720" w:hanging="576"/>
+      </w:pPr>
+      <w:r>
+        <w:rPr>
+          <w:b/>
+          <w:bCs/>
+        </w:rPr>
+        <w:t>"The Prieve Report"</w:t>
+      </w:r>
+      <w:r>
+        <w:rPr>
+          <w:bCs/>
+        </w:rPr>
+        <w:t xml:space="preserve"> means the seven-page report of Prieve Engineering, LLC titled "Evaluation of Condition of Windows as Relates to Hail," File Number 241008, report date November 4, 2024, as transmitted with The November 4, 2024 Claim Outcome Letter.</w:t>
+      </w:r>
+    </w:p>
+    <w:p>
+      <w:pPr>
+        <w:spacing w:after="160" w:line="276"/>
+        <w:ind w:left="720" w:hanging="576"/>
+      </w:pPr>
+      <w:r>
+        <w:rPr>
+          <w:b/>
+          <w:bCs/>
+        </w:rPr>
+        <w:t>"Photo Appendix A"</w:t>
+      </w:r>
+      <w:r>
+        <w:rPr>
+          <w:bCs/>
+        </w:rPr>
+        <w:t xml:space="preserve"> means the 110-page photographic appendix to The Prieve Report, titled "PHOTO APPENDIX A" and bearing File Number 241008 and site visit date October 9, 2024, containing photographs numbered A-1 through A-217.</w:t>
+      </w:r>
+    </w:p>
+    <w:p>
+      <w:pPr>
+        <w:spacing w:after="160" w:line="276"/>
+        <w:ind w:left="720" w:hanging="576"/>
+      </w:pPr>
+      <w:r>
+        <w:rPr>
+          <w:b/>
+          <w:bCs/>
+        </w:rPr>
+        <w:t>"The Coverage Outcome Attachment"</w:t>
+      </w:r>
+      <w:r>
+        <w:rPr>
+          <w:bCs/>
+        </w:rPr>
+        <w:t xml:space="preserve"> means the document titled "Coverage Outcome – Policy Provisions" transmitted with The November 4, 2024 Claim Outcome Letter.</w:t>
+      </w:r>
+    </w:p>
+    <w:p>
+      <w:pPr>
+        <w:spacing w:after="160" w:line="276"/>
+        <w:ind w:left="720" w:hanging="576"/>
+      </w:pPr>
+      <w:r>
+        <w:rPr>
+          <w:b/>
+          <w:bCs/>
+        </w:rPr>
+        <w:t>"The Appraisal Award"</w:t>
+      </w:r>
+      <w:r>
+        <w:rPr>
+          <w:bCs/>
+        </w:rPr>
+        <w:t xml:space="preserve"> means the written appraisal award concerning The Claim dated on or about September 12, 2025.</w:t>
+      </w:r>
+    </w:p>
+    <w:p>
+      <w:pPr>
+        <w:spacing w:after="160" w:line="276"/>
+        <w:ind w:left="720" w:hanging="576"/>
+      </w:pPr>
+      <w:r>
+        <w:rPr>
+          <w:b/>
+          <w:bCs/>
+        </w:rPr>
+        <w:t>"Document" and "Documents"</w:t>
+      </w:r>
+      <w:r>
+        <w:rPr>
+          <w:bCs/>
+        </w:rPr>
+        <w:t xml:space="preserve"> have the broadest meaning permitted by Minn. R. Civ. P. 34.01 and include all writings, drawings, graphs, charts, photographs, sound and video recordings, images, and other data or data compilations — including electronically stored information ("ESI") — stored in any medium from which information can be obtained, together with all metadata and all non-identical drafts and copies.</w:t>
+      </w:r>
+    </w:p>
+    <w:p>
+      <w:pPr>
+        <w:spacing w:after="160" w:line="276"/>
+        <w:ind w:left="720" w:hanging="576"/>
+      </w:pPr>
+      <w:r>
+        <w:rPr>
+          <w:b/>
+          <w:bCs/>
+        </w:rPr>
+        <w:t>"Communication"</w:t>
+      </w:r>
+      <w:r>
+        <w:rPr>
+          <w:bCs/>
+        </w:rPr>
+        <w:t xml:space="preserve"> means any transmission or exchange of information of any kind, whether oral, written, or electronic, including email, text message, voicemail, letter, memorandum, and claim-system note.</w:t>
+      </w:r>
+    </w:p>
+    <w:p>
+      <w:pPr>
+        <w:spacing w:after="160" w:line="276"/>
+        <w:ind w:left="720" w:hanging="576"/>
+      </w:pPr>
+      <w:r>
+        <w:rPr>
+          <w:b/>
+          <w:bCs/>
+        </w:rPr>
+        <w:t>"Person" and "person"</w:t>
+      </w:r>
+      <w:r>
+        <w:rPr>
+          <w:bCs/>
+        </w:rPr>
+        <w:t xml:space="preserve"> mean any natural person or group of natural persons, and any business, legal, or governmental entity of any form, whether or not incorporated, including any corporation, partnership, limited liability company, association, reciprocal or interinsurance exchange, attorney-in-fact, trust, or joint venture.</w:t>
+      </w:r>
+    </w:p>
+    <w:p>
+      <w:pPr>
+        <w:spacing w:after="160" w:line="276"/>
+        <w:ind w:left="720" w:hanging="576"/>
+      </w:pPr>
+      <w:r>
+        <w:rPr>
+          <w:b/>
+          <w:bCs/>
+        </w:rPr>
+        <w:t>"Identify"</w:t>
+      </w:r>
+      <w:r>
+        <w:rPr>
+          <w:bCs/>
+        </w:rPr>
+        <w:t xml:space="preserve"> when used with respect to a person, means to state the person’s full name, last known title or role, employer, and last known business address, telephone number, and email address; when used with respect to a document, means to state its type, date, author(s), recipient(s), general subject matter, and present custodian.</w:t>
+      </w:r>
+    </w:p>
+    <w:p>
+      <w:pPr>
+        <w:spacing w:after="160" w:line="276"/>
+        <w:ind w:left="720" w:hanging="576"/>
+      </w:pPr>
+      <w:r>
+        <w:rPr>
+          <w:b/>
+          <w:bCs/>
+        </w:rPr>
+        <w:t>"Relating to," "concerning," and "regarding"</w:t>
+      </w:r>
+      <w:r>
+        <w:rPr>
+          <w:bCs/>
+        </w:rPr>
+        <w:t xml:space="preserve"> mean referring to, describing, evidencing, constituting, reflecting, or in any way logically or factually connected with the subject matter of the request.</w:t>
       </w:r>
     </w:p>
     <w:p>
@@ -573,23 +659,20 @@
           <w:bCs/>
           <w:caps/>
         </w:rPr>
-        <w:t xml:space="preserve">Instructions</w:t>
-      </w:r>
-    </w:p>
-    <w:p>
-      <w:pPr>
-        <w:spacing w:after="160" w:line="276"/>
-        <w:ind w:left="720" w:hanging="576"/>
-      </w:pPr>
-      <w:r>
-        <w:rPr>
-          <w:b/>
+        <w:t>Instructions</w:t>
+      </w:r>
+    </w:p>
+    <w:p>
+      <w:pPr>
+        <w:spacing w:after="160" w:line="276"/>
+        <w:ind w:left="720" w:hanging="576"/>
+      </w:pPr>
+      <w:r>
+        <w:rPr>
           <w:bCs/>
         </w:rPr>
         <w:t>1.</w:t>
         <w:tab/>
-      </w:r>
-      <w:r>
         <w:t>Time period. Unless a particular interrogatory specifies otherwise, each interrogatory covers the period January 1, 2020 through the present, except that as to The Policy, its issuance and underwriting, and all claims made at The Property before The Claim, each interrogatory covers the period October 22, 2014 through the present.</w:t>
       </w:r>
     </w:p>
@@ -600,13 +683,10 @@
       </w:pPr>
       <w:r>
         <w:rPr>
-          <w:b/>
           <w:bCs/>
         </w:rPr>
         <w:t>2.</w:t>
         <w:tab/>
-      </w:r>
-      <w:r>
         <w:t>Manner of answer. Each interrogatory must be answered separately and fully, in writing, and signed under oath or penalty of perjury by an officer or managing agent of Defendant, who must furnish the information available to Defendant. A declaration signed under penalty of perjury must be in the form Minn. Stat. § 358.116 requires. Restate each interrogatory immediately preceding its answer. Minn. R. Civ. P. 33.01(d).</w:t>
       </w:r>
     </w:p>
@@ -617,13 +697,10 @@
       </w:pPr>
       <w:r>
         <w:rPr>
-          <w:b/>
           <w:bCs/>
         </w:rPr>
         <w:t>3.</w:t>
         <w:tab/>
-      </w:r>
-      <w:r>
         <w:t>Continuing duty. These interrogatories are continuing. You must supplement or correct Your answers in a timely manner as Minn. R. Civ. P. 26.05 requires. If any answer is based on an incomplete search or review, state so expressly in that answer, identify what remains to be searched, and serve Your supplemental answer promptly upon completion.</w:t>
       </w:r>
     </w:p>
@@ -634,13 +711,10 @@
       </w:pPr>
       <w:r>
         <w:rPr>
-          <w:b/>
           <w:bCs/>
         </w:rPr>
         <w:t>4.</w:t>
         <w:tab/>
-      </w:r>
-      <w:r>
         <w:t>Privilege. If You withhold any information on a claim of privilege or protection, expressly state the claim and provide a privilege log describing the nature of the withheld material in a manner sufficient to enable Plaintiffs to assess the claim, pursuant to Minn. R. Civ. P. 26.02(f).</w:t>
       </w:r>
     </w:p>
@@ -651,13 +725,10 @@
       </w:pPr>
       <w:r>
         <w:rPr>
-          <w:b/>
           <w:bCs/>
         </w:rPr>
         <w:t>5.</w:t>
         <w:tab/>
-      </w:r>
-      <w:r>
         <w:t>Option to produce records. If You elect to answer any interrogatory by producing business records under Minn. R. Civ. P. 33.03, specify the records to be produced in sufficient detail to permit Plaintiffs to locate and identify them as readily as You could.</w:t>
       </w:r>
     </w:p>
@@ -668,13 +739,10 @@
       </w:pPr>
       <w:r>
         <w:rPr>
-          <w:b/>
           <w:bCs/>
         </w:rPr>
         <w:t>6.</w:t>
         <w:tab/>
-      </w:r>
-      <w:r>
         <w:t>No responsive information. If no information exists responsive to an interrogatory, state so expressly. If responsive information once existed but no longer exists or cannot be located, state that in the answer, identify the information, and state when and how it was lost or destroyed, who authorized or caused that, and who has had custody of it.</w:t>
       </w:r>
     </w:p>
@@ -685,13 +753,10 @@
       </w:pPr>
       <w:r>
         <w:rPr>
-          <w:b/>
           <w:bCs/>
         </w:rPr>
         <w:t>7.</w:t>
         <w:tab/>
-      </w:r>
-      <w:r>
         <w:t>Construction. The words "and" and "or" are both conjunctive and disjunctive; "each" includes "every"; and the singular includes the plural and vice versa, as necessary to bring within the scope of each interrogatory all answers that might otherwise be construed to be outside its scope.</w:t>
       </w:r>
     </w:p>
@@ -702,13 +767,10 @@
       </w:pPr>
       <w:r>
         <w:rPr>
-          <w:b/>
           <w:bCs/>
         </w:rPr>
         <w:t>8.</w:t>
         <w:tab/>
-      </w:r>
-      <w:r>
         <w:t>Attorney-client communications and litigation counsel. No interrogatory seeks information protected by the attorney-client privilege or by Minn. R. Civ. P. 26.02(d). Communications solely between You and Your counsel of record in this action, dated on or after July 8, 2026, need not be described or logged. This paragraph does not excuse the identification or logging of any communication created before that date, including communications created in the handling, investigation, evaluation, or denial of The Claim.</w:t>
       </w:r>
     </w:p>
@@ -719,13 +781,10 @@
       </w:pPr>
       <w:r>
         <w:rPr>
-          <w:b/>
           <w:bCs/>
         </w:rPr>
         <w:t>9.</w:t>
         <w:tab/>
-      </w:r>
-      <w:r>
         <w:t>Partial objections. If You object to any part of an interrogatory, answer the remainder. Each objection must state whether any responsive information is being withheld on the basis of that objection.</w:t>
       </w:r>
     </w:p>
@@ -736,13 +795,10 @@
       </w:pPr>
       <w:r>
         <w:rPr>
-          <w:b/>
           <w:bCs/>
         </w:rPr>
         <w:t>10.</w:t>
         <w:tab/>
-      </w:r>
-      <w:r>
         <w:t>Identification of respondents. With Your answers, identify each person who supplied information used in answering, and the interrogatory or interrogatories to which each such person contributed. This instruction supplements, and does not limit, the obligation under Minn. R. Civ. P. 33.01(d) of the officer or managing agent signing the answers to "furnish such information as is available."</w:t>
       </w:r>
     </w:p>
@@ -753,13 +809,10 @@
       </w:pPr>
       <w:r>
         <w:rPr>
-          <w:b/>
           <w:bCs/>
         </w:rPr>
         <w:t>11.</w:t>
         <w:tab/>
-      </w:r>
-      <w:r>
         <w:t>Dates. A date used to identify a communication, document, or event reflects Plaintiffs’ best information and is approximate. If Your records show a different date for a communication, document, or event otherwise matching the description, answer as to that communication, document, or event and state the date Your records show.</w:t>
       </w:r>
     </w:p>
@@ -770,13 +823,10 @@
       </w:pPr>
       <w:r>
         <w:rPr>
-          <w:b/>
           <w:bCs/>
         </w:rPr>
         <w:t>12.</w:t>
         <w:tab/>
-      </w:r>
-      <w:r>
         <w:t>Answering on behalf of others. If You do not answer on behalf of every person within the definition of "You," state which persons You have excluded, and identify, as to each answer affected, the person who has the information withheld on that basis. Where an interrogatory asks which person or entity performed an act, made a decision, or sent a communication, identify the specific legal entity by name; attributing the act to "Farmers" or "Defendant" collectively is not a complete answer.</w:t>
       </w:r>
     </w:p>
@@ -787,13 +837,10 @@
       </w:pPr>
       <w:r>
         <w:rPr>
-          <w:b/>
           <w:bCs/>
         </w:rPr>
         <w:t>13.</w:t>
         <w:tab/>
-      </w:r>
-      <w:r>
         <w:t>Item-by-item answers. Where an interrogatory asks about each of several windows, items, or persons, answer separately as to each. A single collective answer that does not address each one is not responsive.</w:t>
       </w:r>
     </w:p>
@@ -808,7 +855,7 @@
           <w:bCs/>
           <w:caps/>
         </w:rPr>
-        <w:t xml:space="preserve">Interrogatories</w:t>
+        <w:t>Interrogatories</w:t>
       </w:r>
     </w:p>
     <w:p>
@@ -824,7 +871,10 @@
         <w:t xml:space="preserve">INTERROGATORY NO. 1:  </w:t>
       </w:r>
       <w:r>
-        <w:t>For each window or other component of The Property — including downspouts, gutters, flashing, siding, trim board, doors, and screens — at which The Prieve Report or Photo Appendix A records a dent, mark, scrape, or indentation, other than the windows designated "F1.7" and "B1.2," state the cause and approximate date You attribute to it, the facts supporting that attribution (including, for any condition attributed to a prior claim, that claim’s number and the estimate line item You contend paid for it), any policy exclusion or limitation You contend applies, and any portion of The Appraisal Award You contend determined the question.</w:t>
+        <w:rPr>
+          <w:bCs/>
+        </w:rPr>
+        <w:t>The November 4, 2024 Claim Outcome Letter states, "Our investigation found the condition of the window and components to be from wear/tear as referrenced [sic] in the attached engineer report." For each window and each other component of The Property — including downspouts, gutters, flashing, siding, trim board, doors, and screens — at which The Prieve Report or Photo Appendix A records a dent, mark, scrape, or indentation, state the cause and approximate date You attributed to that condition when You made the decision communicated in that letter; each fact and document You relied on for that attribution, including, for any condition You attributed to a prior claim, that claim’s number and the estimate line item You contend paid for it; and each provision identified in The Coverage Outcome Attachment that You applied to it. Answer separately as to each window and component.</w:t>
       </w:r>
     </w:p>
     <w:p>
@@ -840,7 +890,10 @@
         <w:t xml:space="preserve">INTERROGATORY NO. 2:  </w:t>
       </w:r>
       <w:r>
-        <w:t>State how the scope of Prieve Engineering’s engagement came to be limited to the condition of the windows, identifying when and by whom that scope was set, whether Prieve asked to expand it and with what result, and, if no document records the reason, the reason and each person with knowledge of it.</w:t>
+        <w:rPr>
+          <w:bCs/>
+        </w:rPr>
+        <w:t>For each of line items 1, 2, 3, and 32 of the estimate within The February 18, 2022 Settlement Package, identify, based on all information available to You, the window or sash it covers by location and elevation, and state whether it covers a whole window unit or one or more individual sashes.</w:t>
       </w:r>
     </w:p>
     <w:p>
@@ -856,7 +909,10 @@
         <w:t xml:space="preserve">INTERROGATORY NO. 3:  </w:t>
       </w:r>
       <w:r>
-        <w:t>For each of line items 1, 2, 3, and 32 of the estimate within The February 18, 2022 Settlement Package, identify, based on all information available to You, the window or sash it covers by location and elevation, and state whether it covers a whole window unit or one or more individual sashes.</w:t>
+        <w:rPr>
+          <w:bCs/>
+        </w:rPr>
+        <w:t>State whether Nicholas Brau created any record of his September 6, 2024 inspection of The Property — including handwritten notes, sketches, measurements, photographs, voice memos, and claim-system or portal entries — and for each, its type, date, present location and custodian; and state the basis for Your October 10, 2025 statement that "the file does not contain a report on the requested date," including the search performed, the custodians and systems searched, when, and by whom.</w:t>
       </w:r>
     </w:p>
     <w:p>
@@ -872,7 +928,10 @@
         <w:t xml:space="preserve">INTERROGATORY NO. 4:  </w:t>
       </w:r>
       <w:r>
-        <w:t>State whether Nicholas Brau created any record of his September 6, 2024 inspection of The Property — including handwritten notes, sketches, measurements, photographs, voice memos, and claim-system or portal entries — and for each, its type, date, present location and custodian; and state the basis for Your October 10, 2025 statement that "the file does not contain a report on the requested date," including the search performed, the custodians and systems searched, when, and by whom.</w:t>
+        <w:rPr>
+          <w:bCs/>
+        </w:rPr>
+        <w:t>State the basis for Nicholas Brau’s October 29, 2025 statement that "All the information we can release has already been sent to you," identifying what had been released and when, and which of his observations from the September 6, 2024 inspection that release includes; and state whether You contend that statement is consistent with Your October 10, 2025 statement that "the file does not contain a report on the requested date," and if so, why.</w:t>
       </w:r>
     </w:p>
     <w:p>
@@ -888,7 +947,10 @@
         <w:t xml:space="preserve">INTERROGATORY NO. 5:  </w:t>
       </w:r>
       <w:r>
-        <w:t>State the basis for Nicholas Brau’s October 29, 2025 statement that "All the information we can release has already been sent to you," identifying what had been released and when, and which of his observations from the September 6, 2024 inspection that release includes; and state whether You contend that statement is consistent with Your October 10, 2025 statement that "the file does not contain a report on the requested date," and if so, why.</w:t>
+        <w:rPr>
+          <w:bCs/>
+        </w:rPr>
+        <w:t>For each of Your September 3, 2024 and November 4, 2024 letters to Plaintiffs, state whether any supervisory or quality-control review was performed before the letter issued and, if so, by whom, when, what it consisted of, and what documents it produced; and identify who authorized each letter to be issued.</w:t>
       </w:r>
     </w:p>
     <w:p>
@@ -904,7 +966,10 @@
         <w:t xml:space="preserve">INTERROGATORY NO. 6:  </w:t>
       </w:r>
       <w:r>
-        <w:t>For each of Your September 3, 2024 and November 4, 2024 letters to Plaintiffs, state whether any supervisory or quality-control review was performed before the letter issued and, if so, by whom, when, what it consisted of, and what documents it produced; and identify who authorized each letter to be issued.</w:t>
+        <w:rPr>
+          <w:bCs/>
+        </w:rPr>
+        <w:t>State each fact supporting any contention that The Claim was "resolved or confirmed by arbitration or appraisal" under Minn. Stat. § 604.18, subd. 4(c); and, for each item submitted to or addressed in the appraisal — including "Windows F1.7 B1.2," "Siding &amp; Paint," "Debris," and each item in Plaintiffs’ August 3, 2025 appraisal demand — state whether You contend The Appraisal Award determined its actual value and loss, with the document supporting that contention.</w:t>
       </w:r>
     </w:p>
     <w:p>
@@ -920,7 +985,10 @@
         <w:t xml:space="preserve">INTERROGATORY NO. 7:  </w:t>
       </w:r>
       <w:r>
-        <w:t>State each fact supporting any contention that The Claim was "resolved or confirmed by arbitration or appraisal" under Minn. Stat. § 604.18, subd. 4(c); and, for each item submitted to or addressed in the appraisal — including "Windows F1.7 B1.2," "Siding &amp; Paint," "Debris," and each item in Plaintiffs’ August 3, 2025 appraisal demand — state whether You contend The Appraisal Award determined its actual value and loss, with the document supporting that contention.</w:t>
+        <w:rPr>
+          <w:bCs/>
+        </w:rPr>
+        <w:t>Describe what You did with the Hancock Claims Consultants and Prieve Engineering reports before relying on them in The Claim, identifying each person involved, what each did, and each document created; and state whether any written policy or procedure applied to those steps and, if so, identify it.</w:t>
       </w:r>
     </w:p>
     <w:p>
@@ -936,7 +1004,10 @@
         <w:t xml:space="preserve">INTERROGATORY NO. 8:  </w:t>
       </w:r>
       <w:r>
-        <w:t>Describe what You did with the Hancock Claims Consultants and Prieve Engineering reports before relying on them in The Claim, identifying each person involved, what each did, and each document created; and state whether any written policy or procedure applied to those steps and, if so, identify it.</w:t>
+        <w:rPr>
+          <w:bCs/>
+        </w:rPr>
+        <w:t>State each fact supporting Your First Affirmative Defense, which alleges that "pursuant to Rule 12, Minn. R. Civ. P., there exists a lack of jurisdiction over Defendant FIE and Plaintiffs have failed to state a claim upon which relief can be granted," and identify each count of the Complaint to which the failure-to-state allegation is directed; and, if You contend that any person should be a defendant in this action in place of or in addition to Fire Insurance Exchange, or that Fire Insurance Exchange is misnamed or misdescribed in the caption, identify that person by legal name, form, and state of organization.</w:t>
       </w:r>
     </w:p>
     <w:p>
@@ -952,7 +1023,10 @@
         <w:t xml:space="preserve">INTERROGATORY NO. 9:  </w:t>
       </w:r>
       <w:r>
-        <w:t>State each fact supporting Your First Affirmative Defense, which alleges that "pursuant to Rule 12, Minn. R. Civ. P., there exists a lack of jurisdiction over Defendant FIE and Plaintiffs have failed to state a claim upon which relief can be granted," and identify each count of the Complaint to which the failure-to-state allegation is directed; and, if You contend that any person should be a defendant in this action in place of or in addition to Fire Insurance Exchange, or that Fire Insurance Exchange is misnamed or misdescribed in the caption, identify that person by legal name, form, and state of organization.</w:t>
+        <w:rPr>
+          <w:bCs/>
+        </w:rPr>
+        <w:t>Identify each person known to You to have knowledge of the facts concerning The Claim, The 2020 Claim, any inspection of The Property, the appraisal, or Your denial decisions, and state the subject matter of each person’s knowledge.</w:t>
       </w:r>
     </w:p>
     <w:p>
@@ -968,7 +1042,10 @@
         <w:t xml:space="preserve">INTERROGATORY NO. 10:  </w:t>
       </w:r>
       <w:r>
-        <w:t>Identify each person known to You to have knowledge of the facts concerning The Claim, The 2020 Claim, any inspection of The Property, the appraisal, or Your denial decisions, and state the subject matter of each person’s knowledge.</w:t>
+        <w:rPr>
+          <w:bCs/>
+        </w:rPr>
+        <w:t>Identify each document or item of information concerning The Claim, The 2020 Claim, or The Property that You contend no longer exists or cannot be located, stating for each its type, date, author, and subject matter, when and how it was lost or destroyed, who authorized or caused that, and who has had custody of it.</w:t>
       </w:r>
     </w:p>
     <w:p>
@@ -984,7 +1061,10 @@
         <w:t xml:space="preserve">INTERROGATORY NO. 11:  </w:t>
       </w:r>
       <w:r>
-        <w:t>Identify each document or item of information concerning The Claim, The 2020 Claim, or The Property that You contend no longer exists or cannot be located, stating for each its type, date, author, and subject matter, when and how it was lost or destroyed, who authorized or caused that, and who has had custody of it.</w:t>
+        <w:rPr>
+          <w:bCs/>
+        </w:rPr>
+        <w:t>For each of Plaintiffs’ submissions of January 31, 2025 (post-2020 storm activity and gutter replacement), February 10, 2025 (City of Eden Prairie permit records and the neighbor canvass), and May 28, 2025 (National Weather Service and Interactive Hail Maps material, through agent Peter Pietila), state what You did with it, identifying each person involved, when, the conclusion reached, each document recording it, and whether it was considered in any decision on The Claim; if nothing was done, state why.</w:t>
       </w:r>
     </w:p>
     <w:p>
@@ -1000,7 +1080,10 @@
         <w:t xml:space="preserve">INTERROGATORY NO. 12:  </w:t>
       </w:r>
       <w:r>
-        <w:t>For each of Plaintiffs’ submissions of January 31, 2025 (post-2020 storm activity and gutter replacement), February 10, 2025 (City of Eden Prairie permit records and the neighbor canvass), and May 28, 2025 (National Weather Service and Interactive Hail Maps material, through agent Peter Pietila), state what You did with it, identifying each person involved, when, the conclusion reached, each document recording it, and whether it was considered in any decision on The Claim; if nothing was done, state why.</w:t>
+        <w:rPr>
+          <w:bCs/>
+        </w:rPr>
+        <w:t>As to the allegation in Your answer to paragraph 14 of the Complaint that Plaintiffs "attempted to direct the claim-handling process by adamantly advising Hancock Claims Consultants that the only thing that needed to be inspected was the windows on the inside where they were leaking," state who made and who received the statement, when and how, and identify each document recording it and the person who first recorded it; state whether Hancock’s August 29, 2024 inspection was limited as a result and, if so, what was not inspected; and state whether You contend the statement was a basis for Your September 3, 2024 statement that "[t]here were no other damages observed."</w:t>
       </w:r>
     </w:p>
     <w:p>
@@ -1016,7 +1099,10 @@
         <w:t xml:space="preserve">INTERROGATORY NO. 13:  </w:t>
       </w:r>
       <w:r>
-        <w:t>As to the allegation in Your answer to paragraph 14 of the Complaint that Plaintiffs "attempted to direct the claim-handling process by adamantly advising Hancock Claims Consultants that the only thing that needed to be inspected was the windows on the inside where they were leaking," state who made and who received the statement, when and how, and identify each document recording it and the person who first recorded it; state whether Hancock’s August 29, 2024 inspection was limited as a result and, if so, what was not inspected; and state whether You contend the statement was a basis for Your September 3, 2024 statement that "[t]here were no other damages observed."</w:t>
+        <w:rPr>
+          <w:bCs/>
+        </w:rPr>
+        <w:t>State the date You contend You first anticipated litigation concerning The Claim, identifying who made that determination and what prompted it; and state the date any litigation hold or preservation instruction concerning The Claim was issued, and to whom it was directed.</w:t>
       </w:r>
     </w:p>
     <w:p>
@@ -1032,7 +1118,10 @@
         <w:t xml:space="preserve">INTERROGATORY NO. 14:  </w:t>
       </w:r>
       <w:r>
-        <w:t>State the date You contend You first anticipated litigation concerning The Claim, identifying who made that determination and what prompted it; and state the date any litigation hold or preservation instruction concerning The Claim was issued, and to whom it was directed.</w:t>
+        <w:rPr>
+          <w:bCs/>
+        </w:rPr>
+        <w:t>Your answer to paragraph 33 of the Complaint denies "that the Appraisal Award does not state actual value and loss separately to each item." For each item, identify the actual value and the loss You contend the award states and where on the award each appears; and identify any item other than the windows designated "F1.7" and "B1.2" for which You contend the award states a value or loss.</w:t>
       </w:r>
     </w:p>
     <w:p>
@@ -1048,22 +1137,9 @@
         <w:t xml:space="preserve">INTERROGATORY NO. 15:  </w:t>
       </w:r>
       <w:r>
-        <w:t>Your answer to paragraph 33 of the Complaint denies "that the Appraisal Award does not state actual value and loss separately to each item." For each item, identify the actual value and the loss You contend the award states and where on the award each appears; and identify any item other than the windows designated "F1.7" and "B1.2" for which You contend the award states a value or loss.</w:t>
-      </w:r>
-    </w:p>
-    <w:p>
-      <w:pPr>
-        <w:spacing w:after="160" w:line="276"/>
-        <w:ind w:left="720" w:hanging="576"/>
-      </w:pPr>
-      <w:r>
-        <w:rPr>
-          <w:b/>
-          <w:bCs/>
-        </w:rPr>
-        <w:t xml:space="preserve">INTERROGATORY NO. 16:  </w:t>
-      </w:r>
-      <w:r>
+        <w:rPr>
+          <w:bCs/>
+        </w:rPr>
         <w:t>Identify the legal entity that employed or engaged each person who acted for You in handling The Claim, including Christian Dudley, Nicholas Brau, and Bradlee Monson, at the time of that person’s involvement. This interrogatory does not seek compensation, performance, or disciplinary information.</w:t>
       </w:r>
     </w:p>

</xml_diff>

<commit_message>
Not review related. Some material for initial disclosure
</commit_message>
<xml_diff>
--- a/Filings/Discovery/FirstSetDiscovey/Interrogatories/Plaintiffs_First_Set_of_Interrogatories_to_FIE.docx
+++ b/Filings/Discovery/FirstSetDiscovey/Interrogatories/Plaintiffs_First_Set_of_Interrogatories_to_FIE.docx
@@ -487,6 +487,25 @@
           <w:b/>
           <w:bCs/>
         </w:rPr>
+        <w:t>"The Denial Letters"</w:t>
+      </w:r>
+      <w:r>
+        <w:rPr>
+          <w:bCs/>
+        </w:rPr>
+        <w:t xml:space="preserve"> means Your September 3, 2024 letter to Plaintiffs captioned "Claim Outcome Letter" and The November 4, 2024 Claim Outcome Letter.</w:t>
+      </w:r>
+    </w:p>
+    <w:p>
+      <w:pPr>
+        <w:spacing w:after="160" w:line="276"/>
+        <w:ind w:left="720" w:hanging="576"/>
+      </w:pPr>
+      <w:r>
+        <w:rPr>
+          <w:b/>
+          <w:bCs/>
+        </w:rPr>
         <w:t>"The Prieve Report"</w:t>
       </w:r>
       <w:r>
@@ -544,6 +563,25 @@
           <w:b/>
           <w:bCs/>
         </w:rPr>
+        <w:t>"The Vendors"</w:t>
+      </w:r>
+      <w:r>
+        <w:rPr>
+          <w:bCs/>
+        </w:rPr>
+        <w:t xml:space="preserve"> means Hancock Claims Consultants, Prieve Engineering, LLC, and any other person You engaged to inspect, evaluate, test, or report on The Property, The Claim, or The 2020 Claim.</w:t>
+      </w:r>
+    </w:p>
+    <w:p>
+      <w:pPr>
+        <w:spacing w:after="160" w:line="276"/>
+        <w:ind w:left="720" w:hanging="576"/>
+      </w:pPr>
+      <w:r>
+        <w:rPr>
+          <w:b/>
+          <w:bCs/>
+        </w:rPr>
         <w:t>"The Appraisal Award"</w:t>
       </w:r>
       <w:r>
@@ -563,6 +601,63 @@
           <w:b/>
           <w:bCs/>
         </w:rPr>
+        <w:t>"The Appraisal Demand"</w:t>
+      </w:r>
+      <w:r>
+        <w:rPr>
+          <w:bCs/>
+        </w:rPr>
+        <w:t xml:space="preserve"> means Plaintiffs' Demand for Appraisal concerning The Claim, dated August 3, 2025.</w:t>
+      </w:r>
+    </w:p>
+    <w:p>
+      <w:pPr>
+        <w:spacing w:after="160" w:line="276"/>
+        <w:ind w:left="720" w:hanging="576"/>
+      </w:pPr>
+      <w:r>
+        <w:rPr>
+          <w:b/>
+          <w:bCs/>
+        </w:rPr>
+        <w:t>"The Appraisal"</w:t>
+      </w:r>
+      <w:r>
+        <w:rPr>
+          <w:bCs/>
+        </w:rPr>
+        <w:t xml:space="preserve"> means the appraisal proceeding concerning The Claim commenced by The Appraisal Demand and concluded by The Appraisal Award, including the appraisers John Foster and Greg Tomes and the umpire Wade Roos.</w:t>
+      </w:r>
+    </w:p>
+    <w:p>
+      <w:pPr>
+        <w:spacing w:after="160" w:line="276"/>
+        <w:ind w:left="720" w:hanging="576"/>
+      </w:pPr>
+      <w:r>
+        <w:rPr>
+          <w:b/>
+          <w:bCs/>
+        </w:rPr>
+        <w:t>"Handling,"</w:t>
+      </w:r>
+      <w:r>
+        <w:rPr>
+          <w:bCs/>
+        </w:rPr>
+        <w:t xml:space="preserve"> when used with respect to a claim, means the receipt, investigation, evaluation, adjustment, supervision, quality-control or peer review, appraisal, payment, and denial of that claim, and includes deciding or approving coverage or payment, setting or approving the scope of any engagement of The Vendors, communicating with The Vendors or any appraiser, and searching for or collecting records concerning that claim.</w:t>
+      </w:r>
+    </w:p>
+    <w:p>
+      <w:pPr>
+        <w:spacing w:after="160" w:line="276"/>
+        <w:ind w:left="720" w:hanging="576"/>
+      </w:pPr>
+      <w:r>
+        <w:rPr>
+          <w:b/>
+          <w:bCs/>
+        </w:rPr>
         <w:t>"Document" and "Documents"</w:t>
       </w:r>
       <w:r>
@@ -626,7 +721,7 @@
         <w:rPr>
           <w:bCs/>
         </w:rPr>
-        <w:t xml:space="preserve"> when used with respect to a person, means to state the person’s full name, last known title or role, employer, and last known business address, telephone number, and email address; when used with respect to a document, means to state its type, date, author(s), recipient(s), general subject matter, and present custodian.</w:t>
+        <w:t xml:space="preserve"> when used with respect to a person, means to state the person’s full name, last known title or role, the legal entity that employed or engaged the person at the relevant time, and last known business address, telephone number, and email address, except that for a person presently employed by You it is sufficient to state that person’s name, title, employing entity, and that contact is to be made through Your counsel; when used with respect to a document, means to state its type, date, author(s), recipient(s), general subject matter, and present custodian.</w:t>
       </w:r>
     </w:p>
     <w:p>
@@ -931,7 +1026,7 @@
         <w:rPr>
           <w:bCs/>
         </w:rPr>
-        <w:t>State the basis for Nicholas Brau’s October 29, 2025 statement that "All the information we can release has already been sent to you," identifying what had been released and when, and which of his observations from the September 6, 2024 inspection that release includes; and state whether You contend that statement is consistent with Your October 10, 2025 statement that "the file does not contain a report on the requested date," and if so, why.</w:t>
+        <w:t>For each of The Denial Letters, state whether any supervisory or quality-control review was performed before the letter issued and, if so, by whom, when, what it consisted of, and what documents it produced; and identify who authorized each letter to be issued.</w:t>
       </w:r>
     </w:p>
     <w:p>
@@ -950,7 +1045,7 @@
         <w:rPr>
           <w:bCs/>
         </w:rPr>
-        <w:t>For each of Your September 3, 2024 and November 4, 2024 letters to Plaintiffs, state whether any supervisory or quality-control review was performed before the letter issued and, if so, by whom, when, what it consisted of, and what documents it produced; and identify who authorized each letter to be issued.</w:t>
+        <w:t>Your Answer to paragraph 33 of the Complaint denies Plaintiffs’ allegation that The Appraisal Award does not state actual value and loss separately to each item. For each item listed on The Appraisal Award, and for each item Plaintiffs submitted in The Appraisal Demand, state the actual value and the loss You contend The Appraisal Award states for that item and where on The Appraisal Award each appears; state whether You contend the actual value and loss stated for the item "Windows F1.7 B1.2" were determined separately for each of those two windows and, if so, the amount attributable to each; identify any item other than those two windows for which You contend The Appraisal Award states a value or loss; and state whether You contend The Appraisal Award states separately actual value and loss to each item within the meaning of Minn. Stat. § 65A.01, subd. 3.</w:t>
       </w:r>
     </w:p>
     <w:p>
@@ -969,7 +1064,7 @@
         <w:rPr>
           <w:bCs/>
         </w:rPr>
-        <w:t>State each fact supporting any contention that The Claim was "resolved or confirmed by arbitration or appraisal" under Minn. Stat. § 604.18, subd. 4(c); and, for each item submitted to or addressed in the appraisal — including "Windows F1.7 B1.2," "Siding &amp; Paint," "Debris," and each item in Plaintiffs’ August 3, 2025 appraisal demand — state whether You contend The Appraisal Award determined its actual value and loss, with the document supporting that contention.</w:t>
+        <w:t>Describe what You did with the Hancock Claims Consultants and Prieve Engineering reports before relying on them in The Claim, identifying each person involved, what each did, and each document created; and state whether any written policy or procedure applied to those steps and, if so, identify it.</w:t>
       </w:r>
     </w:p>
     <w:p>
@@ -988,7 +1083,7 @@
         <w:rPr>
           <w:bCs/>
         </w:rPr>
-        <w:t>Describe what You did with the Hancock Claims Consultants and Prieve Engineering reports before relying on them in The Claim, identifying each person involved, what each did, and each document created; and state whether any written policy or procedure applied to those steps and, if so, identify it.</w:t>
+        <w:t>State each fact supporting Your First Affirmative Defense, which alleges that "pursuant to Rule 12, Minn. R. Civ. P., there exists a lack of jurisdiction over Defendant FIE and Plaintiffs have failed to state a claim upon which relief can be granted," and identify each count of the Complaint to which the failure-to-state allegation is directed; and, if You contend that any person should be a defendant in this action in place of or in addition to Fire Insurance Exchange, or that Fire Insurance Exchange is misnamed or misdescribed in the caption, identify that person by legal name, form, and state of organization.</w:t>
       </w:r>
     </w:p>
     <w:p>
@@ -1007,7 +1102,7 @@
         <w:rPr>
           <w:bCs/>
         </w:rPr>
-        <w:t>State each fact supporting Your First Affirmative Defense, which alleges that "pursuant to Rule 12, Minn. R. Civ. P., there exists a lack of jurisdiction over Defendant FIE and Plaintiffs have failed to state a claim upon which relief can be granted," and identify each count of the Complaint to which the failure-to-state allegation is directed; and, if You contend that any person should be a defendant in this action in place of or in addition to Fire Insurance Exchange, or that Fire Insurance Exchange is misnamed or misdescribed in the caption, identify that person by legal name, form, and state of organization.</w:t>
+        <w:t>Identify each person known to You to have knowledge of facts concerning the Handling of The Claim or The 2020 Claim, any inspection of The Property, The Appraisal, or The Denial Letters, whether or not that person is presently employed by You, and state the subject matter of each person’s knowledge and the period of that person’s involvement. This interrogatory is not limited to persons You may use to support Your claims or defenses within the meaning of Minn. R. Civ. P. 26.01(a)(1)(A).</w:t>
       </w:r>
     </w:p>
     <w:p>
@@ -1026,7 +1121,7 @@
         <w:rPr>
           <w:bCs/>
         </w:rPr>
-        <w:t>Identify each person known to You to have knowledge of the facts concerning The Claim, The 2020 Claim, any inspection of The Property, the appraisal, or Your denial decisions, and state the subject matter of each person’s knowledge.</w:t>
+        <w:t>Identify each document or other information concerning The Claim, The 2020 Claim, or The Property — including any record of Nicholas Brau’s September 6, 2024 inspection of The Property — that You contend no longer exists or cannot be located, stating for each its type, date, author, and subject matter, when and how it was lost or destroyed, who authorized or caused that, and who has had custody of it.</w:t>
       </w:r>
     </w:p>
     <w:p>
@@ -1045,7 +1140,7 @@
         <w:rPr>
           <w:bCs/>
         </w:rPr>
-        <w:t>Identify each document or item of information concerning The Claim, The 2020 Claim, or The Property that You contend no longer exists or cannot be located, stating for each its type, date, author, and subject matter, when and how it was lost or destroyed, who authorized or caused that, and who has had custody of it.</w:t>
+        <w:t>For each of Plaintiffs’ submissions of January 31, 2025 (post-2020 storm activity and gutter replacement), February 10, 2025 (City of Eden Prairie permit records and the neighbor canvass), and May 28, 2025 (National Weather Service and Interactive Hail Maps material, through agent Peter Pietila), state what You did with it, identifying each person involved, when, the conclusion reached, each document recording it, and whether it was considered in any decision on The Claim; if nothing was done, state why.</w:t>
       </w:r>
     </w:p>
     <w:p>
@@ -1064,7 +1159,7 @@
         <w:rPr>
           <w:bCs/>
         </w:rPr>
-        <w:t>For each of Plaintiffs’ submissions of January 31, 2025 (post-2020 storm activity and gutter replacement), February 10, 2025 (City of Eden Prairie permit records and the neighbor canvass), and May 28, 2025 (National Weather Service and Interactive Hail Maps material, through agent Peter Pietila), state what You did with it, identifying each person involved, when, the conclusion reached, each document recording it, and whether it was considered in any decision on The Claim; if nothing was done, state why.</w:t>
+        <w:t>As to the allegation in Your answer to paragraph 14 of the Complaint that Plaintiffs "attempted to direct the claim-handling process by adamantly advising Hancock Claims Consultants that the only thing that needed to be inspected was the windows on the inside where they were leaking," state who made and who received the statement, when and how, and identify each document recording it and the person who first recorded it; state whether Hancock’s August 29, 2024 inspection was limited as a result and, if so, what was not inspected; and state whether You contend the statement was a basis for Your September 3, 2024 statement that "[t]here were no other damages observed."</w:t>
       </w:r>
     </w:p>
     <w:p>
@@ -1083,7 +1178,7 @@
         <w:rPr>
           <w:bCs/>
         </w:rPr>
-        <w:t>As to the allegation in Your answer to paragraph 14 of the Complaint that Plaintiffs "attempted to direct the claim-handling process by adamantly advising Hancock Claims Consultants that the only thing that needed to be inspected was the windows on the inside where they were leaking," state who made and who received the statement, when and how, and identify each document recording it and the person who first recorded it; state whether Hancock’s August 29, 2024 inspection was limited as a result and, if so, what was not inspected; and state whether You contend the statement was a basis for Your September 3, 2024 statement that "[t]here were no other damages observed."</w:t>
+        <w:t>State the date You contend You first anticipated litigation concerning The Claim, identifying who made that determination and what prompted it; and state the date any litigation hold or preservation instruction concerning The Claim was issued, and to whom it was directed.</w:t>
       </w:r>
     </w:p>
     <w:p>
@@ -1097,44 +1192,6 @@
           <w:bCs/>
         </w:rPr>
         <w:t xml:space="preserve">INTERROGATORY NO. 13:  </w:t>
-      </w:r>
-      <w:r>
-        <w:rPr>
-          <w:bCs/>
-        </w:rPr>
-        <w:t>State the date You contend You first anticipated litigation concerning The Claim, identifying who made that determination and what prompted it; and state the date any litigation hold or preservation instruction concerning The Claim was issued, and to whom it was directed.</w:t>
-      </w:r>
-    </w:p>
-    <w:p>
-      <w:pPr>
-        <w:spacing w:after="160" w:line="276"/>
-        <w:ind w:left="720" w:hanging="576"/>
-      </w:pPr>
-      <w:r>
-        <w:rPr>
-          <w:b/>
-          <w:bCs/>
-        </w:rPr>
-        <w:t xml:space="preserve">INTERROGATORY NO. 14:  </w:t>
-      </w:r>
-      <w:r>
-        <w:rPr>
-          <w:bCs/>
-        </w:rPr>
-        <w:t>Your answer to paragraph 33 of the Complaint denies "that the Appraisal Award does not state actual value and loss separately to each item." For each item, identify the actual value and the loss You contend the award states and where on the award each appears; and identify any item other than the windows designated "F1.7" and "B1.2" for which You contend the award states a value or loss.</w:t>
-      </w:r>
-    </w:p>
-    <w:p>
-      <w:pPr>
-        <w:spacing w:after="160" w:line="276"/>
-        <w:ind w:left="720" w:hanging="576"/>
-      </w:pPr>
-      <w:r>
-        <w:rPr>
-          <w:b/>
-          <w:bCs/>
-        </w:rPr>
-        <w:t xml:space="preserve">INTERROGATORY NO. 15:  </w:t>
       </w:r>
       <w:r>
         <w:rPr>

</xml_diff>

<commit_message>
Rewrite int. 3; update int. 9 to use the new definition
</commit_message>
<xml_diff>
--- a/Filings/Discovery/FirstSetDiscovey/Interrogatories/Plaintiffs_First_Set_of_Interrogatories_to_FIE.docx
+++ b/Filings/Discovery/FirstSetDiscovey/Interrogatories/Plaintiffs_First_Set_of_Interrogatories_to_FIE.docx
@@ -590,6 +590,44 @@
           <w:b/>
           <w:bCs/>
         </w:rPr>
+        <w:t xml:space="preserve">"The Brau Inspection Records" </w:t>
+      </w:r>
+      <w:r>
+        <w:rPr>
+          <w:bCs/>
+        </w:rPr>
+        <w:t>means every Document recording Nicholas Brau’s September 6, 2024 inspection of The Property, including any report, handwritten notes, sketches, measurements, photographs, voice memos, and claim-system or portal entries.</w:t>
+      </w:r>
+    </w:p>
+    <w:p>
+      <w:pPr>
+        <w:spacing w:after="160" w:line="276" w:lineRule="auto"/>
+        <w:ind w:left="720" w:hanging="576"/>
+      </w:pPr>
+      <w:r>
+        <w:rPr>
+          <w:b/>
+          <w:bCs/>
+        </w:rPr>
+        <w:t xml:space="preserve">"The Inspection-Record Requests" </w:t>
+      </w:r>
+      <w:r>
+        <w:rPr>
+          <w:bCs/>
+        </w:rPr>
+        <w:t>means Plaintiff Yibiao Lu’s electronic mail message of October 7, 2025 to You at myadjuster@farmersinsurance.com requesting "a copy of the inspection report/notes from Nic Brau," and his electronic mail message of October 28, 2025 to Nicholas Brau at nic.brau@farmersinsurance.com requesting "a copy of the notes you took that day."</w:t>
+      </w:r>
+    </w:p>
+    <w:p>
+      <w:pPr>
+        <w:spacing w:after="160" w:line="276" w:lineRule="auto"/>
+        <w:ind w:left="720" w:hanging="576"/>
+      </w:pPr>
+      <w:r>
+        <w:rPr>
+          <w:b/>
+          <w:bCs/>
+        </w:rPr>
         <w:t>"The Coverage Outcome Attachment"</w:t>
       </w:r>
       <w:r>
@@ -1269,7 +1307,7 @@
         <w:rPr>
           <w:bCs/>
         </w:rPr>
-        <w:t>State whether Nicholas Brau created any record of his September 6, 2024 inspection of The Property — including handwritten notes, sketches, measurements, photographs, voice memos, and claim-system or portal entries — and for each, its type, date, present location and custodian; and state the basis for Your October 10, 2025 statement that "the file does not contain a report on the requested date," including the search performed, the custodians and systems searched, when, and by whom.</w:t>
+        <w:t>State what You did in response to The Inspection-Record Requests, including the search performed, the custodians and systems searched, when the search was performed and by whom; each of The Brau Inspection Records that exists or has existed, with its type, date, present location and custodian; and, for any of them not provided to Plaintiffs, the reason it was not provided.</w:t>
       </w:r>
     </w:p>
     <w:p>
@@ -1390,7 +1428,7 @@
         <w:rPr>
           <w:bCs/>
         </w:rPr>
-        <w:t>Identify each document or other information concerning The Claim, The 2020 Claim, or The Property — including any record of Nicholas Brau’s September 6, 2024 inspection of The Property — that You contend no longer exists or cannot be located, stating for each its type, date, author, and subject matter, when and how it was lost or destroyed, who authorized or caused that, and who has had custody of it.</w:t>
+        <w:t>Identify each document or other information concerning The Claim, The 2020 Claim, or The Property — including The Brau Inspection Records — that You contend no longer exists or cannot be located, stating for each its type, date, author, and subject matter, when and how it was lost or destroyed, who authorized or caused that, and who has had custody of it.</w:t>
       </w:r>
     </w:p>
     <w:p>

</xml_diff>

<commit_message>
Updated int. 4 and 5
</commit_message>
<xml_diff>
--- a/Filings/Discovery/FirstSetDiscovey/Interrogatories/Plaintiffs_First_Set_of_Interrogatories_to_FIE.docx
+++ b/Filings/Discovery/FirstSetDiscovey/Interrogatories/Plaintiffs_First_Set_of_Interrogatories_to_FIE.docx
@@ -321,6 +321,27 @@
           <w:b/>
           <w:bCs/>
         </w:rPr>
+        <w:t xml:space="preserve">"The Answer" </w:t>
+      </w:r>
+      <w:r>
+        <w:rPr>
+          <w:bCs/>
+        </w:rPr>
+        <w:t>means Defendant’s Answer to the Complaint, dated and served August 10, 2026.</w:t>
+      </w:r>
+      <w:proofErr w:type="spellStart"/>
+      <w:proofErr w:type="spellEnd"/>
+    </w:p>
+    <w:p>
+      <w:pPr>
+        <w:spacing w:after="160" w:line="276" w:lineRule="auto"/>
+        <w:ind w:left="720" w:hanging="576"/>
+      </w:pPr>
+      <w:r>
+        <w:rPr>
+          <w:b/>
+          <w:bCs/>
+        </w:rPr>
         <w:t>"The Claim"</w:t>
       </w:r>
       <w:r>
@@ -765,6 +786,27 @@
           <w:b/>
           <w:bCs/>
         </w:rPr>
+        <w:t xml:space="preserve">"The Appraisal Items" </w:t>
+      </w:r>
+      <w:r>
+        <w:rPr>
+          <w:bCs/>
+        </w:rPr>
+        <w:t>means each item listed in the item column of The Appraisal Award, each item Plaintiffs submitted in The Appraisal Demand, and any other item for which You contend The Appraisal Award states a value or a loss.</w:t>
+      </w:r>
+      <w:proofErr w:type="spellStart"/>
+      <w:proofErr w:type="spellEnd"/>
+    </w:p>
+    <w:p>
+      <w:pPr>
+        <w:spacing w:after="160" w:line="276" w:lineRule="auto"/>
+        <w:ind w:left="720" w:hanging="576"/>
+      </w:pPr>
+      <w:r>
+        <w:rPr>
+          <w:b/>
+          <w:bCs/>
+        </w:rPr>
         <w:t>"Handling,"</w:t>
       </w:r>
       <w:r>
@@ -1326,14 +1368,12 @@
         <w:rPr>
           <w:bCs/>
         </w:rPr>
-        <w:t xml:space="preserve">For each of The Denial Letters, state whether any supervisory or quality-control review was performed before the letter issued and, if so, by whom, </w:t>
-      </w:r>
-      <w:r>
-        <w:rPr>
-          <w:bCs/>
-        </w:rPr>
-        <w:lastRenderedPageBreak/>
-        <w:t>when, what it consisted of, and what documents it produced; and identify who authorized each letter to be issued.</w:t>
+        <w:t>For each of The Denial Letters, state whether any review of the decision — including any supervisory, quality-control, or peer review — was performed before the letter issued and, if so, by whom, when, what it consisted of, and what documents it produced; and identify who authorized each letter to be issued.</w:t>
+      </w:r>
+      <w:r>
+        <w:rPr>
+          <w:bCs/>
+        </w:rPr>
       </w:r>
     </w:p>
     <w:p>
@@ -1352,7 +1392,7 @@
         <w:rPr>
           <w:bCs/>
         </w:rPr>
-        <w:t>Your Answer to paragraph 33 of the Complaint denies Plaintiffs’ allegation that The Appraisal Award does not state actual value and loss separately to each item. For each item listed on The Appraisal Award, and for each item Plaintiffs submitted in The Appraisal Demand, state the actual value and the loss You contend The Appraisal Award states for that item and where on The Appraisal Award each appears; state whether You contend the actual value and loss stated for the item "Windows F1.7 B1.2" were determined separately for each of those two windows and, if so, the amount attributable to each; identify any item other than those two windows for which You contend The Appraisal Award states a value or loss; and state whether You contend The Appraisal Award states separately actual value and loss to each item within the meaning of Minn. Stat. § 65A.01, subd. 3.</w:t>
+        <w:t>The Answer denies Plaintiffs’ allegation at paragraph 33 of the Complaint that The Appraisal Award does not state actual value and loss separately to each item. For each of The Appraisal Items, state the actual value and the loss You contend The Appraisal Award states and where on The Appraisal Award each appears — including, for the item "Windows F1.7 B1.2," whether those values were determined separately for each of the two windows and the amount attributable to each; and state whether You contend The Appraisal Award states separately actual value and loss to each item within the meaning of Minn. Stat. § 65A.01, subd. 3.</w:t>
       </w:r>
     </w:p>
     <w:p>

</xml_diff>

<commit_message>
Remove attorney registration number from certificate
</commit_message>
<xml_diff>
--- a/Filings/Discovery/FirstSetDiscovey/Interrogatories/Plaintiffs_First_Set_of_Interrogatories_to_FIE.docx
+++ b/Filings/Discovery/FirstSetDiscovey/Interrogatories/Plaintiffs_First_Set_of_Interrogatories_to_FIE.docx
@@ -1843,7 +1843,7 @@
         <w:ind w:left="1080"/>
       </w:pPr>
       <w:r>
-        <w:t>Kevin J. Kennedy (#193872) — kkennedy@kennedylf.com</w:t>
+        <w:t>Kevin J. Kennedy — kkennedy@kennedylf.com</w:t>
       </w:r>
     </w:p>
     <w:p>
@@ -1852,7 +1852,7 @@
         <w:ind w:left="1080"/>
       </w:pPr>
       <w:r>
-        <w:t>Mary J. Baskfield (#0314572) — mbaskfield@kennedylf.com</w:t>
+        <w:t>Mary J. Baskfield — mbaskfield@kennedylf.com</w:t>
       </w:r>
     </w:p>
     <w:p>

</xml_diff>

<commit_message>
Changed the service date from 9/19 to 9/20
</commit_message>
<xml_diff>
--- a/Filings/Discovery/FirstSetDiscovey/Interrogatories/Plaintiffs_First_Set_of_Interrogatories_to_FIE.docx
+++ b/Filings/Discovery/FirstSetDiscovey/Interrogatories/Plaintiffs_First_Set_of_Interrogatories_to_FIE.docx
@@ -1568,7 +1568,7 @@
         <w:spacing w:before="240" w:after="160"/>
       </w:pPr>
       <w:r>
-        <w:t>Dated: September 19, 2026.</w:t>
+        <w:t>Dated: September 20, 2026.</w:t>
       </w:r>
     </w:p>
     <w:tbl>
@@ -1814,7 +1814,7 @@
       <w:r>
         <w:t>2.</w:t>
         <w:tab/>
-        <w:t xml:space="preserve">On September 19, 2026, I served a true and correct copy of </w:t>
+        <w:t>On September 20, 2026, I served a true and correct copy of Plaintiffs’ First Set of Interrogatories to Defendant Fire Insurance Exchange upon Defendant's counsel of record by transmitting it as a PDF attachment to an electronic mail message addressed as follows:</w:t>
       </w:r>
       <w:r/>
       <w:proofErr w:type="gramStart"/>
@@ -1825,11 +1825,8 @@
         <w:rPr>
           <w:i/>
         </w:rPr>
-        <w:t>Plaintiffs’ First Set of Interrogatories to Defendant Fire Insurance Exchange</w:t>
-      </w:r>
-      <w:r>
-        <w:t xml:space="preserve"> upon Defendant's counsel of record by transmitting it as a PDF attachment to an electronic mail message addressed as follows:</w:t>
-      </w:r>
+      </w:r>
+      <w:r/>
     </w:p>
     <w:p>
       <w:pPr>
@@ -1927,7 +1924,7 @@
         <w:spacing w:after="160" w:line="276" w:lineRule="auto"/>
       </w:pPr>
       <w:r>
-        <w:t>Dated: September 19, 2026, at Eden Prairie, Hennepin County, Minnesota.</w:t>
+        <w:t>Dated: September 20, 2026, at Eden Prairie, Hennepin County, Minnesota.</w:t>
       </w:r>
     </w:p>
     <w:p>

</xml_diff>

<commit_message>
Update the certificate of service
</commit_message>
<xml_diff>
--- a/Filings/Discovery/FirstSetDiscovey/Interrogatories/Plaintiffs_First_Set_of_Interrogatories_to_FIE.docx
+++ b/Filings/Discovery/FirstSetDiscovey/Interrogatories/Plaintiffs_First_Set_of_Interrogatories_to_FIE.docx
@@ -24,12 +24,6 @@
         <w:gridCol w:w="4460"/>
       </w:tblGrid>
       <w:tr>
-        <w:tblPrEx>
-          <w:tblCellMar>
-            <w:top w:w="0" w:type="dxa"/>
-            <w:bottom w:w="0" w:type="dxa"/>
-          </w:tblCellMar>
-        </w:tblPrEx>
         <w:tc>
           <w:tcPr>
             <w:tcW w:w="4900" w:type="dxa"/>
@@ -203,10 +197,6 @@
       <w:r>
         <w:t>PLEASE TAKE NOTICE that, pursuant to Rules 26 and 33 of the Minnesota Rules of Civil Procedure, Plaintiffs Yibiao Lu and Jie Hu serve the following interrogatories on Defendant, to be answered separately, fully, in writing, and under oath or penalty of perjury within thirty (30) days after service.</w:t>
       </w:r>
-      <w:proofErr w:type="spellStart"/>
-      <w:r/>
-      <w:proofErr w:type="spellEnd"/>
-      <w:r/>
     </w:p>
     <w:p>
       <w:pPr>
@@ -325,587 +315,579 @@
         </w:rPr>
         <w:t>means Defendant’s Answer to the Complaint, dated and served August 10, 2026.</w:t>
       </w:r>
+    </w:p>
+    <w:p>
+      <w:pPr>
+        <w:spacing w:after="160" w:line="276" w:lineRule="auto"/>
+        <w:ind w:left="720" w:hanging="576"/>
+      </w:pPr>
+      <w:r>
+        <w:rPr>
+          <w:b/>
+          <w:bCs/>
+        </w:rPr>
+        <w:t>"The Claim"</w:t>
+      </w:r>
+      <w:r>
+        <w:rPr>
+          <w:bCs/>
+        </w:rPr>
+        <w:t xml:space="preserve"> means Farmers claim number 7007986837-1-1, date of loss July 13, 2024.</w:t>
+      </w:r>
+    </w:p>
+    <w:p>
+      <w:pPr>
+        <w:spacing w:after="160" w:line="276" w:lineRule="auto"/>
+        <w:ind w:left="720" w:hanging="576"/>
+      </w:pPr>
+      <w:r>
+        <w:rPr>
+          <w:b/>
+          <w:bCs/>
+        </w:rPr>
+        <w:lastRenderedPageBreak/>
+        <w:t>"The 2020 Claim" means Farmers claim number 3013539499-1, also shown in Your documents as 3013539499-1-1.</w:t>
+      </w:r>
+    </w:p>
+    <w:p>
+      <w:pPr>
+        <w:spacing w:after="160" w:line="276" w:lineRule="auto"/>
+        <w:ind w:left="720" w:hanging="576"/>
+      </w:pPr>
+      <w:r>
+        <w:rPr>
+          <w:b/>
+          <w:bCs/>
+        </w:rPr>
+        <w:t>"The February 18, 2022 Settlement Package"</w:t>
+      </w:r>
+      <w:r>
+        <w:rPr>
+          <w:bCs/>
+        </w:rPr>
+        <w:t xml:space="preserve"> means the 11-page document dated February 18, 2022 that You provided to Plaintiff </w:t>
+      </w:r>
       <w:proofErr w:type="spellStart"/>
+      <w:r>
+        <w:rPr>
+          <w:bCs/>
+        </w:rPr>
+        <w:t>Yibiao</w:t>
+      </w:r>
       <w:proofErr w:type="spellEnd"/>
-    </w:p>
-    <w:p>
-      <w:pPr>
-        <w:spacing w:after="160" w:line="276" w:lineRule="auto"/>
-        <w:ind w:left="720" w:hanging="576"/>
-      </w:pPr>
-      <w:r>
-        <w:rPr>
-          <w:b/>
-          <w:bCs/>
-        </w:rPr>
-        <w:t>"The Claim"</w:t>
-      </w:r>
-      <w:r>
-        <w:rPr>
-          <w:bCs/>
-        </w:rPr>
-        <w:t xml:space="preserve"> means Farmers claim number 7007986837-1-1, date of loss July 13, 2024.</w:t>
-      </w:r>
-    </w:p>
-    <w:p>
-      <w:pPr>
-        <w:spacing w:after="160" w:line="276" w:lineRule="auto"/>
-        <w:ind w:left="720" w:hanging="576"/>
-      </w:pPr>
-      <w:r>
-        <w:rPr>
-          <w:b/>
-          <w:bCs/>
-        </w:rPr>
-        <w:t>"The 2020 Claim" means Farmers claim number 3013539499-1, also shown in Your documents as 3013539499-1-1.</w:t>
-      </w:r>
-      <w:r>
-        <w:rPr>
-          <w:bCs/>
-        </w:rPr>
-      </w:r>
-    </w:p>
-    <w:p>
-      <w:pPr>
-        <w:spacing w:after="160" w:line="276" w:lineRule="auto"/>
-        <w:ind w:left="720" w:hanging="576"/>
-      </w:pPr>
-      <w:r>
-        <w:rPr>
-          <w:b/>
-          <w:bCs/>
-        </w:rPr>
-        <w:t>"The February 18, 2022 Settlement Package"</w:t>
-      </w:r>
-      <w:r>
-        <w:rPr>
-          <w:bCs/>
-        </w:rPr>
-        <w:t xml:space="preserve"> means the 11-page document dated February 18, 2022 that You provided to Plaintiff </w:t>
+      <w:r>
+        <w:rPr>
+          <w:bCs/>
+        </w:rPr>
+        <w:t xml:space="preserve"> Lu concerning The 2020 Claim, consisting of Your two-page letter captioned "Settlement Notice," the one-page "BUILDING LOSS WORKSHEET" headed "This is a complete recap of your claim," and the eight-page estimate that follows, identified on its face as Estimate "YIBIAO_LU2," bearing "Claim Number: 3013539499-1-1" and setting out numbered line items 1 through 32.</w:t>
+      </w:r>
+    </w:p>
+    <w:p>
+      <w:pPr>
+        <w:spacing w:after="160" w:line="276" w:lineRule="auto"/>
+        <w:ind w:left="720" w:hanging="576"/>
+      </w:pPr>
+      <w:r>
+        <w:rPr>
+          <w:b/>
+          <w:bCs/>
+        </w:rPr>
+        <w:t>"The Policy"</w:t>
+      </w:r>
+      <w:r>
+        <w:rPr>
+          <w:bCs/>
+        </w:rPr>
+        <w:t xml:space="preserve"> means homeowner’s Policy 98055-49-65 (shown on Defendant’s correspondence as 0980554965), including all endorsements, in force on July 13, 2024.</w:t>
+      </w:r>
+    </w:p>
+    <w:p>
+      <w:pPr>
+        <w:spacing w:after="160" w:line="276" w:lineRule="auto"/>
+        <w:ind w:left="720" w:hanging="576"/>
+      </w:pPr>
+      <w:r>
+        <w:rPr>
+          <w:b/>
+          <w:bCs/>
+        </w:rPr>
+        <w:t>"The Property"</w:t>
+      </w:r>
+      <w:r>
+        <w:rPr>
+          <w:bCs/>
+        </w:rPr>
+        <w:t xml:space="preserve"> means the insured dwelling at 17756 George Moran Dr., Eden Prairie, Minnesota 55347.</w:t>
+      </w:r>
+    </w:p>
+    <w:p>
+      <w:pPr>
+        <w:spacing w:after="160" w:line="276" w:lineRule="auto"/>
+        <w:ind w:left="720" w:hanging="576"/>
+      </w:pPr>
+      <w:r>
+        <w:rPr>
+          <w:b/>
+          <w:bCs/>
+        </w:rPr>
+        <w:t xml:space="preserve">"The November 4, </w:t>
+      </w:r>
+      <w:proofErr w:type="gramStart"/>
+      <w:r>
+        <w:rPr>
+          <w:b/>
+          <w:bCs/>
+        </w:rPr>
+        <w:t>2024</w:t>
+      </w:r>
+      <w:proofErr w:type="gramEnd"/>
+      <w:r>
+        <w:rPr>
+          <w:b/>
+          <w:bCs/>
+        </w:rPr>
+        <w:t xml:space="preserve"> Claim Outcome Letter"</w:t>
+      </w:r>
+      <w:r>
+        <w:rPr>
+          <w:bCs/>
+        </w:rPr>
+        <w:t xml:space="preserve"> means Your letter to Plaintiffs dated November 4, 2024, captioned "Claim Outcome Letter," signed by Nicholas Brau, Claims Spec Rep Prop, Fire Insurance Exchange, concerning The Claim.</w:t>
+      </w:r>
+    </w:p>
+    <w:p>
+      <w:pPr>
+        <w:spacing w:after="160" w:line="276" w:lineRule="auto"/>
+        <w:ind w:left="720" w:hanging="576"/>
+      </w:pPr>
+      <w:r>
+        <w:rPr>
+          <w:b/>
+          <w:bCs/>
+        </w:rPr>
+        <w:t>"The Denial Letters"</w:t>
+      </w:r>
+      <w:r>
+        <w:rPr>
+          <w:bCs/>
+        </w:rPr>
+        <w:t xml:space="preserve"> means Your September 3, </w:t>
+      </w:r>
+      <w:proofErr w:type="gramStart"/>
+      <w:r>
+        <w:rPr>
+          <w:bCs/>
+        </w:rPr>
+        <w:t>2024</w:t>
+      </w:r>
+      <w:proofErr w:type="gramEnd"/>
+      <w:r>
+        <w:rPr>
+          <w:bCs/>
+        </w:rPr>
+        <w:t xml:space="preserve"> letter to Plaintiffs captioned "Claim Outcome Letter" and The November 4, </w:t>
+      </w:r>
+      <w:proofErr w:type="gramStart"/>
+      <w:r>
+        <w:rPr>
+          <w:bCs/>
+        </w:rPr>
+        <w:t>2024</w:t>
+      </w:r>
+      <w:proofErr w:type="gramEnd"/>
+      <w:r>
+        <w:rPr>
+          <w:bCs/>
+        </w:rPr>
+        <w:t xml:space="preserve"> Claim Outcome Letter.</w:t>
+      </w:r>
+    </w:p>
+    <w:p>
+      <w:pPr>
+        <w:spacing w:after="160" w:line="276" w:lineRule="auto"/>
+        <w:ind w:left="720" w:hanging="576"/>
+      </w:pPr>
+      <w:r>
+        <w:rPr>
+          <w:b/>
+          <w:bCs/>
+        </w:rPr>
+        <w:t>"The Prieve Report"</w:t>
+      </w:r>
+      <w:r>
+        <w:rPr>
+          <w:bCs/>
+        </w:rPr>
+        <w:t xml:space="preserve"> means the seven-page report of Prieve Engineering, LLC titled "Evaluation of Condition of Windows as Relates to Hail," File Number 241008, report date November 4, 2024, as transmitted with The November 4, </w:t>
+      </w:r>
+      <w:proofErr w:type="gramStart"/>
+      <w:r>
+        <w:rPr>
+          <w:bCs/>
+        </w:rPr>
+        <w:t>2024</w:t>
+      </w:r>
+      <w:proofErr w:type="gramEnd"/>
+      <w:r>
+        <w:rPr>
+          <w:bCs/>
+        </w:rPr>
+        <w:t xml:space="preserve"> Claim Outcome Letter.</w:t>
+      </w:r>
+    </w:p>
+    <w:p>
+      <w:pPr>
+        <w:spacing w:after="160" w:line="276" w:lineRule="auto"/>
+        <w:ind w:left="720" w:hanging="576"/>
+      </w:pPr>
+      <w:r>
+        <w:rPr>
+          <w:b/>
+          <w:bCs/>
+        </w:rPr>
+        <w:t>"Photo Appendix A"</w:t>
+      </w:r>
+      <w:r>
+        <w:rPr>
+          <w:bCs/>
+        </w:rPr>
+        <w:t xml:space="preserve"> means the 110-page photographic appendix to The Prieve Report, titled "PHOTO APPENDIX A" and bearing File Number 241008 and site visit date October 9, 2024, containing photographs numbered A-1 through A-217.</w:t>
+      </w:r>
+    </w:p>
+    <w:p>
+      <w:pPr>
+        <w:spacing w:after="160" w:line="276" w:lineRule="auto"/>
+        <w:ind w:left="720" w:hanging="576"/>
+      </w:pPr>
+      <w:r>
+        <w:rPr>
+          <w:b/>
+          <w:bCs/>
+        </w:rPr>
+        <w:t xml:space="preserve">"The Recorded Conditions" </w:t>
+      </w:r>
+      <w:r>
+        <w:rPr>
+          <w:bCs/>
+        </w:rPr>
+        <w:t>means each dent, mark, scrape, or indentation that The Prieve Report or Photo Appendix A records at a window or other component of The Property, including downspouts, gutters, flashing, siding, trim board, doors, and screens.</w:t>
+      </w:r>
+    </w:p>
+    <w:p>
+      <w:pPr>
+        <w:spacing w:after="160" w:line="276" w:lineRule="auto"/>
+        <w:ind w:left="720" w:hanging="576"/>
+      </w:pPr>
+      <w:r>
+        <w:rPr>
+          <w:b/>
+          <w:bCs/>
+        </w:rPr>
+        <w:t xml:space="preserve">"The Brau Inspection Records" </w:t>
+      </w:r>
+      <w:r>
+        <w:rPr>
+          <w:bCs/>
+        </w:rPr>
+        <w:t>means every Document recording Nicholas Brau’s September 6, 2024 inspection of The Property, including any report, handwritten notes, sketches, measurements, photographs, voice memos, and claim-system or portal entries.</w:t>
+      </w:r>
+    </w:p>
+    <w:p>
+      <w:pPr>
+        <w:spacing w:after="160" w:line="276" w:lineRule="auto"/>
+        <w:ind w:left="720" w:hanging="576"/>
+      </w:pPr>
+      <w:r>
+        <w:rPr>
+          <w:b/>
+          <w:bCs/>
+        </w:rPr>
+        <w:t xml:space="preserve">"The Inspection-Record Requests" </w:t>
+      </w:r>
+      <w:r>
+        <w:rPr>
+          <w:bCs/>
+        </w:rPr>
+        <w:t>means Plaintiff Yibiao Lu’s electronic mail message of October 7, 2025 to You at myadjuster@farmersinsurance.com requesting "a copy of the inspection report/notes from Nic Brau," and his electronic mail message of October 28, 2025 to Nicholas Brau at nic.brau@farmersinsurance.com requesting "a copy of the notes you took that day."</w:t>
+      </w:r>
+    </w:p>
+    <w:p>
+      <w:pPr>
+        <w:spacing w:after="160" w:line="276" w:lineRule="auto"/>
+        <w:ind w:left="720" w:hanging="576"/>
+      </w:pPr>
+      <w:r>
+        <w:rPr>
+          <w:b/>
+          <w:bCs/>
+        </w:rPr>
+        <w:lastRenderedPageBreak/>
+        <w:t xml:space="preserve">"The 2025 Submissions" </w:t>
+      </w:r>
+      <w:r>
+        <w:rPr>
+          <w:bCs/>
+        </w:rPr>
+        <w:t>means Plaintiffs’ submissions to You of January 31, 2025 (post-2020 storm activity and gutter replacement), February 10, 2025 (City of Eden Prairie permit records and the neighbor canvass), and May 28, 2025 (National Weather Service and Interactive Hail Maps material, received directly or through Peter Pietila).</w:t>
+      </w:r>
+    </w:p>
+    <w:p>
+      <w:pPr>
+        <w:spacing w:after="160" w:line="276" w:lineRule="auto"/>
+        <w:ind w:left="720" w:hanging="576"/>
+      </w:pPr>
+      <w:r>
+        <w:rPr>
+          <w:b/>
+          <w:bCs/>
+        </w:rPr>
+        <w:t>"The Coverage Outcome Attachment"</w:t>
+      </w:r>
+      <w:r>
+        <w:rPr>
+          <w:bCs/>
+        </w:rPr>
+        <w:t xml:space="preserve"> means the document titled "Coverage Outcome – Policy Provisions" transmitted with The November 4, </w:t>
+      </w:r>
+      <w:proofErr w:type="gramStart"/>
+      <w:r>
+        <w:rPr>
+          <w:bCs/>
+        </w:rPr>
+        <w:t>2024</w:t>
+      </w:r>
+      <w:proofErr w:type="gramEnd"/>
+      <w:r>
+        <w:rPr>
+          <w:bCs/>
+        </w:rPr>
+        <w:t xml:space="preserve"> Claim Outcome Letter.</w:t>
+      </w:r>
+    </w:p>
+    <w:p>
+      <w:pPr>
+        <w:spacing w:after="160" w:line="276" w:lineRule="auto"/>
+        <w:ind w:left="720" w:hanging="576"/>
+      </w:pPr>
+      <w:r>
+        <w:rPr>
+          <w:b/>
+          <w:bCs/>
+        </w:rPr>
+        <w:t>"The Vendors"</w:t>
+      </w:r>
+      <w:r>
+        <w:rPr>
+          <w:bCs/>
+        </w:rPr>
+        <w:t xml:space="preserve"> means Hancock Claims Consultants, Prieve Engineering, LLC, and any other person You engaged to inspect, evaluate, test, or report on The Property, The Claim, or </w:t>
+      </w:r>
+      <w:proofErr w:type="gramStart"/>
+      <w:r>
+        <w:rPr>
+          <w:bCs/>
+        </w:rPr>
+        <w:t>The</w:t>
+      </w:r>
+      <w:proofErr w:type="gramEnd"/>
+      <w:r>
+        <w:rPr>
+          <w:bCs/>
+        </w:rPr>
+        <w:t xml:space="preserve"> 2020 Claim.</w:t>
+      </w:r>
+    </w:p>
+    <w:p>
+      <w:pPr>
+        <w:spacing w:after="160" w:line="276" w:lineRule="auto"/>
+        <w:ind w:left="720" w:hanging="576"/>
+      </w:pPr>
+      <w:r>
+        <w:rPr>
+          <w:b/>
+          <w:bCs/>
+        </w:rPr>
+        <w:t xml:space="preserve">"The Vendor Reports" </w:t>
+      </w:r>
+      <w:r>
+        <w:rPr>
+          <w:bCs/>
+        </w:rPr>
+        <w:t xml:space="preserve">means The Prieve Report and any report, photograph set, field notes, or written findings of Hancock Claims Consultants concerning its August 29, </w:t>
+      </w:r>
+      <w:proofErr w:type="gramStart"/>
+      <w:r>
+        <w:rPr>
+          <w:bCs/>
+        </w:rPr>
+        <w:t>2024</w:t>
+      </w:r>
+      <w:proofErr w:type="gramEnd"/>
+      <w:r>
+        <w:rPr>
+          <w:bCs/>
+        </w:rPr>
+        <w:t xml:space="preserve"> inspection of The Property.</w:t>
+      </w:r>
+    </w:p>
+    <w:p>
+      <w:pPr>
+        <w:spacing w:after="160" w:line="276" w:lineRule="auto"/>
+        <w:ind w:left="720" w:hanging="576"/>
+      </w:pPr>
+      <w:r>
+        <w:rPr>
+          <w:b/>
+          <w:bCs/>
+        </w:rPr>
+        <w:t>"The Appraisal Award"</w:t>
+      </w:r>
+      <w:r>
+        <w:rPr>
+          <w:bCs/>
+        </w:rPr>
+        <w:t xml:space="preserve"> means the written appraisal award concerning The Claim dated on or about September 12, 2025.</w:t>
+      </w:r>
+    </w:p>
+    <w:p>
+      <w:pPr>
+        <w:spacing w:after="160" w:line="276" w:lineRule="auto"/>
+        <w:ind w:left="720" w:hanging="576"/>
+      </w:pPr>
+      <w:r>
+        <w:rPr>
+          <w:b/>
+          <w:bCs/>
+        </w:rPr>
+        <w:t>"The Appraisal Demand"</w:t>
+      </w:r>
+      <w:r>
+        <w:rPr>
+          <w:bCs/>
+        </w:rPr>
+        <w:t xml:space="preserve"> means Plaintiffs' Demand for Appraisal concerning The Claim, dated August 3, 2025.</w:t>
+      </w:r>
+    </w:p>
+    <w:p>
+      <w:pPr>
+        <w:spacing w:after="160" w:line="276" w:lineRule="auto"/>
+        <w:ind w:left="720" w:hanging="576"/>
+      </w:pPr>
+      <w:r>
+        <w:rPr>
+          <w:b/>
+          <w:bCs/>
+        </w:rPr>
+        <w:t>"The Appraisal"</w:t>
+      </w:r>
+      <w:r>
+        <w:rPr>
+          <w:bCs/>
+        </w:rPr>
+        <w:t xml:space="preserve"> means the appraisal proceeding concerning The Claim commenced by The Appraisal Demand and concluded by The Appraisal Award, including the appraisers John Foster and Greg Tomes and the umpire Wade </w:t>
       </w:r>
       <w:proofErr w:type="spellStart"/>
       <w:r>
         <w:rPr>
           <w:bCs/>
         </w:rPr>
-        <w:t>Yibiao</w:t>
+        <w:t>Roos</w:t>
       </w:r>
       <w:proofErr w:type="spellEnd"/>
       <w:r>
         <w:rPr>
           <w:bCs/>
         </w:rPr>
-        <w:t xml:space="preserve"> Lu concerning The 2020 Claim, consisting </w:t>
-      </w:r>
-      <w:r>
-        <w:rPr>
+        <w:t>.</w:t>
+      </w:r>
+    </w:p>
+    <w:p>
+      <w:pPr>
+        <w:spacing w:after="160" w:line="276" w:lineRule="auto"/>
+        <w:ind w:left="720" w:hanging="576"/>
+      </w:pPr>
+      <w:r>
+        <w:rPr>
+          <w:b/>
+          <w:bCs/>
+        </w:rPr>
+        <w:t xml:space="preserve">"The Appraisal Items" </w:t>
+      </w:r>
+      <w:r>
+        <w:rPr>
+          <w:bCs/>
+        </w:rPr>
+        <w:t>means each item listed in the item column of The Appraisal Award, each item Plaintiffs submitted in The Appraisal Demand, and any other item for which You contend The Appraisal Award states a value or a loss.</w:t>
+      </w:r>
+    </w:p>
+    <w:p>
+      <w:pPr>
+        <w:spacing w:after="160" w:line="276" w:lineRule="auto"/>
+        <w:ind w:left="720" w:hanging="576"/>
+      </w:pPr>
+      <w:r>
+        <w:rPr>
+          <w:b/>
+          <w:bCs/>
+        </w:rPr>
+        <w:t>"Handling,"</w:t>
+      </w:r>
+      <w:r>
+        <w:rPr>
+          <w:bCs/>
+        </w:rPr>
+        <w:t xml:space="preserve"> when used with respect to a claim, means the receipt, investigation, evaluation, adjustment, supervision, quality-control or peer review, appraisal, payment, and denial of that claim, and includes deciding or approving coverage or payment, setting or approving the scope of any engagement of The Vendors, communicating with The Vendors or any appraiser, and searching for or collecting records concerning that claim.</w:t>
+      </w:r>
+    </w:p>
+    <w:p>
+      <w:pPr>
+        <w:spacing w:after="160" w:line="276" w:lineRule="auto"/>
+        <w:ind w:left="720" w:hanging="576"/>
+      </w:pPr>
+      <w:r>
+        <w:rPr>
+          <w:b/>
+          <w:bCs/>
+        </w:rPr>
+        <w:t>"Document" and "Documents"</w:t>
+      </w:r>
+      <w:r>
+        <w:rPr>
+          <w:bCs/>
+        </w:rPr>
+        <w:t xml:space="preserve"> have the broadest meaning permitted by Minn. R. Civ. P. 34.01 and include all writings, drawings, graphs, charts, photographs, sound and video recordings, images, and other data or data compilations — including electronically stored information ("ESI") — stored in any medium from which information can be obtained, together with all metadata and all non-identical drafts and copies.</w:t>
+      </w:r>
+    </w:p>
+    <w:p>
+      <w:pPr>
+        <w:spacing w:after="160" w:line="276" w:lineRule="auto"/>
+        <w:ind w:left="720" w:hanging="576"/>
+      </w:pPr>
+      <w:r>
+        <w:rPr>
+          <w:b/>
+          <w:bCs/>
+        </w:rPr>
+        <w:t>"Communication"</w:t>
+      </w:r>
+      <w:r>
+        <w:rPr>
+          <w:bCs/>
+        </w:rPr>
+        <w:t xml:space="preserve"> means any transmission or exchange of information of any kind, whether oral, written, or electronic, including email, text message, voicemail, letter, memorandum, and claim-system note.</w:t>
+      </w:r>
+    </w:p>
+    <w:p>
+      <w:pPr>
+        <w:spacing w:after="160" w:line="276" w:lineRule="auto"/>
+        <w:ind w:left="720" w:hanging="576"/>
+      </w:pPr>
+      <w:r>
+        <w:rPr>
+          <w:b/>
           <w:bCs/>
         </w:rPr>
         <w:lastRenderedPageBreak/>
-        <w:t>of Your two-page letter captioned "Settlement Notice," the one-page "BUILDING LOSS WORKSHEET" headed "This is a complete recap of your claim," and the eight-page estimate that follows, identified on its face as Estimate "YIBIAO_LU2," bearing "Claim Number: 3013539499-1-1" and setting out numbered line items 1 through 32.</w:t>
-      </w:r>
-    </w:p>
-    <w:p>
-      <w:pPr>
-        <w:spacing w:after="160" w:line="276" w:lineRule="auto"/>
-        <w:ind w:left="720" w:hanging="576"/>
-      </w:pPr>
-      <w:r>
-        <w:rPr>
-          <w:b/>
-          <w:bCs/>
-        </w:rPr>
-        <w:t>"The Policy"</w:t>
-      </w:r>
-      <w:r>
-        <w:rPr>
-          <w:bCs/>
-        </w:rPr>
-        <w:t xml:space="preserve"> means homeowner’s Policy 98055-49-65 (shown on Defendant’s correspondence as 0980554965), including all endorsements, in force on July 13, 2024.</w:t>
-      </w:r>
-    </w:p>
-    <w:p>
-      <w:pPr>
-        <w:spacing w:after="160" w:line="276" w:lineRule="auto"/>
-        <w:ind w:left="720" w:hanging="576"/>
-      </w:pPr>
-      <w:r>
-        <w:rPr>
-          <w:b/>
-          <w:bCs/>
-        </w:rPr>
-        <w:t>"The Property"</w:t>
-      </w:r>
-      <w:r>
-        <w:rPr>
-          <w:bCs/>
-        </w:rPr>
-        <w:t xml:space="preserve"> means the insured dwelling at 17756 George Moran Dr., Eden Prairie, Minnesota 55347.</w:t>
-      </w:r>
-    </w:p>
-    <w:p>
-      <w:pPr>
-        <w:spacing w:after="160" w:line="276" w:lineRule="auto"/>
-        <w:ind w:left="720" w:hanging="576"/>
-      </w:pPr>
-      <w:r>
-        <w:rPr>
-          <w:b/>
-          <w:bCs/>
-        </w:rPr>
-        <w:t xml:space="preserve">"The November 4, </w:t>
-      </w:r>
-      <w:proofErr w:type="gramStart"/>
-      <w:r>
-        <w:rPr>
-          <w:b/>
-          <w:bCs/>
-        </w:rPr>
-        <w:t>2024</w:t>
-      </w:r>
-      <w:proofErr w:type="gramEnd"/>
-      <w:r>
-        <w:rPr>
-          <w:b/>
-          <w:bCs/>
-        </w:rPr>
-        <w:t xml:space="preserve"> Claim Outcome Letter"</w:t>
-      </w:r>
-      <w:r>
-        <w:rPr>
-          <w:bCs/>
-        </w:rPr>
-        <w:t xml:space="preserve"> means Your letter to Plaintiffs dated November 4, 2024, captioned "Claim Outcome Letter," signed by Nicholas Brau, Claims Spec Rep Prop, Fire Insurance Exchange, concerning The Claim.</w:t>
-      </w:r>
-    </w:p>
-    <w:p>
-      <w:pPr>
-        <w:spacing w:after="160" w:line="276" w:lineRule="auto"/>
-        <w:ind w:left="720" w:hanging="576"/>
-      </w:pPr>
-      <w:r>
-        <w:rPr>
-          <w:b/>
-          <w:bCs/>
-        </w:rPr>
-        <w:t>"The Denial Letters"</w:t>
-      </w:r>
-      <w:r>
-        <w:rPr>
-          <w:bCs/>
-        </w:rPr>
-        <w:t xml:space="preserve"> means Your September 3, </w:t>
-      </w:r>
-      <w:proofErr w:type="gramStart"/>
-      <w:r>
-        <w:rPr>
-          <w:bCs/>
-        </w:rPr>
-        <w:t>2024</w:t>
-      </w:r>
-      <w:proofErr w:type="gramEnd"/>
-      <w:r>
-        <w:rPr>
-          <w:bCs/>
-        </w:rPr>
-        <w:t xml:space="preserve"> letter to Plaintiffs captioned "Claim Outcome Letter" and The November 4, </w:t>
-      </w:r>
-      <w:proofErr w:type="gramStart"/>
-      <w:r>
-        <w:rPr>
-          <w:bCs/>
-        </w:rPr>
-        <w:t>2024</w:t>
-      </w:r>
-      <w:proofErr w:type="gramEnd"/>
-      <w:r>
-        <w:rPr>
-          <w:bCs/>
-        </w:rPr>
-        <w:t xml:space="preserve"> Claim Outcome Letter.</w:t>
-      </w:r>
-    </w:p>
-    <w:p>
-      <w:pPr>
-        <w:spacing w:after="160" w:line="276" w:lineRule="auto"/>
-        <w:ind w:left="720" w:hanging="576"/>
-      </w:pPr>
-      <w:r>
-        <w:rPr>
-          <w:b/>
-          <w:bCs/>
-        </w:rPr>
-        <w:t>"The Prieve Report"</w:t>
-      </w:r>
-      <w:r>
-        <w:rPr>
-          <w:bCs/>
-        </w:rPr>
-        <w:t xml:space="preserve"> means the seven-page report of Prieve Engineering, LLC titled "Evaluation of Condition of Windows as Relates to Hail," File Number 241008, report date November 4, 2024, as transmitted with The November 4, </w:t>
-      </w:r>
-      <w:proofErr w:type="gramStart"/>
-      <w:r>
-        <w:rPr>
-          <w:bCs/>
-        </w:rPr>
-        <w:t>2024</w:t>
-      </w:r>
-      <w:proofErr w:type="gramEnd"/>
-      <w:r>
-        <w:rPr>
-          <w:bCs/>
-        </w:rPr>
-        <w:t xml:space="preserve"> Claim Outcome Letter.</w:t>
-      </w:r>
-    </w:p>
-    <w:p>
-      <w:pPr>
-        <w:spacing w:after="160" w:line="276" w:lineRule="auto"/>
-        <w:ind w:left="720" w:hanging="576"/>
-      </w:pPr>
-      <w:r>
-        <w:rPr>
-          <w:b/>
-          <w:bCs/>
-        </w:rPr>
-        <w:t>"Photo Appendix A"</w:t>
-      </w:r>
-      <w:r>
-        <w:rPr>
-          <w:bCs/>
-        </w:rPr>
-        <w:t xml:space="preserve"> means the 110-page photographic appendix to The Prieve Report, titled "PHOTO APPENDIX A" and bearing File Number 241008 and site visit date October 9, 2024, containing photographs numbered A-1 through A-217.</w:t>
-      </w:r>
-    </w:p>
-    <w:p>
-      <w:pPr>
-        <w:spacing w:after="160" w:line="276" w:lineRule="auto"/>
-        <w:ind w:left="720" w:hanging="576"/>
-      </w:pPr>
-      <w:r>
-        <w:rPr>
-          <w:b/>
-          <w:bCs/>
-        </w:rPr>
-        <w:t xml:space="preserve">"The Recorded Conditions" </w:t>
-      </w:r>
-      <w:r>
-        <w:rPr>
-          <w:bCs/>
-        </w:rPr>
-        <w:t>means each dent, mark, scrape, or indentation that The Prieve Report or Photo Appendix A records at a window or other component of The Property, including downspouts, gutters, flashing, siding, trim board, doors, and screens.</w:t>
-      </w:r>
-    </w:p>
-    <w:p>
-      <w:pPr>
-        <w:spacing w:after="160" w:line="276" w:lineRule="auto"/>
-        <w:ind w:left="720" w:hanging="576"/>
-      </w:pPr>
-      <w:r>
-        <w:rPr>
-          <w:b/>
-          <w:bCs/>
-        </w:rPr>
-        <w:t xml:space="preserve">"The Brau Inspection Records" </w:t>
-      </w:r>
-      <w:r>
-        <w:rPr>
-          <w:bCs/>
-        </w:rPr>
-        <w:t>means every Document recording Nicholas Brau’s September 6, 2024 inspection of The Property, including any report, handwritten notes, sketches, measurements, photographs, voice memos, and claim-system or portal entries.</w:t>
-      </w:r>
-    </w:p>
-    <w:p>
-      <w:pPr>
-        <w:spacing w:after="160" w:line="276" w:lineRule="auto"/>
-        <w:ind w:left="720" w:hanging="576"/>
-      </w:pPr>
-      <w:r>
-        <w:rPr>
-          <w:b/>
-          <w:bCs/>
-        </w:rPr>
-        <w:t xml:space="preserve">"The Inspection-Record Requests" </w:t>
-      </w:r>
-      <w:r>
-        <w:rPr>
-          <w:bCs/>
-        </w:rPr>
-        <w:t>means Plaintiff Yibiao Lu’s electronic mail message of October 7, 2025 to You at myadjuster@farmersinsurance.com requesting "a copy of the inspection report/notes from Nic Brau," and his electronic mail message of October 28, 2025 to Nicholas Brau at nic.brau@farmersinsurance.com requesting "a copy of the notes you took that day."</w:t>
-      </w:r>
-    </w:p>
-    <w:p>
-      <w:pPr>
-        <w:spacing w:after="160" w:line="276" w:lineRule="auto"/>
-        <w:ind w:left="720" w:hanging="576"/>
-      </w:pPr>
-      <w:r>
-        <w:rPr>
-          <w:b/>
-          <w:bCs/>
-        </w:rPr>
-        <w:t xml:space="preserve">"The 2025 Submissions" </w:t>
-      </w:r>
-      <w:r>
-        <w:rPr>
-          <w:bCs/>
-        </w:rPr>
-        <w:t>means Plaintiffs’ submissions to You of January 31, 2025 (post-2020 storm activity and gutter replacement), February 10, 2025 (City of Eden Prairie permit records and the neighbor canvass), and May 28, 2025 (National Weather Service and Interactive Hail Maps material, received directly or through Peter Pietila).</w:t>
-      </w:r>
-    </w:p>
-    <w:p>
-      <w:pPr>
-        <w:spacing w:after="160" w:line="276" w:lineRule="auto"/>
-        <w:ind w:left="720" w:hanging="576"/>
-      </w:pPr>
-      <w:r>
-        <w:rPr>
-          <w:b/>
-          <w:bCs/>
-        </w:rPr>
-        <w:t>"The Coverage Outcome Attachment"</w:t>
-      </w:r>
-      <w:r>
-        <w:rPr>
-          <w:bCs/>
-        </w:rPr>
-        <w:t xml:space="preserve"> means the document titled "Coverage Outcome – Policy Provisions" transmitted with The November 4, </w:t>
-      </w:r>
-      <w:proofErr w:type="gramStart"/>
-      <w:r>
-        <w:rPr>
-          <w:bCs/>
-        </w:rPr>
-        <w:t>2024</w:t>
-      </w:r>
-      <w:proofErr w:type="gramEnd"/>
-      <w:r>
-        <w:rPr>
-          <w:bCs/>
-        </w:rPr>
-        <w:t xml:space="preserve"> Claim Outcome Letter.</w:t>
-      </w:r>
-    </w:p>
-    <w:p>
-      <w:pPr>
-        <w:spacing w:after="160" w:line="276" w:lineRule="auto"/>
-        <w:ind w:left="720" w:hanging="576"/>
-      </w:pPr>
-      <w:r>
-        <w:rPr>
-          <w:b/>
-          <w:bCs/>
-        </w:rPr>
-        <w:t>"The Vendors"</w:t>
-      </w:r>
-      <w:r>
-        <w:rPr>
-          <w:bCs/>
-        </w:rPr>
-        <w:t xml:space="preserve"> means Hancock Claims Consultants, Prieve Engineering, LLC, and any other person You engaged to inspect, evaluate, test, or report on The Property, The Claim, or </w:t>
-      </w:r>
-      <w:proofErr w:type="gramStart"/>
-      <w:r>
-        <w:rPr>
-          <w:bCs/>
-        </w:rPr>
-        <w:t>The</w:t>
-      </w:r>
-      <w:proofErr w:type="gramEnd"/>
-      <w:r>
-        <w:rPr>
-          <w:bCs/>
-        </w:rPr>
-        <w:t xml:space="preserve"> 2020 Claim.</w:t>
-      </w:r>
-    </w:p>
-    <w:p>
-      <w:pPr>
-        <w:spacing w:after="160" w:line="276" w:lineRule="auto"/>
-        <w:ind w:left="720" w:hanging="576"/>
-      </w:pPr>
-      <w:r>
-        <w:rPr>
-          <w:b/>
-          <w:bCs/>
-        </w:rPr>
-        <w:t xml:space="preserve">"The Vendor Reports" </w:t>
-      </w:r>
-      <w:r>
-        <w:rPr>
-          <w:bCs/>
-        </w:rPr>
-        <w:t>means The Prieve Report and any report, photograph set, field notes, or written findings of Hancock Claims Consultants concerning its August 29, 2024 inspection of The Property.</w:t>
-      </w:r>
-      <w:proofErr w:type="gramStart"/>
-      <w:proofErr w:type="gramEnd"/>
-    </w:p>
-    <w:p>
-      <w:pPr>
-        <w:spacing w:after="160" w:line="276" w:lineRule="auto"/>
-        <w:ind w:left="720" w:hanging="576"/>
-      </w:pPr>
-      <w:r>
-        <w:rPr>
-          <w:b/>
-          <w:bCs/>
-        </w:rPr>
-        <w:t>"The Appraisal Award"</w:t>
-      </w:r>
-      <w:r>
-        <w:rPr>
-          <w:bCs/>
-        </w:rPr>
-        <w:t xml:space="preserve"> means the written appraisal award concerning The Claim dated on or about September 12, 2025.</w:t>
-      </w:r>
-    </w:p>
-    <w:p>
-      <w:pPr>
-        <w:spacing w:after="160" w:line="276" w:lineRule="auto"/>
-        <w:ind w:left="720" w:hanging="576"/>
-      </w:pPr>
-      <w:r>
-        <w:rPr>
-          <w:b/>
-          <w:bCs/>
-        </w:rPr>
-        <w:t>"The Appraisal Demand"</w:t>
-      </w:r>
-      <w:r>
-        <w:rPr>
-          <w:bCs/>
-        </w:rPr>
-        <w:t xml:space="preserve"> means Plaintiffs' Demand for Appraisal concerning The Claim, dated August 3, 2025.</w:t>
-      </w:r>
-    </w:p>
-    <w:p>
-      <w:pPr>
-        <w:spacing w:after="160" w:line="276" w:lineRule="auto"/>
-        <w:ind w:left="720" w:hanging="576"/>
-      </w:pPr>
-      <w:r>
-        <w:rPr>
-          <w:b/>
-          <w:bCs/>
-        </w:rPr>
-        <w:t>"The Appraisal"</w:t>
-      </w:r>
-      <w:r>
-        <w:rPr>
-          <w:bCs/>
-        </w:rPr>
-        <w:t xml:space="preserve"> means the appraisal proceeding concerning The Claim commenced by The Appraisal Demand and concluded by The Appraisal Award, including the appraisers John Foster and Greg Tomes and the umpire Wade </w:t>
-      </w:r>
-      <w:proofErr w:type="spellStart"/>
-      <w:r>
-        <w:rPr>
-          <w:bCs/>
-        </w:rPr>
-        <w:t>Roos</w:t>
-      </w:r>
-      <w:proofErr w:type="spellEnd"/>
-      <w:r>
-        <w:rPr>
-          <w:bCs/>
-        </w:rPr>
-        <w:t>.</w:t>
-      </w:r>
-    </w:p>
-    <w:p>
-      <w:pPr>
-        <w:spacing w:after="160" w:line="276" w:lineRule="auto"/>
-        <w:ind w:left="720" w:hanging="576"/>
-      </w:pPr>
-      <w:r>
-        <w:rPr>
-          <w:b/>
-          <w:bCs/>
-        </w:rPr>
-        <w:t xml:space="preserve">"The Appraisal Items" </w:t>
-      </w:r>
-      <w:r>
-        <w:rPr>
-          <w:bCs/>
-        </w:rPr>
-        <w:t>means each item listed in the item column of The Appraisal Award, each item Plaintiffs submitted in The Appraisal Demand, and any other item for which You contend The Appraisal Award states a value or a loss.</w:t>
-      </w:r>
-      <w:proofErr w:type="spellStart"/>
-      <w:proofErr w:type="spellEnd"/>
-    </w:p>
-    <w:p>
-      <w:pPr>
-        <w:spacing w:after="160" w:line="276" w:lineRule="auto"/>
-        <w:ind w:left="720" w:hanging="576"/>
-      </w:pPr>
-      <w:r>
-        <w:rPr>
-          <w:b/>
-          <w:bCs/>
-        </w:rPr>
-        <w:t>"Handling,"</w:t>
-      </w:r>
-      <w:r>
-        <w:rPr>
-          <w:bCs/>
-        </w:rPr>
-        <w:t xml:space="preserve"> when used with respect to a claim, means the receipt, investigation, evaluation, adjustment, supervision, quality-control or peer review, appraisal, payment, and denial of </w:t>
-      </w:r>
-      <w:r>
-        <w:rPr>
-          <w:bCs/>
-        </w:rPr>
-        <w:lastRenderedPageBreak/>
-        <w:t>that claim, and includes deciding or approving coverage or payment, setting or approving the scope of any engagement of The Vendors, communicating with The Vendors or any appraiser, and searching for or collecting records concerning that claim.</w:t>
-      </w:r>
-    </w:p>
-    <w:p>
-      <w:pPr>
-        <w:spacing w:after="160" w:line="276" w:lineRule="auto"/>
-        <w:ind w:left="720" w:hanging="576"/>
-      </w:pPr>
-      <w:r>
-        <w:rPr>
-          <w:b/>
-          <w:bCs/>
-        </w:rPr>
-        <w:t>"Document" and "Documents"</w:t>
-      </w:r>
-      <w:r>
-        <w:rPr>
-          <w:bCs/>
-        </w:rPr>
-        <w:t xml:space="preserve"> have the broadest meaning permitted by Minn. R. Civ. P. 34.01 and include all writings, drawings, graphs, charts, photographs, sound and video recordings, images, and other data or data compilations — including electronically stored information ("ESI") — stored in any medium from which information can be obtained, together with all metadata and all non-identical drafts and copies.</w:t>
-      </w:r>
-    </w:p>
-    <w:p>
-      <w:pPr>
-        <w:spacing w:after="160" w:line="276" w:lineRule="auto"/>
-        <w:ind w:left="720" w:hanging="576"/>
-      </w:pPr>
-      <w:r>
-        <w:rPr>
-          <w:b/>
-          <w:bCs/>
-        </w:rPr>
-        <w:t>"Communication"</w:t>
-      </w:r>
-      <w:r>
-        <w:rPr>
-          <w:bCs/>
-        </w:rPr>
-        <w:t xml:space="preserve"> means any transmission or exchange of information of any kind, whether oral, written, or electronic, including email, text message, voicemail, letter, memorandum, and claim-system note.</w:t>
-      </w:r>
-    </w:p>
-    <w:p>
-      <w:pPr>
-        <w:spacing w:after="160" w:line="276" w:lineRule="auto"/>
-        <w:ind w:left="720" w:hanging="576"/>
-      </w:pPr>
-      <w:r>
-        <w:rPr>
-          <w:b/>
-          <w:bCs/>
-        </w:rPr>
         <w:t>"Person" and "person"</w:t>
       </w:r>
       <w:r>
@@ -1056,7 +1038,6 @@
         <w:rPr>
           <w:bCs/>
         </w:rPr>
-        <w:lastRenderedPageBreak/>
         <w:t>3.</w:t>
       </w:r>
       <w:r>
@@ -1114,6 +1095,7 @@
         <w:rPr>
           <w:bCs/>
         </w:rPr>
+        <w:lastRenderedPageBreak/>
         <w:t>6.</w:t>
       </w:r>
       <w:r>
@@ -1134,14 +1116,14 @@
           <w:bCs/>
         </w:rPr>
         <w:t>7.</w:t>
+      </w:r>
+      <w:r>
+        <w:rPr>
+          <w:bCs/>
+        </w:rPr>
         <w:tab/>
         <w:t>Construction. The words "and" and "or" are both conjunctive and disjunctive; "each" includes "every"; and the singular includes the plural and vice versa, as necessary to bring within the scope of each interrogatory all answers that might otherwise be construed to be outside its scope. A term defined in these interrogatories has its defined meaning wherever it appears, whether or not it is capitalized.</w:t>
       </w:r>
-      <w:r>
-        <w:rPr>
-          <w:bCs/>
-        </w:rPr>
-      </w:r>
     </w:p>
     <w:p>
       <w:pPr>
@@ -1230,14 +1212,7 @@
           <w:bCs/>
         </w:rPr>
         <w:tab/>
-        <w:t xml:space="preserve">Dates. A date used to identify a communication, document, or event reflects Plaintiffs’ best information and is approximate. If Your records show a different date for a </w:t>
-      </w:r>
-      <w:r>
-        <w:rPr>
-          <w:bCs/>
-        </w:rPr>
-        <w:lastRenderedPageBreak/>
-        <w:t>communication, document, or event otherwise matching the description, answer as to that communication, document, or event and state the date Your records show.</w:t>
+        <w:t>Dates. A date used to identify a communication, document, or event reflects Plaintiffs’ best information and is approximate. If Your records show a different date for a communication, document, or event otherwise matching the description, answer as to that communication, document, or event and state the date Your records show.</w:t>
       </w:r>
     </w:p>
     <w:p>
@@ -1303,6 +1278,7 @@
           <w:bCs/>
           <w:caps/>
         </w:rPr>
+        <w:lastRenderedPageBreak/>
         <w:t>Interrogatories</w:t>
       </w:r>
     </w:p>
@@ -1322,31 +1298,21 @@
         <w:rPr>
           <w:bCs/>
         </w:rPr>
-        <w:t>The November 4, 2024 Claim Outcome Letter states, "Our investigation found the condition of the window and components to be from wear/tear as referrenced [sic] in the attached engineer report." For each of The Recorded Conditions, state the basis on which You concluded that condition was not covered in the decision communicated in that letter, including the cause and approximate date You attributed to it, each fact and document You relied on, any prior claim and the estimate line item You contend paid for it, and each provision identified in The Coverage Outcome Attachment that You applied.</w:t>
+        <w:t xml:space="preserve">The November 4, </w:t>
       </w:r>
       <w:proofErr w:type="gramStart"/>
       <w:r>
         <w:rPr>
           <w:bCs/>
         </w:rPr>
+        <w:t>2024</w:t>
       </w:r>
       <w:proofErr w:type="gramEnd"/>
       <w:r>
         <w:rPr>
           <w:bCs/>
         </w:rPr>
-      </w:r>
-      <w:proofErr w:type="spellStart"/>
-      <w:r>
-        <w:rPr>
-          <w:bCs/>
-        </w:rPr>
-      </w:r>
-      <w:proofErr w:type="spellEnd"/>
-      <w:r>
-        <w:rPr>
-          <w:bCs/>
-        </w:rPr>
+        <w:t xml:space="preserve"> Claim Outcome Letter states, "Our investigation found the condition of the window and components to be from wear/tear as referrenced [sic] in the attached engineer report." For each of The Recorded Conditions, state the basis on which You concluded that condition was not covered in the decision communicated in that letter, including the cause and approximate date You attributed to it, each fact and document You relied on, any prior claim and the estimate line item You contend paid for it, and each provision identified in The Coverage Outcome Attachment that You applied.</w:t>
       </w:r>
     </w:p>
     <w:p>
@@ -1405,11 +1371,6 @@
         </w:rPr>
         <w:t>For each of The Denial Letters, state whether any review of the decision — including any supervisory, quality-control, or peer review — was performed before the letter issued and, if so, by whom, when, what it consisted of, and what documents it produced; and identify who authorized each letter to be issued.</w:t>
       </w:r>
-      <w:r>
-        <w:rPr>
-          <w:bCs/>
-        </w:rPr>
-      </w:r>
     </w:p>
     <w:p>
       <w:pPr>
@@ -1465,7 +1426,14 @@
         <w:rPr>
           <w:bCs/>
         </w:rPr>
-        <w:t>State each fact supporting Your First Affirmative Defense in The Answer, which alleges that "pursuant to Rule 12, Minn. R. Civ. P., there exists a lack of jurisdiction over Defendant FIE and Plaintiffs have failed to state a claim upon which relief can be granted," including whether the jurisdictional allegation refers to subject-matter jurisdiction, personal jurisdiction, or both, and each count of the Complaint to which the failure-to-state allegation is directed; and, if You contend that any person should be a defendant in this action in place of or in addition to Fire Insurance Exchange, or that Fire Insurance Exchange is misnamed or misdescribed in the caption, identify that person by legal name, form, and state of organization.</w:t>
+        <w:t xml:space="preserve">State each fact supporting Your First Affirmative Defense in The Answer, which alleges that "pursuant to Rule 12, Minn. R. Civ. P., there exists a lack </w:t>
+      </w:r>
+      <w:r>
+        <w:rPr>
+          <w:bCs/>
+        </w:rPr>
+        <w:lastRenderedPageBreak/>
+        <w:t>of jurisdiction over Defendant FIE and Plaintiffs have failed to state a claim upon which relief can be granted," including whether the jurisdictional allegation refers to subject-matter jurisdiction, personal jurisdiction, or both, and each count of the Complaint to which the failure-to-state allegation is directed; and, if You contend that any person should be a defendant in this action in place of or in addition to Fire Insurance Exchange, or that Fire Insurance Exchange is misnamed or misdescribed in the caption, identify that person by legal name, form, and state of organization.</w:t>
       </w:r>
     </w:p>
     <w:p>
@@ -1516,59 +1484,66 @@
           <w:b/>
           <w:bCs/>
         </w:rPr>
+        <w:t xml:space="preserve">INTERROGATORY NO. 10:  </w:t>
+      </w:r>
+      <w:r>
+        <w:rPr>
+          <w:bCs/>
+        </w:rPr>
+        <w:t>State what You did with each of The 2025 Submissions, including each person involved, when, the conclusion reached, each document recording it, whether it was considered in any decision on The Claim, and, if nothing was done, why.</w:t>
+      </w:r>
+    </w:p>
+    <w:p>
+      <w:pPr>
+        <w:spacing w:after="160" w:line="276" w:lineRule="auto"/>
+        <w:ind w:left="720" w:hanging="576"/>
+      </w:pPr>
+      <w:r>
+        <w:rPr>
+          <w:b/>
+          <w:bCs/>
+        </w:rPr>
+        <w:t xml:space="preserve">INTERROGATORY NO. 11:  </w:t>
+      </w:r>
+      <w:r>
+        <w:t>As to Your assertion in The Answer, responding to paragraph 14 of the Complaint, that Plaintiffs "attempted to direct the claim-handling process by adamantly advising Hancock Claims Consultants that the only thing that needed to be inspected was the windows on the inside where they were leaking," state who made and who received that statement, when and how, including each document recording it, the person who first recorded it, and whether Hancock’s August 29, 2024 inspection was limited as a result and, if so, what was not inspected; and state whether You contend that statement was a basis for Your September 3, 2024 statement that "[t]here were no other damages observed."</w:t>
+      </w:r>
+    </w:p>
+    <w:p>
+      <w:pPr>
+        <w:spacing w:after="160" w:line="276" w:lineRule="auto"/>
+        <w:ind w:left="720" w:hanging="576"/>
+      </w:pPr>
+      <w:r>
+        <w:rPr>
+          <w:b/>
+          <w:bCs/>
+        </w:rPr>
+        <w:t xml:space="preserve">INTERROGATORY NO. 12:  </w:t>
+      </w:r>
+      <w:r>
+        <w:rPr>
+          <w:bCs/>
+        </w:rPr>
+        <w:t>State the date You contend You first anticipated litigation concerning The Claim, identifying who made that determination, what prompted it, and the first document in Your claim file that You contend was prepared in anticipation of litigation or for trial within the meaning of Minn. R. Civ. P. 26.02(d); and state the date any litigation hold or preservation instruction concerning The Claim or this action was issued, to whom it was directed, and what it directed to be preserved.</w:t>
+      </w:r>
+    </w:p>
+    <w:p>
+      <w:pPr>
+        <w:spacing w:before="240" w:after="160"/>
+      </w:pPr>
+      <w:r>
         <w:lastRenderedPageBreak/>
-        <w:t xml:space="preserve">INTERROGATORY NO. 10:  </w:t>
-      </w:r>
-      <w:r>
-        <w:rPr>
-          <w:bCs/>
-        </w:rPr>
-        <w:t>State what You did with each of The 2025 Submissions, including each person involved, when, the conclusion reached, each document recording it, whether it was considered in any decision on The Claim, and, if nothing was done, why.</w:t>
-      </w:r>
-    </w:p>
-    <w:p>
-      <w:pPr>
-        <w:spacing w:after="160" w:line="276" w:lineRule="auto"/>
-        <w:ind w:left="720" w:hanging="576"/>
-      </w:pPr>
-      <w:r>
-        <w:rPr>
-          <w:b/>
-          <w:bCs/>
-        </w:rPr>
-        <w:t>INTERROGATORY NO. 11:  As to Your assertion in The Answer, responding to paragraph 14 of the Complaint, that Plaintiffs "attempted to direct the claim-handling process by adamantly advising Hancock Claims Consultants that the only thing that needed to be inspected was the windows on the inside where they were leaking," state who made and who received that statement, when and how, including each document recording it, the person who first recorded it, and whether Hancock’s August 29, 2024 inspection was limited as a result and, if so, what was not inspected; and state whether You contend that statement was a basis for Your September 3, 2024 statement that "[t]here were no other damages observed."</w:t>
-      </w:r>
-      <w:r>
-        <w:rPr>
-          <w:bCs/>
-        </w:rPr>
-      </w:r>
-    </w:p>
-    <w:p>
-      <w:pPr>
-        <w:spacing w:after="160" w:line="276" w:lineRule="auto"/>
-        <w:ind w:left="720" w:hanging="576"/>
-      </w:pPr>
-      <w:r>
-        <w:rPr>
-          <w:b/>
-          <w:bCs/>
-        </w:rPr>
-        <w:t xml:space="preserve">INTERROGATORY NO. 12:  </w:t>
-      </w:r>
-      <w:r>
-        <w:rPr>
-          <w:bCs/>
-        </w:rPr>
-        <w:t>State the date You contend You first anticipated litigation concerning The Claim, identifying who made that determination, what prompted it, and the first document in Your claim file that You contend was prepared in anticipation of litigation or for trial within the meaning of Minn. R. Civ. P. 26.02(d); and state the date any litigation hold or preservation instruction concerning The Claim or this action was issued, to whom it was directed, and what it directed to be preserved.</w:t>
-      </w:r>
-    </w:p>
-    <w:p>
-      <w:pPr>
-        <w:spacing w:before="240" w:after="160"/>
-      </w:pPr>
-      <w:r>
-        <w:t>Dated: September 20, 2026.</w:t>
+        <w:t xml:space="preserve">Dated: </w:t>
+      </w:r>
+      <w:r>
+        <w:rPr>
+          <w:u w:val="single"/>
+        </w:rPr>
+        <w:t>September 20, 2026</w:t>
+      </w:r>
+      <w:r>
+        <w:t>.</w:t>
       </w:r>
     </w:p>
     <w:tbl>
@@ -1586,12 +1561,6 @@
         <w:gridCol w:w="4680"/>
       </w:tblGrid>
       <w:tr>
-        <w:tblPrEx>
-          <w:tblCellMar>
-            <w:top w:w="0" w:type="dxa"/>
-            <w:bottom w:w="0" w:type="dxa"/>
-          </w:tblCellMar>
-        </w:tblPrEx>
         <w:tc>
           <w:tcPr>
             <w:tcW w:w="4680" w:type="dxa"/>
@@ -1766,67 +1735,31 @@
         <w:spacing w:after="160" w:line="276" w:lineRule="auto"/>
       </w:pPr>
       <w:r>
-        <w:t xml:space="preserve">I, </w:t>
+        <w:rPr/>
+        <w:t xml:space="preserve">I, Yibiao Lu, Plaintiff </w:t>
       </w:r>
       <w:proofErr w:type="spellStart"/>
-      <w:r>
-        <w:t>Yibiao</w:t>
-      </w:r>
       <w:proofErr w:type="spellEnd"/>
       <w:r>
-        <w:t xml:space="preserve"> Lu, state and declare as follows:</w:t>
-      </w:r>
-    </w:p>
-    <w:p>
-      <w:pPr>
-        <w:spacing w:after="160" w:line="276" w:lineRule="auto"/>
-        <w:ind w:left="720" w:hanging="576"/>
-      </w:pPr>
-      <w:r>
-        <w:t>1.</w:t>
-      </w:r>
-      <w:r>
-        <w:tab/>
-        <w:t xml:space="preserve">I am over the age of 18 years and a Plaintiff in this action. I personally made the service described below by electronic </w:t>
-      </w:r>
-      <w:proofErr w:type="gramStart"/>
-      <w:r>
-        <w:t>mail,</w:t>
-      </w:r>
-      <w:proofErr w:type="gramEnd"/>
-      <w:r>
-        <w:t xml:space="preserve"> in the manner the parties have agreed. Minn. R. Civ. P. 5.02(b); Minn. Gen. R. </w:t>
-      </w:r>
-      <w:proofErr w:type="spellStart"/>
-      <w:r>
-        <w:t>Prac</w:t>
-      </w:r>
-      <w:proofErr w:type="spellEnd"/>
-      <w:r>
-        <w:t>. 14.03(d)(2).</w:t>
-      </w:r>
-    </w:p>
-    <w:p>
-      <w:pPr>
-        <w:spacing w:after="160" w:line="276" w:lineRule="auto"/>
-        <w:ind w:left="720" w:hanging="576"/>
-      </w:pPr>
-      <w:r>
-        <w:t>2.</w:t>
-        <w:tab/>
-        <w:t>On September 20, 2026, I served a true and correct copy of Plaintiffs’ First Set of Interrogatories to Defendant Fire Insurance Exchange upon Defendant's counsel of record by transmitting it as a PDF attachment to an electronic mail message addressed as follows:</w:t>
-      </w:r>
-      <w:r/>
-      <w:proofErr w:type="gramStart"/>
-      <w:r/>
-      <w:proofErr w:type="gramEnd"/>
-      <w:r/>
-      <w:r>
         <w:rPr>
           <w:i/>
         </w:rPr>
-      </w:r>
-      <w:r/>
+        <w:t>pro se</w:t>
+      </w:r>
+      <w:r>
+        <w:rPr/>
+        <w:t xml:space="preserve">, state that on September 20, 2026, I served a true and correct copy of </w:t>
+      </w:r>
+      <w:r>
+        <w:rPr>
+          <w:i/>
+        </w:rPr>
+        <w:t>Plaintiffs’ First Set of Interrogatories to Defendant Fire Insurance Exchange</w:t>
+      </w:r>
+      <w:r>
+        <w:rPr/>
+        <w:t xml:space="preserve"> upon Defendant's counsel of record, by electronic mail in the manner the parties have agreed, as a PDF attachment sent from bill_y_lu@yahoo.com to:</w:t>
+      </w:r>
     </w:p>
     <w:p>
       <w:pPr>
@@ -1852,32 +1785,9 @@
         <w:ind w:left="1080"/>
       </w:pPr>
       <w:r>
-        <w:t>KENNEDY LAW FIRM P.C.</w:t>
-      </w:r>
-    </w:p>
-    <w:p>
-      <w:pPr>
-        <w:spacing w:after="80" w:line="276" w:lineRule="auto"/>
-        <w:ind w:left="1080"/>
-      </w:pPr>
-      <w:r>
-        <w:t>7616 Currell Blvd., Suite 270</w:t>
-      </w:r>
-    </w:p>
-    <w:p>
-      <w:pPr>
-        <w:spacing w:after="80" w:line="276" w:lineRule="auto"/>
-        <w:ind w:left="1080"/>
-      </w:pPr>
-      <w:r>
-        <w:t>Woodbury, MN 55125</w:t>
-      </w:r>
-    </w:p>
-    <w:p>
-      <w:pPr>
-        <w:spacing w:after="80" w:line="276" w:lineRule="auto"/>
-        <w:ind w:left="1080"/>
-      </w:pPr>
+        <w:rPr/>
+        <w:t xml:space="preserve">KENNEDY LAW FIRM P.C., </w:t>
+      </w:r>
       <w:r>
         <w:rPr>
           <w:i/>
@@ -1888,27 +1798,11 @@
     <w:p>
       <w:pPr>
         <w:spacing w:after="160" w:line="276" w:lineRule="auto"/>
-        <w:ind w:left="720" w:hanging="576"/>
-      </w:pPr>
-      <w:r>
-        <w:t>3.</w:t>
-      </w:r>
-      <w:r>
-        <w:tab/>
-        <w:t>The transmission was sent from bill_y_lu@yahoo.com.</w:t>
-      </w:r>
-    </w:p>
-    <w:p>
-      <w:pPr>
-        <w:spacing w:after="160" w:line="276" w:lineRule="auto"/>
-        <w:ind w:left="720" w:hanging="576"/>
-      </w:pPr>
-      <w:r>
-        <w:t>4.</w:t>
-      </w:r>
-      <w:r>
-        <w:tab/>
-        <w:t>These discovery requests are served, not filed, in accordance with Minn. R. Civ. P. 5.04(b).</w:t>
+        <w:ind/>
+      </w:pPr>
+      <w:r>
+        <w:rPr/>
+        <w:t>Minn. R. Civ. P. 5.02(b); Minn. Gen. R. Prac. 14.03(d)(2). These discovery requests are served, not filed. Minn. R. Civ. P. 5.04(b).</w:t>
       </w:r>
     </w:p>
     <w:p>
@@ -1924,14 +1818,24 @@
         <w:spacing w:after="160" w:line="276" w:lineRule="auto"/>
       </w:pPr>
       <w:r>
-        <w:t>Dated: September 20, 2026, at Eden Prairie, Hennepin County, Minnesota.</w:t>
-      </w:r>
-    </w:p>
-    <w:p>
-      <w:pPr>
-        <w:spacing w:after="160" w:line="276" w:lineRule="auto"/>
-      </w:pPr>
-      <w:r>
+        <w:t xml:space="preserve">Dated: </w:t>
+      </w:r>
+      <w:r>
+        <w:rPr>
+          <w:u w:val="single"/>
+        </w:rPr>
+        <w:t>September 20, 2026</w:t>
+      </w:r>
+      <w:r>
+        <w:t>, at Eden Prairie, Hennepin County, Minnesota.</w:t>
+      </w:r>
+    </w:p>
+    <w:p>
+      <w:pPr>
+        <w:spacing w:after="160" w:line="276" w:lineRule="auto"/>
+      </w:pPr>
+      <w:r>
+        <w:rPr/>
         <w:t>____________________________________</w:t>
       </w:r>
     </w:p>
@@ -1940,92 +1844,14 @@
         <w:spacing w:after="160" w:line="276" w:lineRule="auto"/>
       </w:pPr>
       <w:r>
+        <w:rPr/>
+        <w:t xml:space="preserve">Yibiao Lu, Plaintiff </w:t>
+      </w:r>
+      <w:r>
         <w:rPr>
           <w:i/>
         </w:rPr>
-        <w:t>Signature of person who served the documents</w:t>
-      </w:r>
-    </w:p>
-    <w:p>
-      <w:pPr>
-        <w:tabs>
-          <w:tab w:val="left" w:pos="2016"/>
-        </w:tabs>
-        <w:spacing w:line="276" w:lineRule="auto"/>
-      </w:pPr>
-      <w:r>
-        <w:t>Name:</w:t>
-      </w:r>
-      <w:r>
-        <w:tab/>
-      </w:r>
-      <w:proofErr w:type="spellStart"/>
-      <w:r>
-        <w:t>Yibiao</w:t>
-      </w:r>
-      <w:proofErr w:type="spellEnd"/>
-      <w:r>
-        <w:t xml:space="preserve"> Lu</w:t>
-      </w:r>
-    </w:p>
-    <w:p>
-      <w:pPr>
-        <w:tabs>
-          <w:tab w:val="left" w:pos="2016"/>
-        </w:tabs>
-        <w:spacing w:line="276" w:lineRule="auto"/>
-      </w:pPr>
-      <w:r>
-        <w:t>Address:</w:t>
-      </w:r>
-      <w:r>
-        <w:tab/>
-        <w:t>17756 George Moran Dr.</w:t>
-      </w:r>
-    </w:p>
-    <w:p>
-      <w:pPr>
-        <w:tabs>
-          <w:tab w:val="left" w:pos="2016"/>
-        </w:tabs>
-        <w:spacing w:line="276" w:lineRule="auto"/>
-      </w:pPr>
-      <w:r>
-        <w:t>City/State/Zip:</w:t>
-      </w:r>
-      <w:r>
-        <w:tab/>
-        <w:t>Eden Prairie, MN 55347</w:t>
-      </w:r>
-    </w:p>
-    <w:p>
-      <w:pPr>
-        <w:tabs>
-          <w:tab w:val="left" w:pos="2016"/>
-        </w:tabs>
-        <w:spacing w:line="276" w:lineRule="auto"/>
-      </w:pPr>
-      <w:r>
-        <w:t>Telephone:</w:t>
-      </w:r>
-      <w:r>
-        <w:tab/>
-        <w:t>763-843-2859</w:t>
-      </w:r>
-    </w:p>
-    <w:p>
-      <w:pPr>
-        <w:tabs>
-          <w:tab w:val="left" w:pos="2016"/>
-        </w:tabs>
-        <w:spacing w:after="160" w:line="276" w:lineRule="auto"/>
-      </w:pPr>
-      <w:r>
-        <w:t>E-mail address:</w:t>
-      </w:r>
-      <w:r>
-        <w:tab/>
-        <w:t>bill_y_lu@yahoo.com</w:t>
+        <w:t>pro se</w:t>
       </w:r>
     </w:p>
     <w:sectPr>

</xml_diff>